<commit_message>
Retours 10/10 (1→3) : accueil chantier permanent (une signature par chantier, réclamé aux seuls placés au planning, accueil sans compte), quart d'heure sécurité dématérialisé, notes de service / flash info PDF à dérouler, RH « à relancer », contrôle chantier (légende, présents, chef/conducteur, photos) + suivi direction, textes prévention
</commit_message>
<xml_diff>
--- a/app/docs/Feuille_de_route_nuit_09-10-10.docx
+++ b/app/docs/Feuille_de_route_nuit_09-10-10.docx
@@ -84,7 +84,7 @@
           <w:sz w:val="20"/>
           <w:szCs w:val="20"/>
         </w:rPr>
-        <w:t xml:space="preserve">Build livré : 10/10/2026 · cdb9bf (index.html + traceur.html à la racine du dépôt). Sources : app/src (reg.js, docs.js, prevention.js, accueil.js, affaires.js, flotte.js, rh.js, commandes.js, reglement.js + app.js, espace.js, next.js, acces.js, sync.js). Notes techniques : app/NOTES.md.</w:t>
+        <w:t xml:space="preserve">Build livré : 10/10/2026 · b24270 (retours du matin inclus) (index.html + traceur.html à la racine du dépôt). Sources : app/src (reg.js, docs.js, prevention.js, accueil.js, affaires.js, flotte.js, rh.js, commandes.js, reglement.js + app.js, espace.js, next.js, acces.js, sync.js). Notes techniques : app/NOTES.md.</w:t>
       </w:r>
     </w:p>
     <w:p>
@@ -122,7 +122,7 @@
           <w:sz w:val="20"/>
           <w:szCs w:val="20"/>
         </w:rPr>
-        <w:t xml:space="preserve">Règle gardée toute la nuit : rien d'ancien n'est supprimé ; 36 suites de tests automatiques passent (30 anciennes + docs, objectifs, affaires, flotte &amp; RH, 3e vague, bureau).</w:t>
+        <w:t xml:space="preserve">Règle gardée toute la nuit : rien d'ancien n'est supprimé ; 37 suites de tests automatiques passent (30 anciennes + docs, objectifs, affaires, flotte &amp; RH, 3e vague, bureau, retours du 10/10).</w:t>
       </w:r>
     </w:p>
     <w:p>
@@ -725,6 +725,120 @@
           </w:p>
         </w:tc>
       </w:tr>
+      <w:tr>
+        <w:tc>
+          <w:tcPr>
+            <w:tcW w:type="dxa" w:w="3200"/>
+            <w:tcBorders>
+              <w:top w:val="single" w:color="D9D5CB" w:sz="4"/>
+              <w:left w:val="single" w:color="D9D5CB" w:sz="4"/>
+              <w:bottom w:val="single" w:color="D9D5CB" w:sz="4"/>
+              <w:right w:val="single" w:color="D9D5CB" w:sz="4"/>
+            </w:tcBorders>
+            <w:tcMar>
+              <w:top w:type="dxa" w:w="60"/>
+              <w:left w:type="dxa" w:w="90"/>
+              <w:bottom w:type="dxa" w:w="60"/>
+              <w:right w:type="dxa" w:w="90"/>
+            </w:tcMar>
+            <w:vAlign w:val="top"/>
+          </w:tcPr>
+          <w:p>
+            <w:pPr>
+              <w:spacing w:after="40"/>
+            </w:pPr>
+            <w:r>
+              <w:rPr>
+                <w:rFonts w:ascii="Calibri" w:cs="Calibri" w:eastAsia="Calibri" w:hAnsi="Calibri"/>
+                <w:b/>
+                <w:bCs/>
+                <w:color w:val="14213D"/>
+                <w:sz w:val="19"/>
+                <w:szCs w:val="19"/>
+              </w:rPr>
+              <w:t xml:space="preserve">app/sql/retours_10-10.sql</w:t>
+            </w:r>
+          </w:p>
+        </w:tc>
+        <w:tc>
+          <w:tcPr>
+            <w:tcW w:type="dxa" w:w="8100"/>
+            <w:tcBorders>
+              <w:top w:val="single" w:color="D9D5CB" w:sz="4"/>
+              <w:left w:val="single" w:color="D9D5CB" w:sz="4"/>
+              <w:bottom w:val="single" w:color="D9D5CB" w:sz="4"/>
+              <w:right w:val="single" w:color="D9D5CB" w:sz="4"/>
+            </w:tcBorders>
+            <w:tcMar>
+              <w:top w:type="dxa" w:w="60"/>
+              <w:left w:type="dxa" w:w="90"/>
+              <w:bottom w:type="dxa" w:w="60"/>
+              <w:right w:type="dxa" w:w="90"/>
+            </w:tcMar>
+            <w:vAlign w:val="top"/>
+          </w:tcPr>
+          <w:p>
+            <w:pPr>
+              <w:spacing w:after="40"/>
+            </w:pPr>
+            <w:r>
+              <w:rPr>
+                <w:rFonts w:ascii="Calibri" w:cs="Calibri" w:eastAsia="Calibri" w:hAnsi="Calibri"/>
+                <w:color w:val="14213D"/>
+                <w:sz w:val="19"/>
+                <w:szCs w:val="19"/>
+              </w:rPr>
+              <w:t xml:space="preserve">Retours du 10/10 : registre_set accepte les quarts d'heure sécurité (déclenchements « qhs », sujets « qhstopic » par l'encadrement ; participations « qhsig » par la personne elle-même ou l'encadrant). À passer après nuit_v1.</w:t>
+            </w:r>
+          </w:p>
+        </w:tc>
+        <w:tc>
+          <w:tcPr>
+            <w:tcW w:type="dxa" w:w="3800"/>
+            <w:tcBorders>
+              <w:top w:val="single" w:color="D9D5CB" w:sz="4"/>
+              <w:left w:val="single" w:color="D9D5CB" w:sz="4"/>
+              <w:bottom w:val="single" w:color="D9D5CB" w:sz="4"/>
+              <w:right w:val="single" w:color="D9D5CB" w:sz="4"/>
+            </w:tcBorders>
+            <w:tcMar>
+              <w:top w:type="dxa" w:w="60"/>
+              <w:left w:type="dxa" w:w="90"/>
+              <w:bottom w:type="dxa" w:w="60"/>
+              <w:right w:type="dxa" w:w="90"/>
+            </w:tcMar>
+            <w:vAlign w:val="top"/>
+          </w:tcPr>
+          <w:p>
+            <w:pPr>
+              <w:spacing w:after="40"/>
+            </w:pPr>
+            <w:r>
+              <w:rPr>
+                <w:rFonts w:ascii="Calibri" w:cs="Calibri" w:eastAsia="Calibri" w:hAnsi="Calibri"/>
+                <w:color w:val="14213D"/>
+                <w:sz w:val="20"/>
+                <w:szCs w:val="20"/>
+              </w:rPr>
+              <w:t xml:space="preserve"/>
+            </w:r>
+          </w:p>
+          <w:p>
+            <w:pPr>
+              <w:spacing w:after="40"/>
+            </w:pPr>
+            <w:r>
+              <w:rPr>
+                <w:rFonts w:ascii="Calibri" w:cs="Calibri" w:eastAsia="Calibri" w:hAnsi="Calibri"/>
+                <w:color w:val="14213D"/>
+                <w:sz w:val="20"/>
+                <w:szCs w:val="20"/>
+              </w:rPr>
+              <w:t xml:space="preserve"/>
+            </w:r>
+          </w:p>
+        </w:tc>
+      </w:tr>
     </w:tbl>
     <w:p>
       <w:pPr>
@@ -740,6 +854,2771 @@
         <w:t xml:space="preserve"> </w:t>
       </w:r>
     </w:p>
+    <w:p>
+      <w:pPr>
+        <w:pStyle w:val="Heading1"/>
+        <w:spacing w:after="120" w:before="320"/>
+      </w:pPr>
+      <w:r>
+        <w:rPr>
+          <w:rFonts w:ascii="Calibri" w:cs="Calibri" w:eastAsia="Calibri" w:hAnsi="Calibri"/>
+          <w:b/>
+          <w:bCs/>
+          <w:color w:val="EB6834"/>
+          <w:sz w:val="30"/>
+          <w:szCs w:val="30"/>
+        </w:rPr>
+        <w:t xml:space="preserve">0 · Tes retours du 10/10 (points 1 à 3) — ce que j'ai fait ce matin</w:t>
+      </w:r>
+    </w:p>
+    <w:p>
+      <w:pPr>
+        <w:spacing w:after="80" w:line="264"/>
+      </w:pPr>
+      <w:r>
+        <w:rPr>
+          <w:rFonts w:ascii="Calibri" w:cs="Calibri" w:eastAsia="Calibri" w:hAnsi="Calibri"/>
+          <w:color w:val="6B6B66"/>
+          <w:sz w:val="20"/>
+          <w:szCs w:val="20"/>
+        </w:rPr>
+        <w:t xml:space="preserve">Tes commentaires de la colonne de droite, dans l'ordre où tu les as écrits. Nouvelle colonne pour tes retours sur les corrections.</w:t>
+      </w:r>
+    </w:p>
+    <w:tbl>
+      <w:tblPr>
+        <w:tblW w:type="dxa" w:w="15100"/>
+        <w:tblBorders>
+          <w:top w:val="single" w:color="auto" w:sz="4"/>
+          <w:left w:val="single" w:color="auto" w:sz="4"/>
+          <w:bottom w:val="single" w:color="auto" w:sz="4"/>
+          <w:right w:val="single" w:color="auto" w:sz="4"/>
+          <w:insideH w:val="single" w:color="auto" w:sz="4"/>
+          <w:insideV w:val="single" w:color="auto" w:sz="4"/>
+        </w:tblBorders>
+      </w:tblPr>
+      <w:tblGrid>
+        <w:gridCol w:w="2300"/>
+        <w:gridCol w:w="4100"/>
+        <w:gridCol w:w="3700"/>
+        <w:gridCol w:w="1300"/>
+        <w:gridCol w:w="3700"/>
+      </w:tblGrid>
+      <w:tr>
+        <w:trPr>
+          <w:tblHeader/>
+        </w:trPr>
+        <w:tc>
+          <w:tcPr>
+            <w:tcW w:type="dxa" w:w="2300"/>
+            <w:tcBorders>
+              <w:top w:val="single" w:color="D9D5CB" w:sz="4"/>
+              <w:left w:val="single" w:color="D9D5CB" w:sz="4"/>
+              <w:bottom w:val="single" w:color="D9D5CB" w:sz="4"/>
+              <w:right w:val="single" w:color="D9D5CB" w:sz="4"/>
+            </w:tcBorders>
+            <w:shd w:fill="14213D" w:color="auto" w:val="clear"/>
+            <w:tcMar>
+              <w:top w:type="dxa" w:w="60"/>
+              <w:left w:type="dxa" w:w="90"/>
+              <w:bottom w:type="dxa" w:w="60"/>
+              <w:right w:type="dxa" w:w="90"/>
+            </w:tcMar>
+            <w:vAlign w:val="top"/>
+          </w:tcPr>
+          <w:p>
+            <w:pPr>
+              <w:spacing w:after="80" w:line="264"/>
+            </w:pPr>
+            <w:r>
+              <w:rPr>
+                <w:rFonts w:ascii="Calibri" w:cs="Calibri" w:eastAsia="Calibri" w:hAnsi="Calibri"/>
+                <w:b/>
+                <w:bCs/>
+                <w:color w:val="FFFFFF"/>
+                <w:sz w:val="19"/>
+                <w:szCs w:val="19"/>
+              </w:rPr>
+              <w:t xml:space="preserve">Fonctionnalité</w:t>
+            </w:r>
+          </w:p>
+        </w:tc>
+        <w:tc>
+          <w:tcPr>
+            <w:tcW w:type="dxa" w:w="4100"/>
+            <w:tcBorders>
+              <w:top w:val="single" w:color="D9D5CB" w:sz="4"/>
+              <w:left w:val="single" w:color="D9D5CB" w:sz="4"/>
+              <w:bottom w:val="single" w:color="D9D5CB" w:sz="4"/>
+              <w:right w:val="single" w:color="D9D5CB" w:sz="4"/>
+            </w:tcBorders>
+            <w:shd w:fill="14213D" w:color="auto" w:val="clear"/>
+            <w:tcMar>
+              <w:top w:type="dxa" w:w="60"/>
+              <w:left w:type="dxa" w:w="90"/>
+              <w:bottom w:type="dxa" w:w="60"/>
+              <w:right w:type="dxa" w:w="90"/>
+            </w:tcMar>
+            <w:vAlign w:val="top"/>
+          </w:tcPr>
+          <w:p>
+            <w:pPr>
+              <w:spacing w:after="80" w:line="264"/>
+            </w:pPr>
+            <w:r>
+              <w:rPr>
+                <w:rFonts w:ascii="Calibri" w:cs="Calibri" w:eastAsia="Calibri" w:hAnsi="Calibri"/>
+                <w:b/>
+                <w:bCs/>
+                <w:color w:val="FFFFFF"/>
+                <w:sz w:val="19"/>
+                <w:szCs w:val="19"/>
+              </w:rPr>
+              <w:t xml:space="preserve">Où la trouver · comment tester</w:t>
+            </w:r>
+          </w:p>
+        </w:tc>
+        <w:tc>
+          <w:tcPr>
+            <w:tcW w:type="dxa" w:w="3700"/>
+            <w:tcBorders>
+              <w:top w:val="single" w:color="D9D5CB" w:sz="4"/>
+              <w:left w:val="single" w:color="D9D5CB" w:sz="4"/>
+              <w:bottom w:val="single" w:color="D9D5CB" w:sz="4"/>
+              <w:right w:val="single" w:color="D9D5CB" w:sz="4"/>
+            </w:tcBorders>
+            <w:shd w:fill="14213D" w:color="auto" w:val="clear"/>
+            <w:tcMar>
+              <w:top w:type="dxa" w:w="60"/>
+              <w:left w:type="dxa" w:w="90"/>
+              <w:bottom w:type="dxa" w:w="60"/>
+              <w:right w:type="dxa" w:w="90"/>
+            </w:tcMar>
+            <w:vAlign w:val="top"/>
+          </w:tcPr>
+          <w:p>
+            <w:pPr>
+              <w:spacing w:after="80" w:line="264"/>
+            </w:pPr>
+            <w:r>
+              <w:rPr>
+                <w:rFonts w:ascii="Calibri" w:cs="Calibri" w:eastAsia="Calibri" w:hAnsi="Calibri"/>
+                <w:b/>
+                <w:bCs/>
+                <w:color w:val="FFFFFF"/>
+                <w:sz w:val="19"/>
+                <w:szCs w:val="19"/>
+              </w:rPr>
+              <w:t xml:space="preserve">Hypothèses · limites · ce que j'ai tranché</w:t>
+            </w:r>
+          </w:p>
+        </w:tc>
+        <w:tc>
+          <w:tcPr>
+            <w:tcW w:type="dxa" w:w="1300"/>
+            <w:tcBorders>
+              <w:top w:val="single" w:color="D9D5CB" w:sz="4"/>
+              <w:left w:val="single" w:color="D9D5CB" w:sz="4"/>
+              <w:bottom w:val="single" w:color="D9D5CB" w:sz="4"/>
+              <w:right w:val="single" w:color="D9D5CB" w:sz="4"/>
+            </w:tcBorders>
+            <w:shd w:fill="14213D" w:color="auto" w:val="clear"/>
+            <w:tcMar>
+              <w:top w:type="dxa" w:w="60"/>
+              <w:left w:type="dxa" w:w="90"/>
+              <w:bottom w:type="dxa" w:w="60"/>
+              <w:right w:type="dxa" w:w="90"/>
+            </w:tcMar>
+            <w:vAlign w:val="top"/>
+          </w:tcPr>
+          <w:p>
+            <w:pPr>
+              <w:spacing w:after="80" w:line="264"/>
+            </w:pPr>
+            <w:r>
+              <w:rPr>
+                <w:rFonts w:ascii="Calibri" w:cs="Calibri" w:eastAsia="Calibri" w:hAnsi="Calibri"/>
+                <w:b/>
+                <w:bCs/>
+                <w:color w:val="FFFFFF"/>
+                <w:sz w:val="19"/>
+                <w:szCs w:val="19"/>
+              </w:rPr>
+              <w:t xml:space="preserve">Statut</w:t>
+            </w:r>
+          </w:p>
+        </w:tc>
+        <w:tc>
+          <w:tcPr>
+            <w:tcW w:type="dxa" w:w="3700"/>
+            <w:tcBorders>
+              <w:top w:val="single" w:color="D9D5CB" w:sz="4"/>
+              <w:left w:val="single" w:color="D9D5CB" w:sz="4"/>
+              <w:bottom w:val="single" w:color="D9D5CB" w:sz="4"/>
+              <w:right w:val="single" w:color="D9D5CB" w:sz="4"/>
+            </w:tcBorders>
+            <w:shd w:fill="14213D" w:color="auto" w:val="clear"/>
+            <w:tcMar>
+              <w:top w:type="dxa" w:w="60"/>
+              <w:left w:type="dxa" w:w="90"/>
+              <w:bottom w:type="dxa" w:w="60"/>
+              <w:right w:type="dxa" w:w="90"/>
+            </w:tcMar>
+            <w:vAlign w:val="top"/>
+          </w:tcPr>
+          <w:p>
+            <w:pPr>
+              <w:spacing w:after="80" w:line="264"/>
+            </w:pPr>
+            <w:r>
+              <w:rPr>
+                <w:rFonts w:ascii="Calibri" w:cs="Calibri" w:eastAsia="Calibri" w:hAnsi="Calibri"/>
+                <w:b/>
+                <w:bCs/>
+                <w:color w:val="FFFFFF"/>
+                <w:sz w:val="19"/>
+                <w:szCs w:val="19"/>
+              </w:rPr>
+              <w:t xml:space="preserve">Vos commentaires</w:t>
+            </w:r>
+          </w:p>
+        </w:tc>
+      </w:tr>
+      <w:tr>
+        <w:tc>
+          <w:tcPr>
+            <w:tcW w:type="dxa" w:w="2300"/>
+            <w:tcBorders>
+              <w:top w:val="single" w:color="D9D5CB" w:sz="4"/>
+              <w:left w:val="single" w:color="D9D5CB" w:sz="4"/>
+              <w:bottom w:val="single" w:color="D9D5CB" w:sz="4"/>
+              <w:right w:val="single" w:color="D9D5CB" w:sz="4"/>
+            </w:tcBorders>
+            <w:tcMar>
+              <w:top w:type="dxa" w:w="60"/>
+              <w:left w:type="dxa" w:w="90"/>
+              <w:bottom w:type="dxa" w:w="60"/>
+              <w:right w:type="dxa" w:w="90"/>
+            </w:tcMar>
+            <w:vAlign w:val="top"/>
+          </w:tcPr>
+          <w:p>
+            <w:pPr>
+              <w:spacing w:after="40"/>
+            </w:pPr>
+            <w:r>
+              <w:rPr>
+                <w:rFonts w:ascii="Calibri" w:cs="Calibri" w:eastAsia="Calibri" w:hAnsi="Calibri"/>
+                <w:b/>
+                <w:bCs/>
+                <w:color w:val="14213D"/>
+                <w:sz w:val="20"/>
+                <w:szCs w:val="20"/>
+              </w:rPr>
+              <w:t xml:space="preserve">Règlement intérieur au mot près</w:t>
+            </w:r>
+          </w:p>
+        </w:tc>
+        <w:tc>
+          <w:tcPr>
+            <w:tcW w:type="dxa" w:w="4100"/>
+            <w:tcBorders>
+              <w:top w:val="single" w:color="D9D5CB" w:sz="4"/>
+              <w:left w:val="single" w:color="D9D5CB" w:sz="4"/>
+              <w:bottom w:val="single" w:color="D9D5CB" w:sz="4"/>
+              <w:right w:val="single" w:color="D9D5CB" w:sz="4"/>
+            </w:tcBorders>
+            <w:tcMar>
+              <w:top w:type="dxa" w:w="60"/>
+              <w:left w:type="dxa" w:w="90"/>
+              <w:bottom w:type="dxa" w:w="60"/>
+              <w:right w:type="dxa" w:w="90"/>
+            </w:tcMar>
+            <w:vAlign w:val="top"/>
+          </w:tcPr>
+          <w:p>
+            <w:pPr>
+              <w:spacing w:after="40"/>
+            </w:pPr>
+            <w:r>
+              <w:rPr>
+                <w:rFonts w:ascii="Calibri" w:cs="Calibri" w:eastAsia="Calibri" w:hAnsi="Calibri"/>
+                <w:color w:val="14213D"/>
+                <w:sz w:val="19"/>
+                <w:szCs w:val="19"/>
+              </w:rPr>
+              <w:t xml:space="preserve">Vérifié par diff mot à mot entre le texte de l'appli et le PDF : identiques, à part le sommaire, les en-têtes « Règlement intérieur Mars 2026 · n » et le bloc de signature papier (volontairement retirés).</w:t>
+            </w:r>
+          </w:p>
+        </w:tc>
+        <w:tc>
+          <w:tcPr>
+            <w:tcW w:type="dxa" w:w="3700"/>
+            <w:tcBorders>
+              <w:top w:val="single" w:color="D9D5CB" w:sz="4"/>
+              <w:left w:val="single" w:color="D9D5CB" w:sz="4"/>
+              <w:bottom w:val="single" w:color="D9D5CB" w:sz="4"/>
+              <w:right w:val="single" w:color="D9D5CB" w:sz="4"/>
+            </w:tcBorders>
+            <w:tcMar>
+              <w:top w:type="dxa" w:w="60"/>
+              <w:left w:type="dxa" w:w="90"/>
+              <w:bottom w:type="dxa" w:w="60"/>
+              <w:right w:type="dxa" w:w="90"/>
+            </w:tcMar>
+            <w:vAlign w:val="top"/>
+          </w:tcPr>
+          <w:p>
+            <w:pPr>
+              <w:spacing w:after="40"/>
+            </w:pPr>
+            <w:r>
+              <w:rPr>
+                <w:rFonts w:ascii="Calibri" w:cs="Calibri" w:eastAsia="Calibri" w:hAnsi="Calibri"/>
+                <w:color w:val="14213D"/>
+                <w:sz w:val="19"/>
+                <w:szCs w:val="19"/>
+              </w:rPr>
+              <w:t xml:space="preserve">Rien à changer.</w:t>
+            </w:r>
+          </w:p>
+        </w:tc>
+        <w:tc>
+          <w:tcPr>
+            <w:tcW w:type="dxa" w:w="1300"/>
+            <w:tcBorders>
+              <w:top w:val="single" w:color="D9D5CB" w:sz="4"/>
+              <w:left w:val="single" w:color="D9D5CB" w:sz="4"/>
+              <w:bottom w:val="single" w:color="D9D5CB" w:sz="4"/>
+              <w:right w:val="single" w:color="D9D5CB" w:sz="4"/>
+            </w:tcBorders>
+            <w:shd w:fill="FFF4EE" w:color="auto" w:val="clear"/>
+            <w:tcMar>
+              <w:top w:type="dxa" w:w="60"/>
+              <w:left w:type="dxa" w:w="90"/>
+              <w:bottom w:type="dxa" w:w="60"/>
+              <w:right w:type="dxa" w:w="90"/>
+            </w:tcMar>
+            <w:vAlign w:val="top"/>
+          </w:tcPr>
+          <w:p>
+            <w:pPr>
+              <w:spacing w:after="40"/>
+            </w:pPr>
+            <w:r>
+              <w:rPr>
+                <w:rFonts w:ascii="Calibri" w:cs="Calibri" w:eastAsia="Calibri" w:hAnsi="Calibri"/>
+                <w:b/>
+                <w:bCs/>
+                <w:color w:val="14213D"/>
+                <w:sz w:val="19"/>
+                <w:szCs w:val="19"/>
+              </w:rPr>
+              <w:t xml:space="preserve">Vérifié</w:t>
+            </w:r>
+          </w:p>
+        </w:tc>
+        <w:tc>
+          <w:tcPr>
+            <w:tcW w:type="dxa" w:w="3700"/>
+            <w:tcBorders>
+              <w:top w:val="single" w:color="D9D5CB" w:sz="4"/>
+              <w:left w:val="single" w:color="D9D5CB" w:sz="4"/>
+              <w:bottom w:val="single" w:color="D9D5CB" w:sz="4"/>
+              <w:right w:val="single" w:color="D9D5CB" w:sz="4"/>
+            </w:tcBorders>
+            <w:tcMar>
+              <w:top w:type="dxa" w:w="60"/>
+              <w:left w:type="dxa" w:w="90"/>
+              <w:bottom w:type="dxa" w:w="60"/>
+              <w:right w:type="dxa" w:w="90"/>
+            </w:tcMar>
+            <w:vAlign w:val="top"/>
+          </w:tcPr>
+          <w:p>
+            <w:pPr>
+              <w:spacing w:after="40"/>
+            </w:pPr>
+            <w:r>
+              <w:rPr>
+                <w:rFonts w:ascii="Calibri" w:cs="Calibri" w:eastAsia="Calibri" w:hAnsi="Calibri"/>
+                <w:color w:val="14213D"/>
+                <w:sz w:val="20"/>
+                <w:szCs w:val="20"/>
+              </w:rPr>
+              <w:t xml:space="preserve"/>
+            </w:r>
+          </w:p>
+          <w:p>
+            <w:pPr>
+              <w:spacing w:after="40"/>
+            </w:pPr>
+            <w:r>
+              <w:rPr>
+                <w:rFonts w:ascii="Calibri" w:cs="Calibri" w:eastAsia="Calibri" w:hAnsi="Calibri"/>
+                <w:color w:val="14213D"/>
+                <w:sz w:val="20"/>
+                <w:szCs w:val="20"/>
+              </w:rPr>
+              <w:t xml:space="preserve"/>
+            </w:r>
+          </w:p>
+        </w:tc>
+      </w:tr>
+      <w:tr>
+        <w:tc>
+          <w:tcPr>
+            <w:tcW w:type="dxa" w:w="2300"/>
+            <w:tcBorders>
+              <w:top w:val="single" w:color="D9D5CB" w:sz="4"/>
+              <w:left w:val="single" w:color="D9D5CB" w:sz="4"/>
+              <w:bottom w:val="single" w:color="D9D5CB" w:sz="4"/>
+              <w:right w:val="single" w:color="D9D5CB" w:sz="4"/>
+            </w:tcBorders>
+            <w:tcMar>
+              <w:top w:type="dxa" w:w="60"/>
+              <w:left w:type="dxa" w:w="90"/>
+              <w:bottom w:type="dxa" w:w="60"/>
+              <w:right w:type="dxa" w:w="90"/>
+            </w:tcMar>
+            <w:vAlign w:val="top"/>
+          </w:tcPr>
+          <w:p>
+            <w:pPr>
+              <w:spacing w:after="40"/>
+            </w:pPr>
+            <w:r>
+              <w:rPr>
+                <w:rFonts w:ascii="Calibri" w:cs="Calibri" w:eastAsia="Calibri" w:hAnsi="Calibri"/>
+                <w:b/>
+                <w:bCs/>
+                <w:color w:val="14213D"/>
+                <w:sz w:val="20"/>
+                <w:szCs w:val="20"/>
+              </w:rPr>
+              <w:t xml:space="preserve">RH et directrice adjointe : qui n'a pas signé</w:t>
+            </w:r>
+          </w:p>
+        </w:tc>
+        <w:tc>
+          <w:tcPr>
+            <w:tcW w:type="dxa" w:w="4100"/>
+            <w:tcBorders>
+              <w:top w:val="single" w:color="D9D5CB" w:sz="4"/>
+              <w:left w:val="single" w:color="D9D5CB" w:sz="4"/>
+              <w:bottom w:val="single" w:color="D9D5CB" w:sz="4"/>
+              <w:right w:val="single" w:color="D9D5CB" w:sz="4"/>
+            </w:tcBorders>
+            <w:tcMar>
+              <w:top w:type="dxa" w:w="60"/>
+              <w:left w:type="dxa" w:w="90"/>
+              <w:bottom w:type="dxa" w:w="60"/>
+              <w:right w:type="dxa" w:w="90"/>
+            </w:tcMar>
+            <w:vAlign w:val="top"/>
+          </w:tcPr>
+          <w:p>
+            <w:pPr>
+              <w:spacing w:after="40"/>
+            </w:pPr>
+            <w:r>
+              <w:rPr>
+                <w:rFonts w:ascii="Calibri" w:cs="Calibri" w:eastAsia="Calibri" w:hAnsi="Calibri"/>
+                <w:color w:val="14213D"/>
+                <w:sz w:val="19"/>
+                <w:szCs w:val="19"/>
+              </w:rPr>
+              <w:t xml:space="preserve">Exploitation → Documents d'entreprise : bloc « À relancer — n'ont pas signé » en tête (par personne : poste, nombre de documents manquants, lesquels), bouton « Liste des retardataires (imprimable) », pastille sur la ligne du menu. Chaque document garde sa liste « signé / à signer ».</w:t>
+            </w:r>
+          </w:p>
+        </w:tc>
+        <w:tc>
+          <w:tcPr>
+            <w:tcW w:type="dxa" w:w="3700"/>
+            <w:tcBorders>
+              <w:top w:val="single" w:color="D9D5CB" w:sz="4"/>
+              <w:left w:val="single" w:color="D9D5CB" w:sz="4"/>
+              <w:bottom w:val="single" w:color="D9D5CB" w:sz="4"/>
+              <w:right w:val="single" w:color="D9D5CB" w:sz="4"/>
+            </w:tcBorders>
+            <w:tcMar>
+              <w:top w:type="dxa" w:w="60"/>
+              <w:left w:type="dxa" w:w="90"/>
+              <w:bottom w:type="dxa" w:w="60"/>
+              <w:right w:type="dxa" w:w="90"/>
+            </w:tcMar>
+            <w:vAlign w:val="top"/>
+          </w:tcPr>
+          <w:p>
+            <w:pPr>
+              <w:spacing w:after="40"/>
+            </w:pPr>
+            <w:r>
+              <w:rPr>
+                <w:rFonts w:ascii="Calibri" w:cs="Calibri" w:eastAsia="Calibri" w:hAnsi="Calibri"/>
+                <w:color w:val="14213D"/>
+                <w:sz w:val="19"/>
+                <w:szCs w:val="19"/>
+              </w:rPr>
+              <w:t xml:space="preserve">Visible par qui a le droit QSE (RH, direction, encadrement) et l'administrateur.</w:t>
+            </w:r>
+          </w:p>
+        </w:tc>
+        <w:tc>
+          <w:tcPr>
+            <w:tcW w:type="dxa" w:w="1300"/>
+            <w:tcBorders>
+              <w:top w:val="single" w:color="D9D5CB" w:sz="4"/>
+              <w:left w:val="single" w:color="D9D5CB" w:sz="4"/>
+              <w:bottom w:val="single" w:color="D9D5CB" w:sz="4"/>
+              <w:right w:val="single" w:color="D9D5CB" w:sz="4"/>
+            </w:tcBorders>
+            <w:shd w:fill="E6F5EC" w:color="auto" w:val="clear"/>
+            <w:tcMar>
+              <w:top w:type="dxa" w:w="60"/>
+              <w:left w:type="dxa" w:w="90"/>
+              <w:bottom w:type="dxa" w:w="60"/>
+              <w:right w:type="dxa" w:w="90"/>
+            </w:tcMar>
+            <w:vAlign w:val="top"/>
+          </w:tcPr>
+          <w:p>
+            <w:pPr>
+              <w:spacing w:after="40"/>
+            </w:pPr>
+            <w:r>
+              <w:rPr>
+                <w:rFonts w:ascii="Calibri" w:cs="Calibri" w:eastAsia="Calibri" w:hAnsi="Calibri"/>
+                <w:b/>
+                <w:bCs/>
+                <w:color w:val="14213D"/>
+                <w:sz w:val="19"/>
+                <w:szCs w:val="19"/>
+              </w:rPr>
+              <w:t xml:space="preserve">Fait</w:t>
+            </w:r>
+          </w:p>
+        </w:tc>
+        <w:tc>
+          <w:tcPr>
+            <w:tcW w:type="dxa" w:w="3700"/>
+            <w:tcBorders>
+              <w:top w:val="single" w:color="D9D5CB" w:sz="4"/>
+              <w:left w:val="single" w:color="D9D5CB" w:sz="4"/>
+              <w:bottom w:val="single" w:color="D9D5CB" w:sz="4"/>
+              <w:right w:val="single" w:color="D9D5CB" w:sz="4"/>
+            </w:tcBorders>
+            <w:tcMar>
+              <w:top w:type="dxa" w:w="60"/>
+              <w:left w:type="dxa" w:w="90"/>
+              <w:bottom w:type="dxa" w:w="60"/>
+              <w:right w:type="dxa" w:w="90"/>
+            </w:tcMar>
+            <w:vAlign w:val="top"/>
+          </w:tcPr>
+          <w:p>
+            <w:pPr>
+              <w:spacing w:after="40"/>
+            </w:pPr>
+            <w:r>
+              <w:rPr>
+                <w:rFonts w:ascii="Calibri" w:cs="Calibri" w:eastAsia="Calibri" w:hAnsi="Calibri"/>
+                <w:color w:val="14213D"/>
+                <w:sz w:val="20"/>
+                <w:szCs w:val="20"/>
+              </w:rPr>
+              <w:t xml:space="preserve"/>
+            </w:r>
+          </w:p>
+          <w:p>
+            <w:pPr>
+              <w:spacing w:after="40"/>
+            </w:pPr>
+            <w:r>
+              <w:rPr>
+                <w:rFonts w:ascii="Calibri" w:cs="Calibri" w:eastAsia="Calibri" w:hAnsi="Calibri"/>
+                <w:color w:val="14213D"/>
+                <w:sz w:val="20"/>
+                <w:szCs w:val="20"/>
+              </w:rPr>
+              <w:t xml:space="preserve"/>
+            </w:r>
+          </w:p>
+        </w:tc>
+      </w:tr>
+      <w:tr>
+        <w:tc>
+          <w:tcPr>
+            <w:tcW w:type="dxa" w:w="2300"/>
+            <w:tcBorders>
+              <w:top w:val="single" w:color="D9D5CB" w:sz="4"/>
+              <w:left w:val="single" w:color="D9D5CB" w:sz="4"/>
+              <w:bottom w:val="single" w:color="D9D5CB" w:sz="4"/>
+              <w:right w:val="single" w:color="D9D5CB" w:sz="4"/>
+            </w:tcBorders>
+            <w:tcMar>
+              <w:top w:type="dxa" w:w="60"/>
+              <w:left w:type="dxa" w:w="90"/>
+              <w:bottom w:type="dxa" w:w="60"/>
+              <w:right w:type="dxa" w:w="90"/>
+            </w:tcMar>
+            <w:vAlign w:val="top"/>
+          </w:tcPr>
+          <w:p>
+            <w:pPr>
+              <w:spacing w:after="40"/>
+            </w:pPr>
+            <w:r>
+              <w:rPr>
+                <w:rFonts w:ascii="Calibri" w:cs="Calibri" w:eastAsia="Calibri" w:hAnsi="Calibri"/>
+                <w:b/>
+                <w:bCs/>
+                <w:color w:val="14213D"/>
+                <w:sz w:val="20"/>
+                <w:szCs w:val="20"/>
+              </w:rPr>
+              <w:t xml:space="preserve">Notes de service = PDF déroulé en entier ; flash info</w:t>
+            </w:r>
+          </w:p>
+        </w:tc>
+        <w:tc>
+          <w:tcPr>
+            <w:tcW w:type="dxa" w:w="4100"/>
+            <w:tcBorders>
+              <w:top w:val="single" w:color="D9D5CB" w:sz="4"/>
+              <w:left w:val="single" w:color="D9D5CB" w:sz="4"/>
+              <w:bottom w:val="single" w:color="D9D5CB" w:sz="4"/>
+              <w:right w:val="single" w:color="D9D5CB" w:sz="4"/>
+            </w:tcBorders>
+            <w:tcMar>
+              <w:top w:type="dxa" w:w="60"/>
+              <w:left w:type="dxa" w:w="90"/>
+              <w:bottom w:type="dxa" w:w="60"/>
+              <w:right w:type="dxa" w:w="90"/>
+            </w:tcMar>
+            <w:vAlign w:val="top"/>
+          </w:tcPr>
+          <w:p>
+            <w:pPr>
+              <w:spacing w:after="40"/>
+            </w:pPr>
+            <w:r>
+              <w:rPr>
+                <w:rFonts w:ascii="Calibri" w:cs="Calibri" w:eastAsia="Calibri" w:hAnsi="Calibri"/>
+                <w:color w:val="14213D"/>
+                <w:sz w:val="19"/>
+                <w:szCs w:val="19"/>
+              </w:rPr>
+              <w:t xml:space="preserve">Exploitation → Documents d'entreprise → « ➕ Note de service » ou « ⚡ Flash info sécurité » : titre, PDF (ou texte), à qui. Le PDF se lit page par page dans l'appli, « J'ai lu » ne se débloque qu'à la dernière page, puis signature. Flash info : pré-réglé « tous les postes exploitation (encadrement travaux + terrain) + intérimaires ».</w:t>
+            </w:r>
+          </w:p>
+        </w:tc>
+        <w:tc>
+          <w:tcPr>
+            <w:tcW w:type="dxa" w:w="3700"/>
+            <w:tcBorders>
+              <w:top w:val="single" w:color="D9D5CB" w:sz="4"/>
+              <w:left w:val="single" w:color="D9D5CB" w:sz="4"/>
+              <w:bottom w:val="single" w:color="D9D5CB" w:sz="4"/>
+              <w:right w:val="single" w:color="D9D5CB" w:sz="4"/>
+            </w:tcBorders>
+            <w:tcMar>
+              <w:top w:type="dxa" w:w="60"/>
+              <w:left w:type="dxa" w:w="90"/>
+              <w:bottom w:type="dxa" w:w="60"/>
+              <w:right w:type="dxa" w:w="90"/>
+            </w:tcMar>
+            <w:vAlign w:val="top"/>
+          </w:tcPr>
+          <w:p>
+            <w:pPr>
+              <w:spacing w:after="40"/>
+            </w:pPr>
+            <w:r>
+              <w:rPr>
+                <w:rFonts w:ascii="Calibri" w:cs="Calibri" w:eastAsia="Calibri" w:hAnsi="Calibri"/>
+                <w:color w:val="14213D"/>
+                <w:sz w:val="19"/>
+                <w:szCs w:val="19"/>
+              </w:rPr>
+              <w:t xml:space="preserve">PDF déposé au stockage serveur (hors connexion : gardé dans l'appli si &lt; 1,5 Mo). Sans lecteur intégré (vieux téléphone) : ouverture dans un onglet + attestation après 60 s. Donne-moi le dossier des notes existantes : je les importe telles quelles.</w:t>
+            </w:r>
+          </w:p>
+        </w:tc>
+        <w:tc>
+          <w:tcPr>
+            <w:tcW w:type="dxa" w:w="1300"/>
+            <w:tcBorders>
+              <w:top w:val="single" w:color="D9D5CB" w:sz="4"/>
+              <w:left w:val="single" w:color="D9D5CB" w:sz="4"/>
+              <w:bottom w:val="single" w:color="D9D5CB" w:sz="4"/>
+              <w:right w:val="single" w:color="D9D5CB" w:sz="4"/>
+            </w:tcBorders>
+            <w:shd w:fill="E6F5EC" w:color="auto" w:val="clear"/>
+            <w:tcMar>
+              <w:top w:type="dxa" w:w="60"/>
+              <w:left w:type="dxa" w:w="90"/>
+              <w:bottom w:type="dxa" w:w="60"/>
+              <w:right w:type="dxa" w:w="90"/>
+            </w:tcMar>
+            <w:vAlign w:val="top"/>
+          </w:tcPr>
+          <w:p>
+            <w:pPr>
+              <w:spacing w:after="40"/>
+            </w:pPr>
+            <w:r>
+              <w:rPr>
+                <w:rFonts w:ascii="Calibri" w:cs="Calibri" w:eastAsia="Calibri" w:hAnsi="Calibri"/>
+                <w:b/>
+                <w:bCs/>
+                <w:color w:val="14213D"/>
+                <w:sz w:val="19"/>
+                <w:szCs w:val="19"/>
+              </w:rPr>
+              <w:t xml:space="preserve">Fait</w:t>
+            </w:r>
+          </w:p>
+        </w:tc>
+        <w:tc>
+          <w:tcPr>
+            <w:tcW w:type="dxa" w:w="3700"/>
+            <w:tcBorders>
+              <w:top w:val="single" w:color="D9D5CB" w:sz="4"/>
+              <w:left w:val="single" w:color="D9D5CB" w:sz="4"/>
+              <w:bottom w:val="single" w:color="D9D5CB" w:sz="4"/>
+              <w:right w:val="single" w:color="D9D5CB" w:sz="4"/>
+            </w:tcBorders>
+            <w:tcMar>
+              <w:top w:type="dxa" w:w="60"/>
+              <w:left w:type="dxa" w:w="90"/>
+              <w:bottom w:type="dxa" w:w="60"/>
+              <w:right w:type="dxa" w:w="90"/>
+            </w:tcMar>
+            <w:vAlign w:val="top"/>
+          </w:tcPr>
+          <w:p>
+            <w:pPr>
+              <w:spacing w:after="40"/>
+            </w:pPr>
+            <w:r>
+              <w:rPr>
+                <w:rFonts w:ascii="Calibri" w:cs="Calibri" w:eastAsia="Calibri" w:hAnsi="Calibri"/>
+                <w:color w:val="14213D"/>
+                <w:sz w:val="20"/>
+                <w:szCs w:val="20"/>
+              </w:rPr>
+              <w:t xml:space="preserve"/>
+            </w:r>
+          </w:p>
+          <w:p>
+            <w:pPr>
+              <w:spacing w:after="40"/>
+            </w:pPr>
+            <w:r>
+              <w:rPr>
+                <w:rFonts w:ascii="Calibri" w:cs="Calibri" w:eastAsia="Calibri" w:hAnsi="Calibri"/>
+                <w:color w:val="14213D"/>
+                <w:sz w:val="20"/>
+                <w:szCs w:val="20"/>
+              </w:rPr>
+              <w:t xml:space="preserve"/>
+            </w:r>
+          </w:p>
+        </w:tc>
+      </w:tr>
+      <w:tr>
+        <w:tc>
+          <w:tcPr>
+            <w:tcW w:type="dxa" w:w="2300"/>
+            <w:tcBorders>
+              <w:top w:val="single" w:color="D9D5CB" w:sz="4"/>
+              <w:left w:val="single" w:color="D9D5CB" w:sz="4"/>
+              <w:bottom w:val="single" w:color="D9D5CB" w:sz="4"/>
+              <w:right w:val="single" w:color="D9D5CB" w:sz="4"/>
+            </w:tcBorders>
+            <w:tcMar>
+              <w:top w:type="dxa" w:w="60"/>
+              <w:left w:type="dxa" w:w="90"/>
+              <w:bottom w:type="dxa" w:w="60"/>
+              <w:right w:type="dxa" w:w="90"/>
+            </w:tcMar>
+            <w:vAlign w:val="top"/>
+          </w:tcPr>
+          <w:p>
+            <w:pPr>
+              <w:spacing w:after="40"/>
+            </w:pPr>
+            <w:r>
+              <w:rPr>
+                <w:rFonts w:ascii="Calibri" w:cs="Calibri" w:eastAsia="Calibri" w:hAnsi="Calibri"/>
+                <w:b/>
+                <w:bCs/>
+                <w:color w:val="14213D"/>
+                <w:sz w:val="20"/>
+                <w:szCs w:val="20"/>
+              </w:rPr>
+              <w:t xml:space="preserve">Ordre des notifications</w:t>
+            </w:r>
+          </w:p>
+        </w:tc>
+        <w:tc>
+          <w:tcPr>
+            <w:tcW w:type="dxa" w:w="4100"/>
+            <w:tcBorders>
+              <w:top w:val="single" w:color="D9D5CB" w:sz="4"/>
+              <w:left w:val="single" w:color="D9D5CB" w:sz="4"/>
+              <w:bottom w:val="single" w:color="D9D5CB" w:sz="4"/>
+              <w:right w:val="single" w:color="D9D5CB" w:sz="4"/>
+            </w:tcBorders>
+            <w:tcMar>
+              <w:top w:type="dxa" w:w="60"/>
+              <w:left w:type="dxa" w:w="90"/>
+              <w:bottom w:type="dxa" w:w="60"/>
+              <w:right w:type="dxa" w:w="90"/>
+            </w:tcMar>
+            <w:vAlign w:val="top"/>
+          </w:tcPr>
+          <w:p>
+            <w:pPr>
+              <w:spacing w:after="40"/>
+            </w:pPr>
+            <w:r>
+              <w:rPr>
+                <w:rFonts w:ascii="Calibri" w:cs="Calibri" w:eastAsia="Calibri" w:hAnsi="Calibri"/>
+                <w:color w:val="14213D"/>
+                <w:sz w:val="19"/>
+                <w:szCs w:val="19"/>
+              </w:rPr>
+              <w:t xml:space="preserve">Déjà le tien : accueil nouvel arrivant → règlement / notes → accueil chantier → documents QSE du chantier.</w:t>
+            </w:r>
+          </w:p>
+        </w:tc>
+        <w:tc>
+          <w:tcPr>
+            <w:tcW w:type="dxa" w:w="3700"/>
+            <w:tcBorders>
+              <w:top w:val="single" w:color="D9D5CB" w:sz="4"/>
+              <w:left w:val="single" w:color="D9D5CB" w:sz="4"/>
+              <w:bottom w:val="single" w:color="D9D5CB" w:sz="4"/>
+              <w:right w:val="single" w:color="D9D5CB" w:sz="4"/>
+            </w:tcBorders>
+            <w:tcMar>
+              <w:top w:type="dxa" w:w="60"/>
+              <w:left w:type="dxa" w:w="90"/>
+              <w:bottom w:type="dxa" w:w="60"/>
+              <w:right w:type="dxa" w:w="90"/>
+            </w:tcMar>
+            <w:vAlign w:val="top"/>
+          </w:tcPr>
+          <w:p>
+            <w:pPr>
+              <w:spacing w:after="40"/>
+            </w:pPr>
+            <w:r>
+              <w:rPr>
+                <w:rFonts w:ascii="Calibri" w:cs="Calibri" w:eastAsia="Calibri" w:hAnsi="Calibri"/>
+                <w:color w:val="14213D"/>
+                <w:sz w:val="19"/>
+                <w:szCs w:val="19"/>
+              </w:rPr>
+              <w:t xml:space="preserve">« (pour les salariés) » : le règlement reste demandé à tout le monde, intérimaires compris (le règlement intérieur s'applique à eux pour l'hygiène et la sécurité). Dis-moi si tu veux l'exclure pour les intérimaires.</w:t>
+            </w:r>
+          </w:p>
+        </w:tc>
+        <w:tc>
+          <w:tcPr>
+            <w:tcW w:type="dxa" w:w="1300"/>
+            <w:tcBorders>
+              <w:top w:val="single" w:color="D9D5CB" w:sz="4"/>
+              <w:left w:val="single" w:color="D9D5CB" w:sz="4"/>
+              <w:bottom w:val="single" w:color="D9D5CB" w:sz="4"/>
+              <w:right w:val="single" w:color="D9D5CB" w:sz="4"/>
+            </w:tcBorders>
+            <w:shd w:fill="E6F5EC" w:color="auto" w:val="clear"/>
+            <w:tcMar>
+              <w:top w:type="dxa" w:w="60"/>
+              <w:left w:type="dxa" w:w="90"/>
+              <w:bottom w:type="dxa" w:w="60"/>
+              <w:right w:type="dxa" w:w="90"/>
+            </w:tcMar>
+            <w:vAlign w:val="top"/>
+          </w:tcPr>
+          <w:p>
+            <w:pPr>
+              <w:spacing w:after="40"/>
+            </w:pPr>
+            <w:r>
+              <w:rPr>
+                <w:rFonts w:ascii="Calibri" w:cs="Calibri" w:eastAsia="Calibri" w:hAnsi="Calibri"/>
+                <w:b/>
+                <w:bCs/>
+                <w:color w:val="14213D"/>
+                <w:sz w:val="19"/>
+                <w:szCs w:val="19"/>
+              </w:rPr>
+              <w:t xml:space="preserve">Fait</w:t>
+            </w:r>
+          </w:p>
+        </w:tc>
+        <w:tc>
+          <w:tcPr>
+            <w:tcW w:type="dxa" w:w="3700"/>
+            <w:tcBorders>
+              <w:top w:val="single" w:color="D9D5CB" w:sz="4"/>
+              <w:left w:val="single" w:color="D9D5CB" w:sz="4"/>
+              <w:bottom w:val="single" w:color="D9D5CB" w:sz="4"/>
+              <w:right w:val="single" w:color="D9D5CB" w:sz="4"/>
+            </w:tcBorders>
+            <w:tcMar>
+              <w:top w:type="dxa" w:w="60"/>
+              <w:left w:type="dxa" w:w="90"/>
+              <w:bottom w:type="dxa" w:w="60"/>
+              <w:right w:type="dxa" w:w="90"/>
+            </w:tcMar>
+            <w:vAlign w:val="top"/>
+          </w:tcPr>
+          <w:p>
+            <w:pPr>
+              <w:spacing w:after="40"/>
+            </w:pPr>
+            <w:r>
+              <w:rPr>
+                <w:rFonts w:ascii="Calibri" w:cs="Calibri" w:eastAsia="Calibri" w:hAnsi="Calibri"/>
+                <w:color w:val="14213D"/>
+                <w:sz w:val="20"/>
+                <w:szCs w:val="20"/>
+              </w:rPr>
+              <w:t xml:space="preserve"/>
+            </w:r>
+          </w:p>
+          <w:p>
+            <w:pPr>
+              <w:spacing w:after="40"/>
+            </w:pPr>
+            <w:r>
+              <w:rPr>
+                <w:rFonts w:ascii="Calibri" w:cs="Calibri" w:eastAsia="Calibri" w:hAnsi="Calibri"/>
+                <w:color w:val="14213D"/>
+                <w:sz w:val="20"/>
+                <w:szCs w:val="20"/>
+              </w:rPr>
+              <w:t xml:space="preserve"/>
+            </w:r>
+          </w:p>
+        </w:tc>
+      </w:tr>
+      <w:tr>
+        <w:tc>
+          <w:tcPr>
+            <w:tcW w:type="dxa" w:w="2300"/>
+            <w:tcBorders>
+              <w:top w:val="single" w:color="D9D5CB" w:sz="4"/>
+              <w:left w:val="single" w:color="D9D5CB" w:sz="4"/>
+              <w:bottom w:val="single" w:color="D9D5CB" w:sz="4"/>
+              <w:right w:val="single" w:color="D9D5CB" w:sz="4"/>
+            </w:tcBorders>
+            <w:tcMar>
+              <w:top w:type="dxa" w:w="60"/>
+              <w:left w:type="dxa" w:w="90"/>
+              <w:bottom w:type="dxa" w:w="60"/>
+              <w:right w:type="dxa" w:w="90"/>
+            </w:tcMar>
+            <w:vAlign w:val="top"/>
+          </w:tcPr>
+          <w:p>
+            <w:pPr>
+              <w:spacing w:after="40"/>
+            </w:pPr>
+            <w:r>
+              <w:rPr>
+                <w:rFonts w:ascii="Calibri" w:cs="Calibri" w:eastAsia="Calibri" w:hAnsi="Calibri"/>
+                <w:b/>
+                <w:bCs/>
+                <w:color w:val="14213D"/>
+                <w:sz w:val="20"/>
+                <w:szCs w:val="20"/>
+              </w:rPr>
+              <w:t xml:space="preserve">Accueil chantier : jugulaire, repas, Angers</w:t>
+            </w:r>
+          </w:p>
+        </w:tc>
+        <w:tc>
+          <w:tcPr>
+            <w:tcW w:type="dxa" w:w="4100"/>
+            <w:tcBorders>
+              <w:top w:val="single" w:color="D9D5CB" w:sz="4"/>
+              <w:left w:val="single" w:color="D9D5CB" w:sz="4"/>
+              <w:bottom w:val="single" w:color="D9D5CB" w:sz="4"/>
+              <w:right w:val="single" w:color="D9D5CB" w:sz="4"/>
+            </w:tcBorders>
+            <w:tcMar>
+              <w:top w:type="dxa" w:w="60"/>
+              <w:left w:type="dxa" w:w="90"/>
+              <w:bottom w:type="dxa" w:w="60"/>
+              <w:right w:type="dxa" w:w="90"/>
+            </w:tcMar>
+            <w:vAlign w:val="top"/>
+          </w:tcPr>
+          <w:p>
+            <w:pPr>
+              <w:spacing w:after="40"/>
+            </w:pPr>
+            <w:r>
+              <w:rPr>
+                <w:rFonts w:ascii="Calibri" w:cs="Calibri" w:eastAsia="Calibri" w:hAnsi="Calibri"/>
+                <w:color w:val="14213D"/>
+                <w:sz w:val="19"/>
+                <w:szCs w:val="19"/>
+              </w:rPr>
+              <w:t xml:space="preserve">Jugulaire retirée du module EPI. Hygiène : « les repas se prennent à la base vie (ou dans son véhicule), jamais ailleurs : ni dans la fouille, ni sur l'emprise, ni dans les locaux du client ». Référence au contrôle d'Angers retirée.</w:t>
+            </w:r>
+          </w:p>
+        </w:tc>
+        <w:tc>
+          <w:tcPr>
+            <w:tcW w:type="dxa" w:w="3700"/>
+            <w:tcBorders>
+              <w:top w:val="single" w:color="D9D5CB" w:sz="4"/>
+              <w:left w:val="single" w:color="D9D5CB" w:sz="4"/>
+              <w:bottom w:val="single" w:color="D9D5CB" w:sz="4"/>
+              <w:right w:val="single" w:color="D9D5CB" w:sz="4"/>
+            </w:tcBorders>
+            <w:tcMar>
+              <w:top w:type="dxa" w:w="60"/>
+              <w:left w:type="dxa" w:w="90"/>
+              <w:bottom w:type="dxa" w:w="60"/>
+              <w:right w:type="dxa" w:w="90"/>
+            </w:tcMar>
+            <w:vAlign w:val="top"/>
+          </w:tcPr>
+          <w:p>
+            <w:pPr>
+              <w:spacing w:after="40"/>
+            </w:pPr>
+            <w:r>
+              <w:rPr>
+                <w:rFonts w:ascii="Calibri" w:cs="Calibri" w:eastAsia="Calibri" w:hAnsi="Calibri"/>
+                <w:color w:val="14213D"/>
+                <w:sz w:val="19"/>
+                <w:szCs w:val="19"/>
+              </w:rPr>
+              <w:t xml:space="preserve"/>
+            </w:r>
+          </w:p>
+        </w:tc>
+        <w:tc>
+          <w:tcPr>
+            <w:tcW w:type="dxa" w:w="1300"/>
+            <w:tcBorders>
+              <w:top w:val="single" w:color="D9D5CB" w:sz="4"/>
+              <w:left w:val="single" w:color="D9D5CB" w:sz="4"/>
+              <w:bottom w:val="single" w:color="D9D5CB" w:sz="4"/>
+              <w:right w:val="single" w:color="D9D5CB" w:sz="4"/>
+            </w:tcBorders>
+            <w:shd w:fill="E6F5EC" w:color="auto" w:val="clear"/>
+            <w:tcMar>
+              <w:top w:type="dxa" w:w="60"/>
+              <w:left w:type="dxa" w:w="90"/>
+              <w:bottom w:type="dxa" w:w="60"/>
+              <w:right w:type="dxa" w:w="90"/>
+            </w:tcMar>
+            <w:vAlign w:val="top"/>
+          </w:tcPr>
+          <w:p>
+            <w:pPr>
+              <w:spacing w:after="40"/>
+            </w:pPr>
+            <w:r>
+              <w:rPr>
+                <w:rFonts w:ascii="Calibri" w:cs="Calibri" w:eastAsia="Calibri" w:hAnsi="Calibri"/>
+                <w:b/>
+                <w:bCs/>
+                <w:color w:val="14213D"/>
+                <w:sz w:val="19"/>
+                <w:szCs w:val="19"/>
+              </w:rPr>
+              <w:t xml:space="preserve">Fait</w:t>
+            </w:r>
+          </w:p>
+        </w:tc>
+        <w:tc>
+          <w:tcPr>
+            <w:tcW w:type="dxa" w:w="3700"/>
+            <w:tcBorders>
+              <w:top w:val="single" w:color="D9D5CB" w:sz="4"/>
+              <w:left w:val="single" w:color="D9D5CB" w:sz="4"/>
+              <w:bottom w:val="single" w:color="D9D5CB" w:sz="4"/>
+              <w:right w:val="single" w:color="D9D5CB" w:sz="4"/>
+            </w:tcBorders>
+            <w:tcMar>
+              <w:top w:type="dxa" w:w="60"/>
+              <w:left w:type="dxa" w:w="90"/>
+              <w:bottom w:type="dxa" w:w="60"/>
+              <w:right w:type="dxa" w:w="90"/>
+            </w:tcMar>
+            <w:vAlign w:val="top"/>
+          </w:tcPr>
+          <w:p>
+            <w:pPr>
+              <w:spacing w:after="40"/>
+            </w:pPr>
+            <w:r>
+              <w:rPr>
+                <w:rFonts w:ascii="Calibri" w:cs="Calibri" w:eastAsia="Calibri" w:hAnsi="Calibri"/>
+                <w:color w:val="14213D"/>
+                <w:sz w:val="20"/>
+                <w:szCs w:val="20"/>
+              </w:rPr>
+              <w:t xml:space="preserve"/>
+            </w:r>
+          </w:p>
+          <w:p>
+            <w:pPr>
+              <w:spacing w:after="40"/>
+            </w:pPr>
+            <w:r>
+              <w:rPr>
+                <w:rFonts w:ascii="Calibri" w:cs="Calibri" w:eastAsia="Calibri" w:hAnsi="Calibri"/>
+                <w:color w:val="14213D"/>
+                <w:sz w:val="20"/>
+                <w:szCs w:val="20"/>
+              </w:rPr>
+              <w:t xml:space="preserve"/>
+            </w:r>
+          </w:p>
+        </w:tc>
+      </w:tr>
+      <w:tr>
+        <w:tc>
+          <w:tcPr>
+            <w:tcW w:type="dxa" w:w="2300"/>
+            <w:tcBorders>
+              <w:top w:val="single" w:color="D9D5CB" w:sz="4"/>
+              <w:left w:val="single" w:color="D9D5CB" w:sz="4"/>
+              <w:bottom w:val="single" w:color="D9D5CB" w:sz="4"/>
+              <w:right w:val="single" w:color="D9D5CB" w:sz="4"/>
+            </w:tcBorders>
+            <w:tcMar>
+              <w:top w:type="dxa" w:w="60"/>
+              <w:left w:type="dxa" w:w="90"/>
+              <w:bottom w:type="dxa" w:w="60"/>
+              <w:right w:type="dxa" w:w="90"/>
+            </w:tcMar>
+            <w:vAlign w:val="top"/>
+          </w:tcPr>
+          <w:p>
+            <w:pPr>
+              <w:spacing w:after="40"/>
+            </w:pPr>
+            <w:r>
+              <w:rPr>
+                <w:rFonts w:ascii="Calibri" w:cs="Calibri" w:eastAsia="Calibri" w:hAnsi="Calibri"/>
+                <w:b/>
+                <w:bCs/>
+                <w:color w:val="14213D"/>
+                <w:sz w:val="20"/>
+                <w:szCs w:val="20"/>
+              </w:rPr>
+              <w:t xml:space="preserve">« Ça me le repropose en signature »</w:t>
+            </w:r>
+          </w:p>
+        </w:tc>
+        <w:tc>
+          <w:tcPr>
+            <w:tcW w:type="dxa" w:w="4100"/>
+            <w:tcBorders>
+              <w:top w:val="single" w:color="D9D5CB" w:sz="4"/>
+              <w:left w:val="single" w:color="D9D5CB" w:sz="4"/>
+              <w:bottom w:val="single" w:color="D9D5CB" w:sz="4"/>
+              <w:right w:val="single" w:color="D9D5CB" w:sz="4"/>
+            </w:tcBorders>
+            <w:tcMar>
+              <w:top w:type="dxa" w:w="60"/>
+              <w:left w:type="dxa" w:w="90"/>
+              <w:bottom w:type="dxa" w:w="60"/>
+              <w:right w:type="dxa" w:w="90"/>
+            </w:tcMar>
+            <w:vAlign w:val="top"/>
+          </w:tcPr>
+          <w:p>
+            <w:pPr>
+              <w:spacing w:after="40"/>
+            </w:pPr>
+            <w:r>
+              <w:rPr>
+                <w:rFonts w:ascii="Calibri" w:cs="Calibri" w:eastAsia="Calibri" w:hAnsi="Calibri"/>
+                <w:color w:val="14213D"/>
+                <w:sz w:val="19"/>
+                <w:szCs w:val="19"/>
+              </w:rPr>
+              <w:t xml:space="preserve">Cause : l'ancien bouton « ➕ Accueil chantier (séance) » créait un deuxième document obligatoire pour tous ; ta signature du parcours allait dans l'accueil permanent, la séance restait « à signer ». Désormais UN seul accueil chantier par chantier (bloc « Accueil chantier » de l'onglet QSE), les boutons « séance » et « quart d'heure » à l'ancienne sont retirés ; les anciennes séances restent dans « Historique » et renvoient vers l'accueil permanent.</w:t>
+            </w:r>
+          </w:p>
+        </w:tc>
+        <w:tc>
+          <w:tcPr>
+            <w:tcW w:type="dxa" w:w="3700"/>
+            <w:tcBorders>
+              <w:top w:val="single" w:color="D9D5CB" w:sz="4"/>
+              <w:left w:val="single" w:color="D9D5CB" w:sz="4"/>
+              <w:bottom w:val="single" w:color="D9D5CB" w:sz="4"/>
+              <w:right w:val="single" w:color="D9D5CB" w:sz="4"/>
+            </w:tcBorders>
+            <w:tcMar>
+              <w:top w:type="dxa" w:w="60"/>
+              <w:left w:type="dxa" w:w="90"/>
+              <w:bottom w:type="dxa" w:w="60"/>
+              <w:right w:type="dxa" w:w="90"/>
+            </w:tcMar>
+            <w:vAlign w:val="top"/>
+          </w:tcPr>
+          <w:p>
+            <w:pPr>
+              <w:spacing w:after="40"/>
+            </w:pPr>
+            <w:r>
+              <w:rPr>
+                <w:rFonts w:ascii="Calibri" w:cs="Calibri" w:eastAsia="Calibri" w:hAnsi="Calibri"/>
+                <w:color w:val="14213D"/>
+                <w:sz w:val="19"/>
+                <w:szCs w:val="19"/>
+              </w:rPr>
+              <w:t xml:space="preserve">Les émargements déjà faits (anciennes séances) comptent : la personne n'est pas redemandée.</w:t>
+            </w:r>
+          </w:p>
+        </w:tc>
+        <w:tc>
+          <w:tcPr>
+            <w:tcW w:type="dxa" w:w="1300"/>
+            <w:tcBorders>
+              <w:top w:val="single" w:color="D9D5CB" w:sz="4"/>
+              <w:left w:val="single" w:color="D9D5CB" w:sz="4"/>
+              <w:bottom w:val="single" w:color="D9D5CB" w:sz="4"/>
+              <w:right w:val="single" w:color="D9D5CB" w:sz="4"/>
+            </w:tcBorders>
+            <w:shd w:fill="FFF4EE" w:color="auto" w:val="clear"/>
+            <w:tcMar>
+              <w:top w:type="dxa" w:w="60"/>
+              <w:left w:type="dxa" w:w="90"/>
+              <w:bottom w:type="dxa" w:w="60"/>
+              <w:right w:type="dxa" w:w="90"/>
+            </w:tcMar>
+            <w:vAlign w:val="top"/>
+          </w:tcPr>
+          <w:p>
+            <w:pPr>
+              <w:spacing w:after="40"/>
+            </w:pPr>
+            <w:r>
+              <w:rPr>
+                <w:rFonts w:ascii="Calibri" w:cs="Calibri" w:eastAsia="Calibri" w:hAnsi="Calibri"/>
+                <w:b/>
+                <w:bCs/>
+                <w:color w:val="14213D"/>
+                <w:sz w:val="19"/>
+                <w:szCs w:val="19"/>
+              </w:rPr>
+              <w:t xml:space="preserve">Corrigé</w:t>
+            </w:r>
+          </w:p>
+        </w:tc>
+        <w:tc>
+          <w:tcPr>
+            <w:tcW w:type="dxa" w:w="3700"/>
+            <w:tcBorders>
+              <w:top w:val="single" w:color="D9D5CB" w:sz="4"/>
+              <w:left w:val="single" w:color="D9D5CB" w:sz="4"/>
+              <w:bottom w:val="single" w:color="D9D5CB" w:sz="4"/>
+              <w:right w:val="single" w:color="D9D5CB" w:sz="4"/>
+            </w:tcBorders>
+            <w:tcMar>
+              <w:top w:type="dxa" w:w="60"/>
+              <w:left w:type="dxa" w:w="90"/>
+              <w:bottom w:type="dxa" w:w="60"/>
+              <w:right w:type="dxa" w:w="90"/>
+            </w:tcMar>
+            <w:vAlign w:val="top"/>
+          </w:tcPr>
+          <w:p>
+            <w:pPr>
+              <w:spacing w:after="40"/>
+            </w:pPr>
+            <w:r>
+              <w:rPr>
+                <w:rFonts w:ascii="Calibri" w:cs="Calibri" w:eastAsia="Calibri" w:hAnsi="Calibri"/>
+                <w:color w:val="14213D"/>
+                <w:sz w:val="20"/>
+                <w:szCs w:val="20"/>
+              </w:rPr>
+              <w:t xml:space="preserve"/>
+            </w:r>
+          </w:p>
+          <w:p>
+            <w:pPr>
+              <w:spacing w:after="40"/>
+            </w:pPr>
+            <w:r>
+              <w:rPr>
+                <w:rFonts w:ascii="Calibri" w:cs="Calibri" w:eastAsia="Calibri" w:hAnsi="Calibri"/>
+                <w:color w:val="14213D"/>
+                <w:sz w:val="20"/>
+                <w:szCs w:val="20"/>
+              </w:rPr>
+              <w:t xml:space="preserve"/>
+            </w:r>
+          </w:p>
+        </w:tc>
+      </w:tr>
+      <w:tr>
+        <w:tc>
+          <w:tcPr>
+            <w:tcW w:type="dxa" w:w="2300"/>
+            <w:tcBorders>
+              <w:top w:val="single" w:color="D9D5CB" w:sz="4"/>
+              <w:left w:val="single" w:color="D9D5CB" w:sz="4"/>
+              <w:bottom w:val="single" w:color="D9D5CB" w:sz="4"/>
+              <w:right w:val="single" w:color="D9D5CB" w:sz="4"/>
+            </w:tcBorders>
+            <w:tcMar>
+              <w:top w:type="dxa" w:w="60"/>
+              <w:left w:type="dxa" w:w="90"/>
+              <w:bottom w:type="dxa" w:w="60"/>
+              <w:right w:type="dxa" w:w="90"/>
+            </w:tcMar>
+            <w:vAlign w:val="top"/>
+          </w:tcPr>
+          <w:p>
+            <w:pPr>
+              <w:spacing w:after="40"/>
+            </w:pPr>
+            <w:r>
+              <w:rPr>
+                <w:rFonts w:ascii="Calibri" w:cs="Calibri" w:eastAsia="Calibri" w:hAnsi="Calibri"/>
+                <w:b/>
+                <w:bCs/>
+                <w:color w:val="14213D"/>
+                <w:sz w:val="20"/>
+                <w:szCs w:val="20"/>
+              </w:rPr>
+              <w:t xml:space="preserve">PPSPS deux fois (début et point 4)</w:t>
+            </w:r>
+          </w:p>
+        </w:tc>
+        <w:tc>
+          <w:tcPr>
+            <w:tcW w:type="dxa" w:w="4100"/>
+            <w:tcBorders>
+              <w:top w:val="single" w:color="D9D5CB" w:sz="4"/>
+              <w:left w:val="single" w:color="D9D5CB" w:sz="4"/>
+              <w:bottom w:val="single" w:color="D9D5CB" w:sz="4"/>
+              <w:right w:val="single" w:color="D9D5CB" w:sz="4"/>
+            </w:tcBorders>
+            <w:tcMar>
+              <w:top w:type="dxa" w:w="60"/>
+              <w:left w:type="dxa" w:w="90"/>
+              <w:bottom w:type="dxa" w:w="60"/>
+              <w:right w:type="dxa" w:w="90"/>
+            </w:tcMar>
+            <w:vAlign w:val="top"/>
+          </w:tcPr>
+          <w:p>
+            <w:pPr>
+              <w:spacing w:after="40"/>
+            </w:pPr>
+            <w:r>
+              <w:rPr>
+                <w:rFonts w:ascii="Calibri" w:cs="Calibri" w:eastAsia="Calibri" w:hAnsi="Calibri"/>
+                <w:color w:val="14213D"/>
+                <w:sz w:val="19"/>
+                <w:szCs w:val="19"/>
+              </w:rPr>
+              <w:t xml:space="preserve">Point 4 = juste le lien vers la DICT. Les modules « réseaux » et « tranchées » restent proposés au point 4 mais ne bloquent plus (« pour aller plus loin »).</w:t>
+            </w:r>
+          </w:p>
+        </w:tc>
+        <w:tc>
+          <w:tcPr>
+            <w:tcW w:type="dxa" w:w="3700"/>
+            <w:tcBorders>
+              <w:top w:val="single" w:color="D9D5CB" w:sz="4"/>
+              <w:left w:val="single" w:color="D9D5CB" w:sz="4"/>
+              <w:bottom w:val="single" w:color="D9D5CB" w:sz="4"/>
+              <w:right w:val="single" w:color="D9D5CB" w:sz="4"/>
+            </w:tcBorders>
+            <w:tcMar>
+              <w:top w:type="dxa" w:w="60"/>
+              <w:left w:type="dxa" w:w="90"/>
+              <w:bottom w:type="dxa" w:w="60"/>
+              <w:right w:type="dxa" w:w="90"/>
+            </w:tcMar>
+            <w:vAlign w:val="top"/>
+          </w:tcPr>
+          <w:p>
+            <w:pPr>
+              <w:spacing w:after="40"/>
+            </w:pPr>
+            <w:r>
+              <w:rPr>
+                <w:rFonts w:ascii="Calibri" w:cs="Calibri" w:eastAsia="Calibri" w:hAnsi="Calibri"/>
+                <w:color w:val="14213D"/>
+                <w:sz w:val="19"/>
+                <w:szCs w:val="19"/>
+              </w:rPr>
+              <w:t xml:space="preserve"/>
+            </w:r>
+          </w:p>
+        </w:tc>
+        <w:tc>
+          <w:tcPr>
+            <w:tcW w:type="dxa" w:w="1300"/>
+            <w:tcBorders>
+              <w:top w:val="single" w:color="D9D5CB" w:sz="4"/>
+              <w:left w:val="single" w:color="D9D5CB" w:sz="4"/>
+              <w:bottom w:val="single" w:color="D9D5CB" w:sz="4"/>
+              <w:right w:val="single" w:color="D9D5CB" w:sz="4"/>
+            </w:tcBorders>
+            <w:shd w:fill="FFF4EE" w:color="auto" w:val="clear"/>
+            <w:tcMar>
+              <w:top w:type="dxa" w:w="60"/>
+              <w:left w:type="dxa" w:w="90"/>
+              <w:bottom w:type="dxa" w:w="60"/>
+              <w:right w:type="dxa" w:w="90"/>
+            </w:tcMar>
+            <w:vAlign w:val="top"/>
+          </w:tcPr>
+          <w:p>
+            <w:pPr>
+              <w:spacing w:after="40"/>
+            </w:pPr>
+            <w:r>
+              <w:rPr>
+                <w:rFonts w:ascii="Calibri" w:cs="Calibri" w:eastAsia="Calibri" w:hAnsi="Calibri"/>
+                <w:b/>
+                <w:bCs/>
+                <w:color w:val="14213D"/>
+                <w:sz w:val="19"/>
+                <w:szCs w:val="19"/>
+              </w:rPr>
+              <w:t xml:space="preserve">Corrigé</w:t>
+            </w:r>
+          </w:p>
+        </w:tc>
+        <w:tc>
+          <w:tcPr>
+            <w:tcW w:type="dxa" w:w="3700"/>
+            <w:tcBorders>
+              <w:top w:val="single" w:color="D9D5CB" w:sz="4"/>
+              <w:left w:val="single" w:color="D9D5CB" w:sz="4"/>
+              <w:bottom w:val="single" w:color="D9D5CB" w:sz="4"/>
+              <w:right w:val="single" w:color="D9D5CB" w:sz="4"/>
+            </w:tcBorders>
+            <w:tcMar>
+              <w:top w:type="dxa" w:w="60"/>
+              <w:left w:type="dxa" w:w="90"/>
+              <w:bottom w:type="dxa" w:w="60"/>
+              <w:right w:type="dxa" w:w="90"/>
+            </w:tcMar>
+            <w:vAlign w:val="top"/>
+          </w:tcPr>
+          <w:p>
+            <w:pPr>
+              <w:spacing w:after="40"/>
+            </w:pPr>
+            <w:r>
+              <w:rPr>
+                <w:rFonts w:ascii="Calibri" w:cs="Calibri" w:eastAsia="Calibri" w:hAnsi="Calibri"/>
+                <w:color w:val="14213D"/>
+                <w:sz w:val="20"/>
+                <w:szCs w:val="20"/>
+              </w:rPr>
+              <w:t xml:space="preserve"/>
+            </w:r>
+          </w:p>
+          <w:p>
+            <w:pPr>
+              <w:spacing w:after="40"/>
+            </w:pPr>
+            <w:r>
+              <w:rPr>
+                <w:rFonts w:ascii="Calibri" w:cs="Calibri" w:eastAsia="Calibri" w:hAnsi="Calibri"/>
+                <w:color w:val="14213D"/>
+                <w:sz w:val="20"/>
+                <w:szCs w:val="20"/>
+              </w:rPr>
+              <w:t xml:space="preserve"/>
+            </w:r>
+          </w:p>
+        </w:tc>
+      </w:tr>
+      <w:tr>
+        <w:tc>
+          <w:tcPr>
+            <w:tcW w:type="dxa" w:w="2300"/>
+            <w:tcBorders>
+              <w:top w:val="single" w:color="D9D5CB" w:sz="4"/>
+              <w:left w:val="single" w:color="D9D5CB" w:sz="4"/>
+              <w:bottom w:val="single" w:color="D9D5CB" w:sz="4"/>
+              <w:right w:val="single" w:color="D9D5CB" w:sz="4"/>
+            </w:tcBorders>
+            <w:tcMar>
+              <w:top w:type="dxa" w:w="60"/>
+              <w:left w:type="dxa" w:w="90"/>
+              <w:bottom w:type="dxa" w:w="60"/>
+              <w:right w:type="dxa" w:w="90"/>
+            </w:tcMar>
+            <w:vAlign w:val="top"/>
+          </w:tcPr>
+          <w:p>
+            <w:pPr>
+              <w:spacing w:after="40"/>
+            </w:pPr>
+            <w:r>
+              <w:rPr>
+                <w:rFonts w:ascii="Calibri" w:cs="Calibri" w:eastAsia="Calibri" w:hAnsi="Calibri"/>
+                <w:b/>
+                <w:bCs/>
+                <w:color w:val="14213D"/>
+                <w:sz w:val="20"/>
+                <w:szCs w:val="20"/>
+              </w:rPr>
+              <w:t xml:space="preserve">Où sont les 10 émargements ?</w:t>
+            </w:r>
+          </w:p>
+        </w:tc>
+        <w:tc>
+          <w:tcPr>
+            <w:tcW w:type="dxa" w:w="4100"/>
+            <w:tcBorders>
+              <w:top w:val="single" w:color="D9D5CB" w:sz="4"/>
+              <w:left w:val="single" w:color="D9D5CB" w:sz="4"/>
+              <w:bottom w:val="single" w:color="D9D5CB" w:sz="4"/>
+              <w:right w:val="single" w:color="D9D5CB" w:sz="4"/>
+            </w:tcBorders>
+            <w:tcMar>
+              <w:top w:type="dxa" w:w="60"/>
+              <w:left w:type="dxa" w:w="90"/>
+              <w:bottom w:type="dxa" w:w="60"/>
+              <w:right w:type="dxa" w:w="90"/>
+            </w:tcMar>
+            <w:vAlign w:val="top"/>
+          </w:tcPr>
+          <w:p>
+            <w:pPr>
+              <w:spacing w:after="40"/>
+            </w:pPr>
+            <w:r>
+              <w:rPr>
+                <w:rFonts w:ascii="Calibri" w:cs="Calibri" w:eastAsia="Calibri" w:hAnsi="Calibri"/>
+                <w:color w:val="14213D"/>
+                <w:sz w:val="19"/>
+                <w:szCs w:val="19"/>
+              </w:rPr>
+              <w:t xml:space="preserve">Onglet QSE du chantier → bloc « Accueil chantier — &lt;chantier&gt; » (permanent) : la liste de tout le monde qui a signé (nom, date, « accueilli par » si sans compte, bouton « fiche » par personne), bouton « Feuille d'émargement » (tous les noms, signatures).</w:t>
+            </w:r>
+          </w:p>
+        </w:tc>
+        <w:tc>
+          <w:tcPr>
+            <w:tcW w:type="dxa" w:w="3700"/>
+            <w:tcBorders>
+              <w:top w:val="single" w:color="D9D5CB" w:sz="4"/>
+              <w:left w:val="single" w:color="D9D5CB" w:sz="4"/>
+              <w:bottom w:val="single" w:color="D9D5CB" w:sz="4"/>
+              <w:right w:val="single" w:color="D9D5CB" w:sz="4"/>
+            </w:tcBorders>
+            <w:tcMar>
+              <w:top w:type="dxa" w:w="60"/>
+              <w:left w:type="dxa" w:w="90"/>
+              <w:bottom w:type="dxa" w:w="60"/>
+              <w:right w:type="dxa" w:w="90"/>
+            </w:tcMar>
+            <w:vAlign w:val="top"/>
+          </w:tcPr>
+          <w:p>
+            <w:pPr>
+              <w:spacing w:after="40"/>
+            </w:pPr>
+            <w:r>
+              <w:rPr>
+                <w:rFonts w:ascii="Calibri" w:cs="Calibri" w:eastAsia="Calibri" w:hAnsi="Calibri"/>
+                <w:color w:val="14213D"/>
+                <w:sz w:val="19"/>
+                <w:szCs w:val="19"/>
+              </w:rPr>
+              <w:t xml:space="preserve">Plus dans le Dossier administratif : c'est dans QSE, comme tu le demandais.</w:t>
+            </w:r>
+          </w:p>
+        </w:tc>
+        <w:tc>
+          <w:tcPr>
+            <w:tcW w:type="dxa" w:w="1300"/>
+            <w:tcBorders>
+              <w:top w:val="single" w:color="D9D5CB" w:sz="4"/>
+              <w:left w:val="single" w:color="D9D5CB" w:sz="4"/>
+              <w:bottom w:val="single" w:color="D9D5CB" w:sz="4"/>
+              <w:right w:val="single" w:color="D9D5CB" w:sz="4"/>
+            </w:tcBorders>
+            <w:shd w:fill="E6F5EC" w:color="auto" w:val="clear"/>
+            <w:tcMar>
+              <w:top w:type="dxa" w:w="60"/>
+              <w:left w:type="dxa" w:w="90"/>
+              <w:bottom w:type="dxa" w:w="60"/>
+              <w:right w:type="dxa" w:w="90"/>
+            </w:tcMar>
+            <w:vAlign w:val="top"/>
+          </w:tcPr>
+          <w:p>
+            <w:pPr>
+              <w:spacing w:after="40"/>
+            </w:pPr>
+            <w:r>
+              <w:rPr>
+                <w:rFonts w:ascii="Calibri" w:cs="Calibri" w:eastAsia="Calibri" w:hAnsi="Calibri"/>
+                <w:b/>
+                <w:bCs/>
+                <w:color w:val="14213D"/>
+                <w:sz w:val="19"/>
+                <w:szCs w:val="19"/>
+              </w:rPr>
+              <w:t xml:space="preserve">Fait</w:t>
+            </w:r>
+          </w:p>
+        </w:tc>
+        <w:tc>
+          <w:tcPr>
+            <w:tcW w:type="dxa" w:w="3700"/>
+            <w:tcBorders>
+              <w:top w:val="single" w:color="D9D5CB" w:sz="4"/>
+              <w:left w:val="single" w:color="D9D5CB" w:sz="4"/>
+              <w:bottom w:val="single" w:color="D9D5CB" w:sz="4"/>
+              <w:right w:val="single" w:color="D9D5CB" w:sz="4"/>
+            </w:tcBorders>
+            <w:tcMar>
+              <w:top w:type="dxa" w:w="60"/>
+              <w:left w:type="dxa" w:w="90"/>
+              <w:bottom w:type="dxa" w:w="60"/>
+              <w:right w:type="dxa" w:w="90"/>
+            </w:tcMar>
+            <w:vAlign w:val="top"/>
+          </w:tcPr>
+          <w:p>
+            <w:pPr>
+              <w:spacing w:after="40"/>
+            </w:pPr>
+            <w:r>
+              <w:rPr>
+                <w:rFonts w:ascii="Calibri" w:cs="Calibri" w:eastAsia="Calibri" w:hAnsi="Calibri"/>
+                <w:color w:val="14213D"/>
+                <w:sz w:val="20"/>
+                <w:szCs w:val="20"/>
+              </w:rPr>
+              <w:t xml:space="preserve"/>
+            </w:r>
+          </w:p>
+          <w:p>
+            <w:pPr>
+              <w:spacing w:after="40"/>
+            </w:pPr>
+            <w:r>
+              <w:rPr>
+                <w:rFonts w:ascii="Calibri" w:cs="Calibri" w:eastAsia="Calibri" w:hAnsi="Calibri"/>
+                <w:color w:val="14213D"/>
+                <w:sz w:val="20"/>
+                <w:szCs w:val="20"/>
+              </w:rPr>
+              <w:t xml:space="preserve"/>
+            </w:r>
+          </w:p>
+        </w:tc>
+      </w:tr>
+      <w:tr>
+        <w:tc>
+          <w:tcPr>
+            <w:tcW w:type="dxa" w:w="2300"/>
+            <w:tcBorders>
+              <w:top w:val="single" w:color="D9D5CB" w:sz="4"/>
+              <w:left w:val="single" w:color="D9D5CB" w:sz="4"/>
+              <w:bottom w:val="single" w:color="D9D5CB" w:sz="4"/>
+              <w:right w:val="single" w:color="D9D5CB" w:sz="4"/>
+            </w:tcBorders>
+            <w:tcMar>
+              <w:top w:type="dxa" w:w="60"/>
+              <w:left w:type="dxa" w:w="90"/>
+              <w:bottom w:type="dxa" w:w="60"/>
+              <w:right w:type="dxa" w:w="90"/>
+            </w:tcMar>
+            <w:vAlign w:val="top"/>
+          </w:tcPr>
+          <w:p>
+            <w:pPr>
+              <w:spacing w:after="40"/>
+            </w:pPr>
+            <w:r>
+              <w:rPr>
+                <w:rFonts w:ascii="Calibri" w:cs="Calibri" w:eastAsia="Calibri" w:hAnsi="Calibri"/>
+                <w:b/>
+                <w:bCs/>
+                <w:color w:val="14213D"/>
+                <w:sz w:val="20"/>
+                <w:szCs w:val="20"/>
+              </w:rPr>
+              <w:t xml:space="preserve">Accueillir quelqu'un sans compte</w:t>
+            </w:r>
+          </w:p>
+        </w:tc>
+        <w:tc>
+          <w:tcPr>
+            <w:tcW w:type="dxa" w:w="4100"/>
+            <w:tcBorders>
+              <w:top w:val="single" w:color="D9D5CB" w:sz="4"/>
+              <w:left w:val="single" w:color="D9D5CB" w:sz="4"/>
+              <w:bottom w:val="single" w:color="D9D5CB" w:sz="4"/>
+              <w:right w:val="single" w:color="D9D5CB" w:sz="4"/>
+            </w:tcBorders>
+            <w:tcMar>
+              <w:top w:type="dxa" w:w="60"/>
+              <w:left w:type="dxa" w:w="90"/>
+              <w:bottom w:type="dxa" w:w="60"/>
+              <w:right w:type="dxa" w:w="90"/>
+            </w:tcMar>
+            <w:vAlign w:val="top"/>
+          </w:tcPr>
+          <w:p>
+            <w:pPr>
+              <w:spacing w:after="40"/>
+            </w:pPr>
+            <w:r>
+              <w:rPr>
+                <w:rFonts w:ascii="Calibri" w:cs="Calibri" w:eastAsia="Calibri" w:hAnsi="Calibri"/>
+                <w:color w:val="14213D"/>
+                <w:sz w:val="19"/>
+                <w:szCs w:val="19"/>
+              </w:rPr>
+              <w:t xml:space="preserve">Même bloc → « 👤 Accueillir quelqu'un sans compte » (chef de chantier, conducteur) : nom (+ entreprise / agence d'intérim) → le même parcours sur ta tablette, la personne signe au doigt ; fiche d'accueil « accueilli par Ethan L. ».</w:t>
+            </w:r>
+          </w:p>
+        </w:tc>
+        <w:tc>
+          <w:tcPr>
+            <w:tcW w:type="dxa" w:w="3700"/>
+            <w:tcBorders>
+              <w:top w:val="single" w:color="D9D5CB" w:sz="4"/>
+              <w:left w:val="single" w:color="D9D5CB" w:sz="4"/>
+              <w:bottom w:val="single" w:color="D9D5CB" w:sz="4"/>
+              <w:right w:val="single" w:color="D9D5CB" w:sz="4"/>
+            </w:tcBorders>
+            <w:tcMar>
+              <w:top w:type="dxa" w:w="60"/>
+              <w:left w:type="dxa" w:w="90"/>
+              <w:bottom w:type="dxa" w:w="60"/>
+              <w:right w:type="dxa" w:w="90"/>
+            </w:tcMar>
+            <w:vAlign w:val="top"/>
+          </w:tcPr>
+          <w:p>
+            <w:pPr>
+              <w:spacing w:after="40"/>
+            </w:pPr>
+            <w:r>
+              <w:rPr>
+                <w:rFonts w:ascii="Calibri" w:cs="Calibri" w:eastAsia="Calibri" w:hAnsi="Calibri"/>
+                <w:color w:val="14213D"/>
+                <w:sz w:val="19"/>
+                <w:szCs w:val="19"/>
+              </w:rPr>
+              <w:t xml:space="preserve"/>
+            </w:r>
+          </w:p>
+        </w:tc>
+        <w:tc>
+          <w:tcPr>
+            <w:tcW w:type="dxa" w:w="1300"/>
+            <w:tcBorders>
+              <w:top w:val="single" w:color="D9D5CB" w:sz="4"/>
+              <w:left w:val="single" w:color="D9D5CB" w:sz="4"/>
+              <w:bottom w:val="single" w:color="D9D5CB" w:sz="4"/>
+              <w:right w:val="single" w:color="D9D5CB" w:sz="4"/>
+            </w:tcBorders>
+            <w:shd w:fill="E6F5EC" w:color="auto" w:val="clear"/>
+            <w:tcMar>
+              <w:top w:type="dxa" w:w="60"/>
+              <w:left w:type="dxa" w:w="90"/>
+              <w:bottom w:type="dxa" w:w="60"/>
+              <w:right w:type="dxa" w:w="90"/>
+            </w:tcMar>
+            <w:vAlign w:val="top"/>
+          </w:tcPr>
+          <w:p>
+            <w:pPr>
+              <w:spacing w:after="40"/>
+            </w:pPr>
+            <w:r>
+              <w:rPr>
+                <w:rFonts w:ascii="Calibri" w:cs="Calibri" w:eastAsia="Calibri" w:hAnsi="Calibri"/>
+                <w:b/>
+                <w:bCs/>
+                <w:color w:val="14213D"/>
+                <w:sz w:val="19"/>
+                <w:szCs w:val="19"/>
+              </w:rPr>
+              <w:t xml:space="preserve">Fait</w:t>
+            </w:r>
+          </w:p>
+        </w:tc>
+        <w:tc>
+          <w:tcPr>
+            <w:tcW w:type="dxa" w:w="3700"/>
+            <w:tcBorders>
+              <w:top w:val="single" w:color="D9D5CB" w:sz="4"/>
+              <w:left w:val="single" w:color="D9D5CB" w:sz="4"/>
+              <w:bottom w:val="single" w:color="D9D5CB" w:sz="4"/>
+              <w:right w:val="single" w:color="D9D5CB" w:sz="4"/>
+            </w:tcBorders>
+            <w:tcMar>
+              <w:top w:type="dxa" w:w="60"/>
+              <w:left w:type="dxa" w:w="90"/>
+              <w:bottom w:type="dxa" w:w="60"/>
+              <w:right w:type="dxa" w:w="90"/>
+            </w:tcMar>
+            <w:vAlign w:val="top"/>
+          </w:tcPr>
+          <w:p>
+            <w:pPr>
+              <w:spacing w:after="40"/>
+            </w:pPr>
+            <w:r>
+              <w:rPr>
+                <w:rFonts w:ascii="Calibri" w:cs="Calibri" w:eastAsia="Calibri" w:hAnsi="Calibri"/>
+                <w:color w:val="14213D"/>
+                <w:sz w:val="20"/>
+                <w:szCs w:val="20"/>
+              </w:rPr>
+              <w:t xml:space="preserve"/>
+            </w:r>
+          </w:p>
+          <w:p>
+            <w:pPr>
+              <w:spacing w:after="40"/>
+            </w:pPr>
+            <w:r>
+              <w:rPr>
+                <w:rFonts w:ascii="Calibri" w:cs="Calibri" w:eastAsia="Calibri" w:hAnsi="Calibri"/>
+                <w:color w:val="14213D"/>
+                <w:sz w:val="20"/>
+                <w:szCs w:val="20"/>
+              </w:rPr>
+              <w:t xml:space="preserve"/>
+            </w:r>
+          </w:p>
+        </w:tc>
+      </w:tr>
+      <w:tr>
+        <w:tc>
+          <w:tcPr>
+            <w:tcW w:type="dxa" w:w="2300"/>
+            <w:tcBorders>
+              <w:top w:val="single" w:color="D9D5CB" w:sz="4"/>
+              <w:left w:val="single" w:color="D9D5CB" w:sz="4"/>
+              <w:bottom w:val="single" w:color="D9D5CB" w:sz="4"/>
+              <w:right w:val="single" w:color="D9D5CB" w:sz="4"/>
+            </w:tcBorders>
+            <w:tcMar>
+              <w:top w:type="dxa" w:w="60"/>
+              <w:left w:type="dxa" w:w="90"/>
+              <w:bottom w:type="dxa" w:w="60"/>
+              <w:right w:type="dxa" w:w="90"/>
+            </w:tcMar>
+            <w:vAlign w:val="top"/>
+          </w:tcPr>
+          <w:p>
+            <w:pPr>
+              <w:spacing w:after="40"/>
+            </w:pPr>
+            <w:r>
+              <w:rPr>
+                <w:rFonts w:ascii="Calibri" w:cs="Calibri" w:eastAsia="Calibri" w:hAnsi="Calibri"/>
+                <w:b/>
+                <w:bCs/>
+                <w:color w:val="14213D"/>
+                <w:sz w:val="20"/>
+                <w:szCs w:val="20"/>
+              </w:rPr>
+              <w:t xml:space="preserve">Quart d'heure sécurité dématérialisé</w:t>
+            </w:r>
+          </w:p>
+        </w:tc>
+        <w:tc>
+          <w:tcPr>
+            <w:tcW w:type="dxa" w:w="4100"/>
+            <w:tcBorders>
+              <w:top w:val="single" w:color="D9D5CB" w:sz="4"/>
+              <w:left w:val="single" w:color="D9D5CB" w:sz="4"/>
+              <w:bottom w:val="single" w:color="D9D5CB" w:sz="4"/>
+              <w:right w:val="single" w:color="D9D5CB" w:sz="4"/>
+            </w:tcBorders>
+            <w:tcMar>
+              <w:top w:type="dxa" w:w="60"/>
+              <w:left w:type="dxa" w:w="90"/>
+              <w:bottom w:type="dxa" w:w="60"/>
+              <w:right w:type="dxa" w:w="90"/>
+            </w:tcMar>
+            <w:vAlign w:val="top"/>
+          </w:tcPr>
+          <w:p>
+            <w:pPr>
+              <w:spacing w:after="40"/>
+            </w:pPr>
+            <w:r>
+              <w:rPr>
+                <w:rFonts w:ascii="Calibri" w:cs="Calibri" w:eastAsia="Calibri" w:hAnsi="Calibri"/>
+                <w:color w:val="14213D"/>
+                <w:sz w:val="19"/>
+                <w:szCs w:val="19"/>
+              </w:rPr>
+              <w:t xml:space="preserve">Exploitation → « Quart d'heure sécurité » → « Déclencher » : sujet, date, ce chantier / mes chantiers / tous. Chaque personne placée ce jour-là (chefs de chantier compris) a la notification « Quart d'heure sécurité à faire » sur son accueil et dans le Bureau : sujet à dérouler en entier → 3 points à confirmer → signature. Onglet QSE : bloc « Quart d'heure sécurité du jour » (participations, faire participer quelqu'un sans compte, feuille, annuler). Suivi des déclenchements dans Exploitation.</w:t>
+            </w:r>
+          </w:p>
+        </w:tc>
+        <w:tc>
+          <w:tcPr>
+            <w:tcW w:type="dxa" w:w="3700"/>
+            <w:tcBorders>
+              <w:top w:val="single" w:color="D9D5CB" w:sz="4"/>
+              <w:left w:val="single" w:color="D9D5CB" w:sz="4"/>
+              <w:bottom w:val="single" w:color="D9D5CB" w:sz="4"/>
+              <w:right w:val="single" w:color="D9D5CB" w:sz="4"/>
+            </w:tcBorders>
+            <w:tcMar>
+              <w:top w:type="dxa" w:w="60"/>
+              <w:left w:type="dxa" w:w="90"/>
+              <w:bottom w:type="dxa" w:w="60"/>
+              <w:right w:type="dxa" w:w="90"/>
+            </w:tcMar>
+            <w:vAlign w:val="top"/>
+          </w:tcPr>
+          <w:p>
+            <w:pPr>
+              <w:spacing w:after="40"/>
+            </w:pPr>
+            <w:r>
+              <w:rPr>
+                <w:rFonts w:ascii="Calibri" w:cs="Calibri" w:eastAsia="Calibri" w:hAnsi="Calibri"/>
+                <w:color w:val="14213D"/>
+                <w:sz w:val="19"/>
+                <w:szCs w:val="19"/>
+              </w:rPr>
+              <w:t xml:space="preserve">3 sujets d'EXEMPLE écrits par moi (réseaux enterrés, points chauds, levage des tubes) en attendant ta base de quarts d'heure : donne-la-moi, je l'importe (titre, texte, 3 questions par sujet). SQL retours_10-10.sql à passer.</w:t>
+            </w:r>
+          </w:p>
+        </w:tc>
+        <w:tc>
+          <w:tcPr>
+            <w:tcW w:type="dxa" w:w="1300"/>
+            <w:tcBorders>
+              <w:top w:val="single" w:color="D9D5CB" w:sz="4"/>
+              <w:left w:val="single" w:color="D9D5CB" w:sz="4"/>
+              <w:bottom w:val="single" w:color="D9D5CB" w:sz="4"/>
+              <w:right w:val="single" w:color="D9D5CB" w:sz="4"/>
+            </w:tcBorders>
+            <w:shd w:fill="E6F5EC" w:color="auto" w:val="clear"/>
+            <w:tcMar>
+              <w:top w:type="dxa" w:w="60"/>
+              <w:left w:type="dxa" w:w="90"/>
+              <w:bottom w:type="dxa" w:w="60"/>
+              <w:right w:type="dxa" w:w="90"/>
+            </w:tcMar>
+            <w:vAlign w:val="top"/>
+          </w:tcPr>
+          <w:p>
+            <w:pPr>
+              <w:spacing w:after="40"/>
+            </w:pPr>
+            <w:r>
+              <w:rPr>
+                <w:rFonts w:ascii="Calibri" w:cs="Calibri" w:eastAsia="Calibri" w:hAnsi="Calibri"/>
+                <w:b/>
+                <w:bCs/>
+                <w:color w:val="14213D"/>
+                <w:sz w:val="19"/>
+                <w:szCs w:val="19"/>
+              </w:rPr>
+              <w:t xml:space="preserve">Fait (sujets d'exemple)</w:t>
+            </w:r>
+          </w:p>
+        </w:tc>
+        <w:tc>
+          <w:tcPr>
+            <w:tcW w:type="dxa" w:w="3700"/>
+            <w:tcBorders>
+              <w:top w:val="single" w:color="D9D5CB" w:sz="4"/>
+              <w:left w:val="single" w:color="D9D5CB" w:sz="4"/>
+              <w:bottom w:val="single" w:color="D9D5CB" w:sz="4"/>
+              <w:right w:val="single" w:color="D9D5CB" w:sz="4"/>
+            </w:tcBorders>
+            <w:tcMar>
+              <w:top w:type="dxa" w:w="60"/>
+              <w:left w:type="dxa" w:w="90"/>
+              <w:bottom w:type="dxa" w:w="60"/>
+              <w:right w:type="dxa" w:w="90"/>
+            </w:tcMar>
+            <w:vAlign w:val="top"/>
+          </w:tcPr>
+          <w:p>
+            <w:pPr>
+              <w:spacing w:after="40"/>
+            </w:pPr>
+            <w:r>
+              <w:rPr>
+                <w:rFonts w:ascii="Calibri" w:cs="Calibri" w:eastAsia="Calibri" w:hAnsi="Calibri"/>
+                <w:color w:val="14213D"/>
+                <w:sz w:val="20"/>
+                <w:szCs w:val="20"/>
+              </w:rPr>
+              <w:t xml:space="preserve"/>
+            </w:r>
+          </w:p>
+          <w:p>
+            <w:pPr>
+              <w:spacing w:after="40"/>
+            </w:pPr>
+            <w:r>
+              <w:rPr>
+                <w:rFonts w:ascii="Calibri" w:cs="Calibri" w:eastAsia="Calibri" w:hAnsi="Calibri"/>
+                <w:color w:val="14213D"/>
+                <w:sz w:val="20"/>
+                <w:szCs w:val="20"/>
+              </w:rPr>
+              <w:t xml:space="preserve"/>
+            </w:r>
+          </w:p>
+        </w:tc>
+      </w:tr>
+      <w:tr>
+        <w:tc>
+          <w:tcPr>
+            <w:tcW w:type="dxa" w:w="2300"/>
+            <w:tcBorders>
+              <w:top w:val="single" w:color="D9D5CB" w:sz="4"/>
+              <w:left w:val="single" w:color="D9D5CB" w:sz="4"/>
+              <w:bottom w:val="single" w:color="D9D5CB" w:sz="4"/>
+              <w:right w:val="single" w:color="D9D5CB" w:sz="4"/>
+            </w:tcBorders>
+            <w:tcMar>
+              <w:top w:type="dxa" w:w="60"/>
+              <w:left w:type="dxa" w:w="90"/>
+              <w:bottom w:type="dxa" w:w="60"/>
+              <w:right w:type="dxa" w:w="90"/>
+            </w:tcMar>
+            <w:vAlign w:val="top"/>
+          </w:tcPr>
+          <w:p>
+            <w:pPr>
+              <w:spacing w:after="40"/>
+            </w:pPr>
+            <w:r>
+              <w:rPr>
+                <w:rFonts w:ascii="Calibri" w:cs="Calibri" w:eastAsia="Calibri" w:hAnsi="Calibri"/>
+                <w:b/>
+                <w:bCs/>
+                <w:color w:val="14213D"/>
+                <w:sz w:val="20"/>
+                <w:szCs w:val="20"/>
+              </w:rPr>
+              <w:t xml:space="preserve">Accueil réclamé à tout le monde sur St-Lô</w:t>
+            </w:r>
+          </w:p>
+        </w:tc>
+        <w:tc>
+          <w:tcPr>
+            <w:tcW w:type="dxa" w:w="4100"/>
+            <w:tcBorders>
+              <w:top w:val="single" w:color="D9D5CB" w:sz="4"/>
+              <w:left w:val="single" w:color="D9D5CB" w:sz="4"/>
+              <w:bottom w:val="single" w:color="D9D5CB" w:sz="4"/>
+              <w:right w:val="single" w:color="D9D5CB" w:sz="4"/>
+            </w:tcBorders>
+            <w:tcMar>
+              <w:top w:type="dxa" w:w="60"/>
+              <w:left w:type="dxa" w:w="90"/>
+              <w:bottom w:type="dxa" w:w="60"/>
+              <w:right w:type="dxa" w:w="90"/>
+            </w:tcMar>
+            <w:vAlign w:val="top"/>
+          </w:tcPr>
+          <w:p>
+            <w:pPr>
+              <w:spacing w:after="40"/>
+            </w:pPr>
+            <w:r>
+              <w:rPr>
+                <w:rFonts w:ascii="Calibri" w:cs="Calibri" w:eastAsia="Calibri" w:hAnsi="Calibri"/>
+                <w:color w:val="14213D"/>
+                <w:sz w:val="19"/>
+                <w:szCs w:val="19"/>
+              </w:rPr>
+              <w:t xml:space="preserve">Corrigé : l'accueil d'un chantier n'est demandé (notification, pastille QSE, Bureau) qu'aux personnes placées sur ce chantier au planning cette semaine, et jamais deux fois. Les autres peuvent le faire depuis l'onglet QSE (proposé, pas réclamé).</w:t>
+            </w:r>
+          </w:p>
+        </w:tc>
+        <w:tc>
+          <w:tcPr>
+            <w:tcW w:type="dxa" w:w="3700"/>
+            <w:tcBorders>
+              <w:top w:val="single" w:color="D9D5CB" w:sz="4"/>
+              <w:left w:val="single" w:color="D9D5CB" w:sz="4"/>
+              <w:bottom w:val="single" w:color="D9D5CB" w:sz="4"/>
+              <w:right w:val="single" w:color="D9D5CB" w:sz="4"/>
+            </w:tcBorders>
+            <w:tcMar>
+              <w:top w:type="dxa" w:w="60"/>
+              <w:left w:type="dxa" w:w="90"/>
+              <w:bottom w:type="dxa" w:w="60"/>
+              <w:right w:type="dxa" w:w="90"/>
+            </w:tcMar>
+            <w:vAlign w:val="top"/>
+          </w:tcPr>
+          <w:p>
+            <w:pPr>
+              <w:spacing w:after="40"/>
+            </w:pPr>
+            <w:r>
+              <w:rPr>
+                <w:rFonts w:ascii="Calibri" w:cs="Calibri" w:eastAsia="Calibri" w:hAnsi="Calibri"/>
+                <w:color w:val="14213D"/>
+                <w:sz w:val="19"/>
+                <w:szCs w:val="19"/>
+              </w:rPr>
+              <w:t xml:space="preserve">Ce que tu voyais venait de la « séance » créée par le bouton, obligatoire pour tous.</w:t>
+            </w:r>
+          </w:p>
+        </w:tc>
+        <w:tc>
+          <w:tcPr>
+            <w:tcW w:type="dxa" w:w="1300"/>
+            <w:tcBorders>
+              <w:top w:val="single" w:color="D9D5CB" w:sz="4"/>
+              <w:left w:val="single" w:color="D9D5CB" w:sz="4"/>
+              <w:bottom w:val="single" w:color="D9D5CB" w:sz="4"/>
+              <w:right w:val="single" w:color="D9D5CB" w:sz="4"/>
+            </w:tcBorders>
+            <w:shd w:fill="FFF4EE" w:color="auto" w:val="clear"/>
+            <w:tcMar>
+              <w:top w:type="dxa" w:w="60"/>
+              <w:left w:type="dxa" w:w="90"/>
+              <w:bottom w:type="dxa" w:w="60"/>
+              <w:right w:type="dxa" w:w="90"/>
+            </w:tcMar>
+            <w:vAlign w:val="top"/>
+          </w:tcPr>
+          <w:p>
+            <w:pPr>
+              <w:spacing w:after="40"/>
+            </w:pPr>
+            <w:r>
+              <w:rPr>
+                <w:rFonts w:ascii="Calibri" w:cs="Calibri" w:eastAsia="Calibri" w:hAnsi="Calibri"/>
+                <w:b/>
+                <w:bCs/>
+                <w:color w:val="14213D"/>
+                <w:sz w:val="19"/>
+                <w:szCs w:val="19"/>
+              </w:rPr>
+              <w:t xml:space="preserve">Corrigé</w:t>
+            </w:r>
+          </w:p>
+        </w:tc>
+        <w:tc>
+          <w:tcPr>
+            <w:tcW w:type="dxa" w:w="3700"/>
+            <w:tcBorders>
+              <w:top w:val="single" w:color="D9D5CB" w:sz="4"/>
+              <w:left w:val="single" w:color="D9D5CB" w:sz="4"/>
+              <w:bottom w:val="single" w:color="D9D5CB" w:sz="4"/>
+              <w:right w:val="single" w:color="D9D5CB" w:sz="4"/>
+            </w:tcBorders>
+            <w:tcMar>
+              <w:top w:type="dxa" w:w="60"/>
+              <w:left w:type="dxa" w:w="90"/>
+              <w:bottom w:type="dxa" w:w="60"/>
+              <w:right w:type="dxa" w:w="90"/>
+            </w:tcMar>
+            <w:vAlign w:val="top"/>
+          </w:tcPr>
+          <w:p>
+            <w:pPr>
+              <w:spacing w:after="40"/>
+            </w:pPr>
+            <w:r>
+              <w:rPr>
+                <w:rFonts w:ascii="Calibri" w:cs="Calibri" w:eastAsia="Calibri" w:hAnsi="Calibri"/>
+                <w:color w:val="14213D"/>
+                <w:sz w:val="20"/>
+                <w:szCs w:val="20"/>
+              </w:rPr>
+              <w:t xml:space="preserve"/>
+            </w:r>
+          </w:p>
+          <w:p>
+            <w:pPr>
+              <w:spacing w:after="40"/>
+            </w:pPr>
+            <w:r>
+              <w:rPr>
+                <w:rFonts w:ascii="Calibri" w:cs="Calibri" w:eastAsia="Calibri" w:hAnsi="Calibri"/>
+                <w:color w:val="14213D"/>
+                <w:sz w:val="20"/>
+                <w:szCs w:val="20"/>
+              </w:rPr>
+              <w:t xml:space="preserve"/>
+            </w:r>
+          </w:p>
+        </w:tc>
+      </w:tr>
+      <w:tr>
+        <w:tc>
+          <w:tcPr>
+            <w:tcW w:type="dxa" w:w="2300"/>
+            <w:tcBorders>
+              <w:top w:val="single" w:color="D9D5CB" w:sz="4"/>
+              <w:left w:val="single" w:color="D9D5CB" w:sz="4"/>
+              <w:bottom w:val="single" w:color="D9D5CB" w:sz="4"/>
+              <w:right w:val="single" w:color="D9D5CB" w:sz="4"/>
+            </w:tcBorders>
+            <w:tcMar>
+              <w:top w:type="dxa" w:w="60"/>
+              <w:left w:type="dxa" w:w="90"/>
+              <w:bottom w:type="dxa" w:w="60"/>
+              <w:right w:type="dxa" w:w="90"/>
+            </w:tcMar>
+            <w:vAlign w:val="top"/>
+          </w:tcPr>
+          <w:p>
+            <w:pPr>
+              <w:spacing w:after="40"/>
+            </w:pPr>
+            <w:r>
+              <w:rPr>
+                <w:rFonts w:ascii="Calibri" w:cs="Calibri" w:eastAsia="Calibri" w:hAnsi="Calibri"/>
+                <w:b/>
+                <w:bCs/>
+                <w:color w:val="14213D"/>
+                <w:sz w:val="20"/>
+                <w:szCs w:val="20"/>
+              </w:rPr>
+              <w:t xml:space="preserve">Contrôle chantier : photos, légende, qui était là</w:t>
+            </w:r>
+          </w:p>
+        </w:tc>
+        <w:tc>
+          <w:tcPr>
+            <w:tcW w:type="dxa" w:w="4100"/>
+            <w:tcBorders>
+              <w:top w:val="single" w:color="D9D5CB" w:sz="4"/>
+              <w:left w:val="single" w:color="D9D5CB" w:sz="4"/>
+              <w:bottom w:val="single" w:color="D9D5CB" w:sz="4"/>
+              <w:right w:val="single" w:color="D9D5CB" w:sz="4"/>
+            </w:tcBorders>
+            <w:tcMar>
+              <w:top w:type="dxa" w:w="60"/>
+              <w:left w:type="dxa" w:w="90"/>
+              <w:bottom w:type="dxa" w:w="60"/>
+              <w:right w:type="dxa" w:w="90"/>
+            </w:tcMar>
+            <w:vAlign w:val="top"/>
+          </w:tcPr>
+          <w:p>
+            <w:pPr>
+              <w:spacing w:after="40"/>
+            </w:pPr>
+            <w:r>
+              <w:rPr>
+                <w:rFonts w:ascii="Calibri" w:cs="Calibri" w:eastAsia="Calibri" w:hAnsi="Calibri"/>
+                <w:color w:val="14213D"/>
+                <w:sz w:val="19"/>
+                <w:szCs w:val="19"/>
+              </w:rPr>
+              <w:t xml:space="preserve">Onglet QSE → « 📋 Nouveau contrôle chantier » : légende C / NC / NA / NV en couleurs ; chef de chantier et conducteur de la fiche affichés et gardés ; « Personnes présentes » pré-rempli avec le planning du jour (modifiable) ; 📷 sur chaque point (3 photos max, compressées) — une photo sans état coche NC par défaut ; rapport imprimable avec les photos.</w:t>
+            </w:r>
+          </w:p>
+        </w:tc>
+        <w:tc>
+          <w:tcPr>
+            <w:tcW w:type="dxa" w:w="3700"/>
+            <w:tcBorders>
+              <w:top w:val="single" w:color="D9D5CB" w:sz="4"/>
+              <w:left w:val="single" w:color="D9D5CB" w:sz="4"/>
+              <w:bottom w:val="single" w:color="D9D5CB" w:sz="4"/>
+              <w:right w:val="single" w:color="D9D5CB" w:sz="4"/>
+            </w:tcBorders>
+            <w:tcMar>
+              <w:top w:type="dxa" w:w="60"/>
+              <w:left w:type="dxa" w:w="90"/>
+              <w:bottom w:type="dxa" w:w="60"/>
+              <w:right w:type="dxa" w:w="90"/>
+            </w:tcMar>
+            <w:vAlign w:val="top"/>
+          </w:tcPr>
+          <w:p>
+            <w:pPr>
+              <w:spacing w:after="40"/>
+            </w:pPr>
+            <w:r>
+              <w:rPr>
+                <w:rFonts w:ascii="Calibri" w:cs="Calibri" w:eastAsia="Calibri" w:hAnsi="Calibri"/>
+                <w:color w:val="14213D"/>
+                <w:sz w:val="19"/>
+                <w:szCs w:val="19"/>
+              </w:rPr>
+              <w:t xml:space="preserve">Photos au stockage serveur (hors connexion : gardées dans le contrôle).</w:t>
+            </w:r>
+          </w:p>
+        </w:tc>
+        <w:tc>
+          <w:tcPr>
+            <w:tcW w:type="dxa" w:w="1300"/>
+            <w:tcBorders>
+              <w:top w:val="single" w:color="D9D5CB" w:sz="4"/>
+              <w:left w:val="single" w:color="D9D5CB" w:sz="4"/>
+              <w:bottom w:val="single" w:color="D9D5CB" w:sz="4"/>
+              <w:right w:val="single" w:color="D9D5CB" w:sz="4"/>
+            </w:tcBorders>
+            <w:shd w:fill="E6F5EC" w:color="auto" w:val="clear"/>
+            <w:tcMar>
+              <w:top w:type="dxa" w:w="60"/>
+              <w:left w:type="dxa" w:w="90"/>
+              <w:bottom w:type="dxa" w:w="60"/>
+              <w:right w:type="dxa" w:w="90"/>
+            </w:tcMar>
+            <w:vAlign w:val="top"/>
+          </w:tcPr>
+          <w:p>
+            <w:pPr>
+              <w:spacing w:after="40"/>
+            </w:pPr>
+            <w:r>
+              <w:rPr>
+                <w:rFonts w:ascii="Calibri" w:cs="Calibri" w:eastAsia="Calibri" w:hAnsi="Calibri"/>
+                <w:b/>
+                <w:bCs/>
+                <w:color w:val="14213D"/>
+                <w:sz w:val="19"/>
+                <w:szCs w:val="19"/>
+              </w:rPr>
+              <w:t xml:space="preserve">Fait</w:t>
+            </w:r>
+          </w:p>
+        </w:tc>
+        <w:tc>
+          <w:tcPr>
+            <w:tcW w:type="dxa" w:w="3700"/>
+            <w:tcBorders>
+              <w:top w:val="single" w:color="D9D5CB" w:sz="4"/>
+              <w:left w:val="single" w:color="D9D5CB" w:sz="4"/>
+              <w:bottom w:val="single" w:color="D9D5CB" w:sz="4"/>
+              <w:right w:val="single" w:color="D9D5CB" w:sz="4"/>
+            </w:tcBorders>
+            <w:tcMar>
+              <w:top w:type="dxa" w:w="60"/>
+              <w:left w:type="dxa" w:w="90"/>
+              <w:bottom w:type="dxa" w:w="60"/>
+              <w:right w:type="dxa" w:w="90"/>
+            </w:tcMar>
+            <w:vAlign w:val="top"/>
+          </w:tcPr>
+          <w:p>
+            <w:pPr>
+              <w:spacing w:after="40"/>
+            </w:pPr>
+            <w:r>
+              <w:rPr>
+                <w:rFonts w:ascii="Calibri" w:cs="Calibri" w:eastAsia="Calibri" w:hAnsi="Calibri"/>
+                <w:color w:val="14213D"/>
+                <w:sz w:val="20"/>
+                <w:szCs w:val="20"/>
+              </w:rPr>
+              <w:t xml:space="preserve"/>
+            </w:r>
+          </w:p>
+          <w:p>
+            <w:pPr>
+              <w:spacing w:after="40"/>
+            </w:pPr>
+            <w:r>
+              <w:rPr>
+                <w:rFonts w:ascii="Calibri" w:cs="Calibri" w:eastAsia="Calibri" w:hAnsi="Calibri"/>
+                <w:color w:val="14213D"/>
+                <w:sz w:val="20"/>
+                <w:szCs w:val="20"/>
+              </w:rPr>
+              <w:t xml:space="preserve"/>
+            </w:r>
+          </w:p>
+        </w:tc>
+      </w:tr>
+      <w:tr>
+        <w:tc>
+          <w:tcPr>
+            <w:tcW w:type="dxa" w:w="2300"/>
+            <w:tcBorders>
+              <w:top w:val="single" w:color="D9D5CB" w:sz="4"/>
+              <w:left w:val="single" w:color="D9D5CB" w:sz="4"/>
+              <w:bottom w:val="single" w:color="D9D5CB" w:sz="4"/>
+              <w:right w:val="single" w:color="D9D5CB" w:sz="4"/>
+            </w:tcBorders>
+            <w:tcMar>
+              <w:top w:type="dxa" w:w="60"/>
+              <w:left w:type="dxa" w:w="90"/>
+              <w:bottom w:type="dxa" w:w="60"/>
+              <w:right w:type="dxa" w:w="90"/>
+            </w:tcMar>
+            <w:vAlign w:val="top"/>
+          </w:tcPr>
+          <w:p>
+            <w:pPr>
+              <w:spacing w:after="40"/>
+            </w:pPr>
+            <w:r>
+              <w:rPr>
+                <w:rFonts w:ascii="Calibri" w:cs="Calibri" w:eastAsia="Calibri" w:hAnsi="Calibri"/>
+                <w:b/>
+                <w:bCs/>
+                <w:color w:val="14213D"/>
+                <w:sz w:val="20"/>
+                <w:szCs w:val="20"/>
+              </w:rPr>
+              <w:t xml:space="preserve">Direction : qui contrôle, à quelle fréquence</w:t>
+            </w:r>
+          </w:p>
+        </w:tc>
+        <w:tc>
+          <w:tcPr>
+            <w:tcW w:type="dxa" w:w="4100"/>
+            <w:tcBorders>
+              <w:top w:val="single" w:color="D9D5CB" w:sz="4"/>
+              <w:left w:val="single" w:color="D9D5CB" w:sz="4"/>
+              <w:bottom w:val="single" w:color="D9D5CB" w:sz="4"/>
+              <w:right w:val="single" w:color="D9D5CB" w:sz="4"/>
+            </w:tcBorders>
+            <w:tcMar>
+              <w:top w:type="dxa" w:w="60"/>
+              <w:left w:type="dxa" w:w="90"/>
+              <w:bottom w:type="dxa" w:w="60"/>
+              <w:right w:type="dxa" w:w="90"/>
+            </w:tcMar>
+            <w:vAlign w:val="top"/>
+          </w:tcPr>
+          <w:p>
+            <w:pPr>
+              <w:spacing w:after="40"/>
+            </w:pPr>
+            <w:r>
+              <w:rPr>
+                <w:rFonts w:ascii="Calibri" w:cs="Calibri" w:eastAsia="Calibri" w:hAnsi="Calibri"/>
+                <w:color w:val="14213D"/>
+                <w:sz w:val="19"/>
+                <w:szCs w:val="19"/>
+              </w:rPr>
+              <w:t xml:space="preserve">Exploitation → « Contrôles chantier » : par encadrant (4 semaines, 12 semaines, total, NC, dernier), par chantier actif (dernier contrôle, il y a combien de jours — rouge au-delà de 14 j, NC), derniers contrôles → rapport. Objectif affiché : un contrôle par chantier actif toutes les 2 semaines ; pastille « en retard » sur la ligne du menu.</w:t>
+            </w:r>
+          </w:p>
+        </w:tc>
+        <w:tc>
+          <w:tcPr>
+            <w:tcW w:type="dxa" w:w="3700"/>
+            <w:tcBorders>
+              <w:top w:val="single" w:color="D9D5CB" w:sz="4"/>
+              <w:left w:val="single" w:color="D9D5CB" w:sz="4"/>
+              <w:bottom w:val="single" w:color="D9D5CB" w:sz="4"/>
+              <w:right w:val="single" w:color="D9D5CB" w:sz="4"/>
+            </w:tcBorders>
+            <w:tcMar>
+              <w:top w:type="dxa" w:w="60"/>
+              <w:left w:type="dxa" w:w="90"/>
+              <w:bottom w:type="dxa" w:w="60"/>
+              <w:right w:type="dxa" w:w="90"/>
+            </w:tcMar>
+            <w:vAlign w:val="top"/>
+          </w:tcPr>
+          <w:p>
+            <w:pPr>
+              <w:spacing w:after="40"/>
+            </w:pPr>
+            <w:r>
+              <w:rPr>
+                <w:rFonts w:ascii="Calibri" w:cs="Calibri" w:eastAsia="Calibri" w:hAnsi="Calibri"/>
+                <w:color w:val="14213D"/>
+                <w:sz w:val="19"/>
+                <w:szCs w:val="19"/>
+              </w:rPr>
+              <w:t xml:space="preserve">Objectif à ajuster avec la direction (je le rends réglable quand tu me donnes la règle).</w:t>
+            </w:r>
+          </w:p>
+        </w:tc>
+        <w:tc>
+          <w:tcPr>
+            <w:tcW w:type="dxa" w:w="1300"/>
+            <w:tcBorders>
+              <w:top w:val="single" w:color="D9D5CB" w:sz="4"/>
+              <w:left w:val="single" w:color="D9D5CB" w:sz="4"/>
+              <w:bottom w:val="single" w:color="D9D5CB" w:sz="4"/>
+              <w:right w:val="single" w:color="D9D5CB" w:sz="4"/>
+            </w:tcBorders>
+            <w:shd w:fill="E6F5EC" w:color="auto" w:val="clear"/>
+            <w:tcMar>
+              <w:top w:type="dxa" w:w="60"/>
+              <w:left w:type="dxa" w:w="90"/>
+              <w:bottom w:type="dxa" w:w="60"/>
+              <w:right w:type="dxa" w:w="90"/>
+            </w:tcMar>
+            <w:vAlign w:val="top"/>
+          </w:tcPr>
+          <w:p>
+            <w:pPr>
+              <w:spacing w:after="40"/>
+            </w:pPr>
+            <w:r>
+              <w:rPr>
+                <w:rFonts w:ascii="Calibri" w:cs="Calibri" w:eastAsia="Calibri" w:hAnsi="Calibri"/>
+                <w:b/>
+                <w:bCs/>
+                <w:color w:val="14213D"/>
+                <w:sz w:val="19"/>
+                <w:szCs w:val="19"/>
+              </w:rPr>
+              <w:t xml:space="preserve">Fait</w:t>
+            </w:r>
+          </w:p>
+        </w:tc>
+        <w:tc>
+          <w:tcPr>
+            <w:tcW w:type="dxa" w:w="3700"/>
+            <w:tcBorders>
+              <w:top w:val="single" w:color="D9D5CB" w:sz="4"/>
+              <w:left w:val="single" w:color="D9D5CB" w:sz="4"/>
+              <w:bottom w:val="single" w:color="D9D5CB" w:sz="4"/>
+              <w:right w:val="single" w:color="D9D5CB" w:sz="4"/>
+            </w:tcBorders>
+            <w:tcMar>
+              <w:top w:type="dxa" w:w="60"/>
+              <w:left w:type="dxa" w:w="90"/>
+              <w:bottom w:type="dxa" w:w="60"/>
+              <w:right w:type="dxa" w:w="90"/>
+            </w:tcMar>
+            <w:vAlign w:val="top"/>
+          </w:tcPr>
+          <w:p>
+            <w:pPr>
+              <w:spacing w:after="40"/>
+            </w:pPr>
+            <w:r>
+              <w:rPr>
+                <w:rFonts w:ascii="Calibri" w:cs="Calibri" w:eastAsia="Calibri" w:hAnsi="Calibri"/>
+                <w:color w:val="14213D"/>
+                <w:sz w:val="20"/>
+                <w:szCs w:val="20"/>
+              </w:rPr>
+              <w:t xml:space="preserve"/>
+            </w:r>
+          </w:p>
+          <w:p>
+            <w:pPr>
+              <w:spacing w:after="40"/>
+            </w:pPr>
+            <w:r>
+              <w:rPr>
+                <w:rFonts w:ascii="Calibri" w:cs="Calibri" w:eastAsia="Calibri" w:hAnsi="Calibri"/>
+                <w:color w:val="14213D"/>
+                <w:sz w:val="20"/>
+                <w:szCs w:val="20"/>
+              </w:rPr>
+              <w:t xml:space="preserve"/>
+            </w:r>
+          </w:p>
+        </w:tc>
+      </w:tr>
+      <w:tr>
+        <w:tc>
+          <w:tcPr>
+            <w:tcW w:type="dxa" w:w="2300"/>
+            <w:tcBorders>
+              <w:top w:val="single" w:color="D9D5CB" w:sz="4"/>
+              <w:left w:val="single" w:color="D9D5CB" w:sz="4"/>
+              <w:bottom w:val="single" w:color="D9D5CB" w:sz="4"/>
+              <w:right w:val="single" w:color="D9D5CB" w:sz="4"/>
+            </w:tcBorders>
+            <w:tcMar>
+              <w:top w:type="dxa" w:w="60"/>
+              <w:left w:type="dxa" w:w="90"/>
+              <w:bottom w:type="dxa" w:w="60"/>
+              <w:right w:type="dxa" w:w="90"/>
+            </w:tcMar>
+            <w:vAlign w:val="top"/>
+          </w:tcPr>
+          <w:p>
+            <w:pPr>
+              <w:spacing w:after="40"/>
+            </w:pPr>
+            <w:r>
+              <w:rPr>
+                <w:rFonts w:ascii="Calibri" w:cs="Calibri" w:eastAsia="Calibri" w:hAnsi="Calibri"/>
+                <w:b/>
+                <w:bCs/>
+                <w:color w:val="14213D"/>
+                <w:sz w:val="20"/>
+                <w:szCs w:val="20"/>
+              </w:rPr>
+              <w:t xml:space="preserve">Qui pointe</w:t>
+            </w:r>
+          </w:p>
+        </w:tc>
+        <w:tc>
+          <w:tcPr>
+            <w:tcW w:type="dxa" w:w="4100"/>
+            <w:tcBorders>
+              <w:top w:val="single" w:color="D9D5CB" w:sz="4"/>
+              <w:left w:val="single" w:color="D9D5CB" w:sz="4"/>
+              <w:bottom w:val="single" w:color="D9D5CB" w:sz="4"/>
+              <w:right w:val="single" w:color="D9D5CB" w:sz="4"/>
+            </w:tcBorders>
+            <w:tcMar>
+              <w:top w:type="dxa" w:w="60"/>
+              <w:left w:type="dxa" w:w="90"/>
+              <w:bottom w:type="dxa" w:w="60"/>
+              <w:right w:type="dxa" w:w="90"/>
+            </w:tcMar>
+            <w:vAlign w:val="top"/>
+          </w:tcPr>
+          <w:p>
+            <w:pPr>
+              <w:spacing w:after="40"/>
+            </w:pPr>
+            <w:r>
+              <w:rPr>
+                <w:rFonts w:ascii="Calibri" w:cs="Calibri" w:eastAsia="Calibri" w:hAnsi="Calibri"/>
+                <w:color w:val="14213D"/>
+                <w:sz w:val="19"/>
+                <w:szCs w:val="19"/>
+              </w:rPr>
+              <w:t xml:space="preserve">Rien à changer (« parfait »).</w:t>
+            </w:r>
+          </w:p>
+        </w:tc>
+        <w:tc>
+          <w:tcPr>
+            <w:tcW w:type="dxa" w:w="3700"/>
+            <w:tcBorders>
+              <w:top w:val="single" w:color="D9D5CB" w:sz="4"/>
+              <w:left w:val="single" w:color="D9D5CB" w:sz="4"/>
+              <w:bottom w:val="single" w:color="D9D5CB" w:sz="4"/>
+              <w:right w:val="single" w:color="D9D5CB" w:sz="4"/>
+            </w:tcBorders>
+            <w:tcMar>
+              <w:top w:type="dxa" w:w="60"/>
+              <w:left w:type="dxa" w:w="90"/>
+              <w:bottom w:type="dxa" w:w="60"/>
+              <w:right w:type="dxa" w:w="90"/>
+            </w:tcMar>
+            <w:vAlign w:val="top"/>
+          </w:tcPr>
+          <w:p>
+            <w:pPr>
+              <w:spacing w:after="40"/>
+            </w:pPr>
+            <w:r>
+              <w:rPr>
+                <w:rFonts w:ascii="Calibri" w:cs="Calibri" w:eastAsia="Calibri" w:hAnsi="Calibri"/>
+                <w:color w:val="14213D"/>
+                <w:sz w:val="19"/>
+                <w:szCs w:val="19"/>
+              </w:rPr>
+              <w:t xml:space="preserve"/>
+            </w:r>
+          </w:p>
+        </w:tc>
+        <w:tc>
+          <w:tcPr>
+            <w:tcW w:type="dxa" w:w="1300"/>
+            <w:tcBorders>
+              <w:top w:val="single" w:color="D9D5CB" w:sz="4"/>
+              <w:left w:val="single" w:color="D9D5CB" w:sz="4"/>
+              <w:bottom w:val="single" w:color="D9D5CB" w:sz="4"/>
+              <w:right w:val="single" w:color="D9D5CB" w:sz="4"/>
+            </w:tcBorders>
+            <w:shd w:fill="FFF4EE" w:color="auto" w:val="clear"/>
+            <w:tcMar>
+              <w:top w:type="dxa" w:w="60"/>
+              <w:left w:type="dxa" w:w="90"/>
+              <w:bottom w:type="dxa" w:w="60"/>
+              <w:right w:type="dxa" w:w="90"/>
+            </w:tcMar>
+            <w:vAlign w:val="top"/>
+          </w:tcPr>
+          <w:p>
+            <w:pPr>
+              <w:spacing w:after="40"/>
+            </w:pPr>
+            <w:r>
+              <w:rPr>
+                <w:rFonts w:ascii="Calibri" w:cs="Calibri" w:eastAsia="Calibri" w:hAnsi="Calibri"/>
+                <w:b/>
+                <w:bCs/>
+                <w:color w:val="14213D"/>
+                <w:sz w:val="19"/>
+                <w:szCs w:val="19"/>
+              </w:rPr>
+              <w:t xml:space="preserve">—</w:t>
+            </w:r>
+          </w:p>
+        </w:tc>
+        <w:tc>
+          <w:tcPr>
+            <w:tcW w:type="dxa" w:w="3700"/>
+            <w:tcBorders>
+              <w:top w:val="single" w:color="D9D5CB" w:sz="4"/>
+              <w:left w:val="single" w:color="D9D5CB" w:sz="4"/>
+              <w:bottom w:val="single" w:color="D9D5CB" w:sz="4"/>
+              <w:right w:val="single" w:color="D9D5CB" w:sz="4"/>
+            </w:tcBorders>
+            <w:tcMar>
+              <w:top w:type="dxa" w:w="60"/>
+              <w:left w:type="dxa" w:w="90"/>
+              <w:bottom w:type="dxa" w:w="60"/>
+              <w:right w:type="dxa" w:w="90"/>
+            </w:tcMar>
+            <w:vAlign w:val="top"/>
+          </w:tcPr>
+          <w:p>
+            <w:pPr>
+              <w:spacing w:after="40"/>
+            </w:pPr>
+            <w:r>
+              <w:rPr>
+                <w:rFonts w:ascii="Calibri" w:cs="Calibri" w:eastAsia="Calibri" w:hAnsi="Calibri"/>
+                <w:color w:val="14213D"/>
+                <w:sz w:val="20"/>
+                <w:szCs w:val="20"/>
+              </w:rPr>
+              <w:t xml:space="preserve"/>
+            </w:r>
+          </w:p>
+          <w:p>
+            <w:pPr>
+              <w:spacing w:after="40"/>
+            </w:pPr>
+            <w:r>
+              <w:rPr>
+                <w:rFonts w:ascii="Calibri" w:cs="Calibri" w:eastAsia="Calibri" w:hAnsi="Calibri"/>
+                <w:color w:val="14213D"/>
+                <w:sz w:val="20"/>
+                <w:szCs w:val="20"/>
+              </w:rPr>
+              <w:t xml:space="preserve"/>
+            </w:r>
+          </w:p>
+        </w:tc>
+      </w:tr>
+    </w:tbl>
     <w:p>
       <w:pPr>
         <w:pStyle w:val="Heading1"/>

</xml_diff>

<commit_message>
Quarts d'heure sécurité : les 12 sujets SCR (annexe 5) avec quiz vrai/faux, je m'engage, retour et signature animateur ; émargements QSE dans le dossier chantier + export DOE ; flash info = PDF seul
</commit_message>
<xml_diff>
--- a/app/docs/Feuille_de_route_nuit_09-10-10.docx
+++ b/app/docs/Feuille_de_route_nuit_09-10-10.docx
@@ -84,7 +84,7 @@
           <w:sz w:val="20"/>
           <w:szCs w:val="20"/>
         </w:rPr>
-        <w:t xml:space="preserve">Build livré : 10/10/2026 · b24270 (retours du matin inclus) (index.html + traceur.html à la racine du dépôt). Sources : app/src (reg.js, docs.js, prevention.js, accueil.js, affaires.js, flotte.js, rh.js, commandes.js, reglement.js + app.js, espace.js, next.js, acces.js, sync.js). Notes techniques : app/NOTES.md.</w:t>
+        <w:t xml:space="preserve">Build livré : 10/10/2026 · d4e2f0 (retours du matin + 12 quarts d'heure SCR) (index.html + traceur.html à la racine du dépôt). Sources : app/src (reg.js, docs.js, prevention.js, accueil.js, affaires.js, flotte.js, rh.js, commandes.js, reglement.js + app.js, espace.js, next.js, acces.js, sync.js). Notes techniques : app/NOTES.md.</w:t>
       </w:r>
     </w:p>
     <w:p>
@@ -2744,7 +2744,7 @@
                 <w:sz w:val="20"/>
                 <w:szCs w:val="20"/>
               </w:rPr>
-              <w:t xml:space="preserve">Quart d'heure sécurité dématérialisé</w:t>
+              <w:t xml:space="preserve">Quart d'heure sécurité dématérialisé — tes 12 sujets SCR</w:t>
             </w:r>
           </w:p>
         </w:tc>
@@ -2776,7 +2776,7 @@
                 <w:sz w:val="19"/>
                 <w:szCs w:val="19"/>
               </w:rPr>
-              <w:t xml:space="preserve">Exploitation → « Quart d'heure sécurité » → « Déclencher » : sujet, date, ce chantier / mes chantiers / tous. Chaque personne placée ce jour-là (chefs de chantier compris) a la notification « Quart d'heure sécurité à faire » sur son accueil et dans le Bureau : sujet à dérouler en entier → 3 points à confirmer → signature. Onglet QSE : bloc « Quart d'heure sécurité du jour » (participations, faire participer quelqu'un sans compte, feuille, annuler). Suivi des déclenchements dans Exploitation.</w:t>
+              <w:t xml:space="preserve">Exploitation → « Quart d'heure sécurité » → « Déclencher » : l'un des 12 sujets de l'annexe 5 (ensevelissement, écrasement, chute d'objet, coupure, chute de hauteur, incendie, anoxie, blessure aggravée, circulation, travail isolé, hydraulique / électrique, hygiène), date, ce chantier / mes chantiers / tous. Chaque personne placée ce jour-là (chefs de chantier compris) a la notification sur son accueil et dans le Bureau : sujet déroulé en entier (contexte, objectifs, chiffres clés, notions clés) → quiz VRAI / FAUX (la bonne réponse s'affiche) → « Je m'engage » : signature au doigt + retour de l'échange. L'animateur clôt la séance (retour animateur + signature). Onglet QSE : bloc du jour (participations avec score, faire participer quelqu'un sans compte, feuille, clore, annuler).</w:t>
             </w:r>
           </w:p>
         </w:tc>
@@ -2808,7 +2808,7 @@
                 <w:sz w:val="19"/>
                 <w:szCs w:val="19"/>
               </w:rPr>
-              <w:t xml:space="preserve">3 sujets d'EXEMPLE écrits par moi (réseaux enterrés, points chauds, levage des tubes) en attendant ta base de quarts d'heure : donne-la-moi, je l'importe (titre, texte, 3 questions par sujet). SQL retours_10-10.sql à passer.</w:t>
+              <w:t xml:space="preserve">Textes repris tels quels du document SCR (sans les photos). Le sujet 11 (consignation) n'a pas de vrai / faux dans le document : 3 points à confirmer à la place. SQL retours_10-10.sql à passer.</w:t>
             </w:r>
           </w:p>
         </w:tc>
@@ -2843,7 +2843,369 @@
                 <w:sz w:val="19"/>
                 <w:szCs w:val="19"/>
               </w:rPr>
-              <w:t xml:space="preserve">Fait (sujets d'exemple)</w:t>
+              <w:t xml:space="preserve">Fait</w:t>
+            </w:r>
+          </w:p>
+        </w:tc>
+        <w:tc>
+          <w:tcPr>
+            <w:tcW w:type="dxa" w:w="3700"/>
+            <w:tcBorders>
+              <w:top w:val="single" w:color="D9D5CB" w:sz="4"/>
+              <w:left w:val="single" w:color="D9D5CB" w:sz="4"/>
+              <w:bottom w:val="single" w:color="D9D5CB" w:sz="4"/>
+              <w:right w:val="single" w:color="D9D5CB" w:sz="4"/>
+            </w:tcBorders>
+            <w:tcMar>
+              <w:top w:type="dxa" w:w="60"/>
+              <w:left w:type="dxa" w:w="90"/>
+              <w:bottom w:type="dxa" w:w="60"/>
+              <w:right w:type="dxa" w:w="90"/>
+            </w:tcMar>
+            <w:vAlign w:val="top"/>
+          </w:tcPr>
+          <w:p>
+            <w:pPr>
+              <w:spacing w:after="40"/>
+            </w:pPr>
+            <w:r>
+              <w:rPr>
+                <w:rFonts w:ascii="Calibri" w:cs="Calibri" w:eastAsia="Calibri" w:hAnsi="Calibri"/>
+                <w:color w:val="14213D"/>
+                <w:sz w:val="20"/>
+                <w:szCs w:val="20"/>
+              </w:rPr>
+              <w:t xml:space="preserve"/>
+            </w:r>
+          </w:p>
+          <w:p>
+            <w:pPr>
+              <w:spacing w:after="40"/>
+            </w:pPr>
+            <w:r>
+              <w:rPr>
+                <w:rFonts w:ascii="Calibri" w:cs="Calibri" w:eastAsia="Calibri" w:hAnsi="Calibri"/>
+                <w:color w:val="14213D"/>
+                <w:sz w:val="20"/>
+                <w:szCs w:val="20"/>
+              </w:rPr>
+              <w:t xml:space="preserve"/>
+            </w:r>
+          </w:p>
+        </w:tc>
+      </w:tr>
+      <w:tr>
+        <w:tc>
+          <w:tcPr>
+            <w:tcW w:type="dxa" w:w="2300"/>
+            <w:tcBorders>
+              <w:top w:val="single" w:color="D9D5CB" w:sz="4"/>
+              <w:left w:val="single" w:color="D9D5CB" w:sz="4"/>
+              <w:bottom w:val="single" w:color="D9D5CB" w:sz="4"/>
+              <w:right w:val="single" w:color="D9D5CB" w:sz="4"/>
+            </w:tcBorders>
+            <w:tcMar>
+              <w:top w:type="dxa" w:w="60"/>
+              <w:left w:type="dxa" w:w="90"/>
+              <w:bottom w:type="dxa" w:w="60"/>
+              <w:right w:type="dxa" w:w="90"/>
+            </w:tcMar>
+            <w:vAlign w:val="top"/>
+          </w:tcPr>
+          <w:p>
+            <w:pPr>
+              <w:spacing w:after="40"/>
+            </w:pPr>
+            <w:r>
+              <w:rPr>
+                <w:rFonts w:ascii="Calibri" w:cs="Calibri" w:eastAsia="Calibri" w:hAnsi="Calibri"/>
+                <w:b/>
+                <w:bCs/>
+                <w:color w:val="14213D"/>
+                <w:sz w:val="20"/>
+                <w:szCs w:val="20"/>
+              </w:rPr>
+              <w:t xml:space="preserve">Tout ce qui est signé dans QSE → dossier chantier</w:t>
+            </w:r>
+          </w:p>
+        </w:tc>
+        <w:tc>
+          <w:tcPr>
+            <w:tcW w:type="dxa" w:w="4100"/>
+            <w:tcBorders>
+              <w:top w:val="single" w:color="D9D5CB" w:sz="4"/>
+              <w:left w:val="single" w:color="D9D5CB" w:sz="4"/>
+              <w:bottom w:val="single" w:color="D9D5CB" w:sz="4"/>
+              <w:right w:val="single" w:color="D9D5CB" w:sz="4"/>
+            </w:tcBorders>
+            <w:tcMar>
+              <w:top w:type="dxa" w:w="60"/>
+              <w:left w:type="dxa" w:w="90"/>
+              <w:bottom w:type="dxa" w:w="60"/>
+              <w:right w:type="dxa" w:w="90"/>
+            </w:tcMar>
+            <w:vAlign w:val="top"/>
+          </w:tcPr>
+          <w:p>
+            <w:pPr>
+              <w:spacing w:after="40"/>
+            </w:pPr>
+            <w:r>
+              <w:rPr>
+                <w:rFonts w:ascii="Calibri" w:cs="Calibri" w:eastAsia="Calibri" w:hAnsi="Calibri"/>
+                <w:color w:val="14213D"/>
+                <w:sz w:val="19"/>
+                <w:szCs w:val="19"/>
+              </w:rPr>
+              <w:t xml:space="preserve">Onglet Dossier → rubrique « Émargements QSE » : accueil chantier (feuille à date), chaque quart d'heure (feuille SCR : participations, quiz, retours, animateur), chaque document à émarger (document + feuille). Généré à partir des signatures : toujours à jour, et repris dans l'export DOE (05_Dossier_administratif/QSE).</w:t>
+            </w:r>
+          </w:p>
+        </w:tc>
+        <w:tc>
+          <w:tcPr>
+            <w:tcW w:type="dxa" w:w="3700"/>
+            <w:tcBorders>
+              <w:top w:val="single" w:color="D9D5CB" w:sz="4"/>
+              <w:left w:val="single" w:color="D9D5CB" w:sz="4"/>
+              <w:bottom w:val="single" w:color="D9D5CB" w:sz="4"/>
+              <w:right w:val="single" w:color="D9D5CB" w:sz="4"/>
+            </w:tcBorders>
+            <w:tcMar>
+              <w:top w:type="dxa" w:w="60"/>
+              <w:left w:type="dxa" w:w="90"/>
+              <w:bottom w:type="dxa" w:w="60"/>
+              <w:right w:type="dxa" w:w="90"/>
+            </w:tcMar>
+            <w:vAlign w:val="top"/>
+          </w:tcPr>
+          <w:p>
+            <w:pPr>
+              <w:spacing w:after="40"/>
+            </w:pPr>
+            <w:r>
+              <w:rPr>
+                <w:rFonts w:ascii="Calibri" w:cs="Calibri" w:eastAsia="Calibri" w:hAnsi="Calibri"/>
+                <w:color w:val="14213D"/>
+                <w:sz w:val="19"/>
+                <w:szCs w:val="19"/>
+              </w:rPr>
+              <w:t xml:space="preserve">Pas de copie figée qui vieillit : la feuille reprend toutes les signatures au moment où tu l'ouvres.</w:t>
+            </w:r>
+          </w:p>
+        </w:tc>
+        <w:tc>
+          <w:tcPr>
+            <w:tcW w:type="dxa" w:w="1300"/>
+            <w:tcBorders>
+              <w:top w:val="single" w:color="D9D5CB" w:sz="4"/>
+              <w:left w:val="single" w:color="D9D5CB" w:sz="4"/>
+              <w:bottom w:val="single" w:color="D9D5CB" w:sz="4"/>
+              <w:right w:val="single" w:color="D9D5CB" w:sz="4"/>
+            </w:tcBorders>
+            <w:shd w:fill="E6F5EC" w:color="auto" w:val="clear"/>
+            <w:tcMar>
+              <w:top w:type="dxa" w:w="60"/>
+              <w:left w:type="dxa" w:w="90"/>
+              <w:bottom w:type="dxa" w:w="60"/>
+              <w:right w:type="dxa" w:w="90"/>
+            </w:tcMar>
+            <w:vAlign w:val="top"/>
+          </w:tcPr>
+          <w:p>
+            <w:pPr>
+              <w:spacing w:after="40"/>
+            </w:pPr>
+            <w:r>
+              <w:rPr>
+                <w:rFonts w:ascii="Calibri" w:cs="Calibri" w:eastAsia="Calibri" w:hAnsi="Calibri"/>
+                <w:b/>
+                <w:bCs/>
+                <w:color w:val="14213D"/>
+                <w:sz w:val="19"/>
+                <w:szCs w:val="19"/>
+              </w:rPr>
+              <w:t xml:space="preserve">Fait</w:t>
+            </w:r>
+          </w:p>
+        </w:tc>
+        <w:tc>
+          <w:tcPr>
+            <w:tcW w:type="dxa" w:w="3700"/>
+            <w:tcBorders>
+              <w:top w:val="single" w:color="D9D5CB" w:sz="4"/>
+              <w:left w:val="single" w:color="D9D5CB" w:sz="4"/>
+              <w:bottom w:val="single" w:color="D9D5CB" w:sz="4"/>
+              <w:right w:val="single" w:color="D9D5CB" w:sz="4"/>
+            </w:tcBorders>
+            <w:tcMar>
+              <w:top w:type="dxa" w:w="60"/>
+              <w:left w:type="dxa" w:w="90"/>
+              <w:bottom w:type="dxa" w:w="60"/>
+              <w:right w:type="dxa" w:w="90"/>
+            </w:tcMar>
+            <w:vAlign w:val="top"/>
+          </w:tcPr>
+          <w:p>
+            <w:pPr>
+              <w:spacing w:after="40"/>
+            </w:pPr>
+            <w:r>
+              <w:rPr>
+                <w:rFonts w:ascii="Calibri" w:cs="Calibri" w:eastAsia="Calibri" w:hAnsi="Calibri"/>
+                <w:color w:val="14213D"/>
+                <w:sz w:val="20"/>
+                <w:szCs w:val="20"/>
+              </w:rPr>
+              <w:t xml:space="preserve"/>
+            </w:r>
+          </w:p>
+          <w:p>
+            <w:pPr>
+              <w:spacing w:after="40"/>
+            </w:pPr>
+            <w:r>
+              <w:rPr>
+                <w:rFonts w:ascii="Calibri" w:cs="Calibri" w:eastAsia="Calibri" w:hAnsi="Calibri"/>
+                <w:color w:val="14213D"/>
+                <w:sz w:val="20"/>
+                <w:szCs w:val="20"/>
+              </w:rPr>
+              <w:t xml:space="preserve"/>
+            </w:r>
+          </w:p>
+        </w:tc>
+      </w:tr>
+      <w:tr>
+        <w:tc>
+          <w:tcPr>
+            <w:tcW w:type="dxa" w:w="2300"/>
+            <w:tcBorders>
+              <w:top w:val="single" w:color="D9D5CB" w:sz="4"/>
+              <w:left w:val="single" w:color="D9D5CB" w:sz="4"/>
+              <w:bottom w:val="single" w:color="D9D5CB" w:sz="4"/>
+              <w:right w:val="single" w:color="D9D5CB" w:sz="4"/>
+            </w:tcBorders>
+            <w:tcMar>
+              <w:top w:type="dxa" w:w="60"/>
+              <w:left w:type="dxa" w:w="90"/>
+              <w:bottom w:type="dxa" w:w="60"/>
+              <w:right w:type="dxa" w:w="90"/>
+            </w:tcMar>
+            <w:vAlign w:val="top"/>
+          </w:tcPr>
+          <w:p>
+            <w:pPr>
+              <w:spacing w:after="40"/>
+            </w:pPr>
+            <w:r>
+              <w:rPr>
+                <w:rFonts w:ascii="Calibri" w:cs="Calibri" w:eastAsia="Calibri" w:hAnsi="Calibri"/>
+                <w:b/>
+                <w:bCs/>
+                <w:color w:val="14213D"/>
+                <w:sz w:val="20"/>
+                <w:szCs w:val="20"/>
+              </w:rPr>
+              <w:t xml:space="preserve">Flash info : pas de texte, toujours un PDF</w:t>
+            </w:r>
+          </w:p>
+        </w:tc>
+        <w:tc>
+          <w:tcPr>
+            <w:tcW w:type="dxa" w:w="4100"/>
+            <w:tcBorders>
+              <w:top w:val="single" w:color="D9D5CB" w:sz="4"/>
+              <w:left w:val="single" w:color="D9D5CB" w:sz="4"/>
+              <w:bottom w:val="single" w:color="D9D5CB" w:sz="4"/>
+              <w:right w:val="single" w:color="D9D5CB" w:sz="4"/>
+            </w:tcBorders>
+            <w:tcMar>
+              <w:top w:type="dxa" w:w="60"/>
+              <w:left w:type="dxa" w:w="90"/>
+              <w:bottom w:type="dxa" w:w="60"/>
+              <w:right w:type="dxa" w:w="90"/>
+            </w:tcMar>
+            <w:vAlign w:val="top"/>
+          </w:tcPr>
+          <w:p>
+            <w:pPr>
+              <w:spacing w:after="40"/>
+            </w:pPr>
+            <w:r>
+              <w:rPr>
+                <w:rFonts w:ascii="Calibri" w:cs="Calibri" w:eastAsia="Calibri" w:hAnsi="Calibri"/>
+                <w:color w:val="14213D"/>
+                <w:sz w:val="19"/>
+                <w:szCs w:val="19"/>
+              </w:rPr>
+              <w:t xml:space="preserve">Le formulaire « Flash info sécurité » n'a plus de champ texte : titre + PDF + destinataires.</w:t>
+            </w:r>
+          </w:p>
+        </w:tc>
+        <w:tc>
+          <w:tcPr>
+            <w:tcW w:type="dxa" w:w="3700"/>
+            <w:tcBorders>
+              <w:top w:val="single" w:color="D9D5CB" w:sz="4"/>
+              <w:left w:val="single" w:color="D9D5CB" w:sz="4"/>
+              <w:bottom w:val="single" w:color="D9D5CB" w:sz="4"/>
+              <w:right w:val="single" w:color="D9D5CB" w:sz="4"/>
+            </w:tcBorders>
+            <w:tcMar>
+              <w:top w:type="dxa" w:w="60"/>
+              <w:left w:type="dxa" w:w="90"/>
+              <w:bottom w:type="dxa" w:w="60"/>
+              <w:right w:type="dxa" w:w="90"/>
+            </w:tcMar>
+            <w:vAlign w:val="top"/>
+          </w:tcPr>
+          <w:p>
+            <w:pPr>
+              <w:spacing w:after="40"/>
+            </w:pPr>
+            <w:r>
+              <w:rPr>
+                <w:rFonts w:ascii="Calibri" w:cs="Calibri" w:eastAsia="Calibri" w:hAnsi="Calibri"/>
+                <w:color w:val="14213D"/>
+                <w:sz w:val="19"/>
+                <w:szCs w:val="19"/>
+              </w:rPr>
+              <w:t xml:space="preserve"/>
+            </w:r>
+          </w:p>
+        </w:tc>
+        <w:tc>
+          <w:tcPr>
+            <w:tcW w:type="dxa" w:w="1300"/>
+            <w:tcBorders>
+              <w:top w:val="single" w:color="D9D5CB" w:sz="4"/>
+              <w:left w:val="single" w:color="D9D5CB" w:sz="4"/>
+              <w:bottom w:val="single" w:color="D9D5CB" w:sz="4"/>
+              <w:right w:val="single" w:color="D9D5CB" w:sz="4"/>
+            </w:tcBorders>
+            <w:shd w:fill="E6F5EC" w:color="auto" w:val="clear"/>
+            <w:tcMar>
+              <w:top w:type="dxa" w:w="60"/>
+              <w:left w:type="dxa" w:w="90"/>
+              <w:bottom w:type="dxa" w:w="60"/>
+              <w:right w:type="dxa" w:w="90"/>
+            </w:tcMar>
+            <w:vAlign w:val="top"/>
+          </w:tcPr>
+          <w:p>
+            <w:pPr>
+              <w:spacing w:after="40"/>
+            </w:pPr>
+            <w:r>
+              <w:rPr>
+                <w:rFonts w:ascii="Calibri" w:cs="Calibri" w:eastAsia="Calibri" w:hAnsi="Calibri"/>
+                <w:b/>
+                <w:bCs/>
+                <w:color w:val="14213D"/>
+                <w:sz w:val="19"/>
+                <w:szCs w:val="19"/>
+              </w:rPr>
+              <w:t xml:space="preserve">Fait</w:t>
             </w:r>
           </w:p>
         </w:tc>

</xml_diff>

<commit_message>
Planning : recherche + filtres par poste, équipes A/B/C sur un même chantier, chef en autonomie sur deux chantiers, encadrement en conduite de travaux
</commit_message>
<xml_diff>
--- a/app/docs/Feuille_de_route_nuit_09-10-10.docx
+++ b/app/docs/Feuille_de_route_nuit_09-10-10.docx
@@ -84,7 +84,7 @@
           <w:sz w:val="20"/>
           <w:szCs w:val="20"/>
         </w:rPr>
-        <w:t xml:space="preserve">Build livré : 10/10/2026 · d4e2f0 (retours du matin + 12 quarts d'heure SCR) (index.html + traceur.html à la racine du dépôt). Sources : app/src (reg.js, docs.js, prevention.js, accueil.js, affaires.js, flotte.js, rh.js, commandes.js, reglement.js + app.js, espace.js, next.js, acces.js, sync.js). Notes techniques : app/NOTES.md.</w:t>
+        <w:t xml:space="preserve">Build livré : 10/10/2026 · 5ee302 (retours du matin, 12 quarts d'heure SCR, planning) (index.html + traceur.html à la racine du dépôt). Sources : app/src (reg.js, docs.js, prevention.js, accueil.js, affaires.js, flotte.js, rh.js, commandes.js, reglement.js + app.js, espace.js, next.js, acces.js, sync.js). Notes techniques : app/NOTES.md.</w:t>
       </w:r>
     </w:p>
     <w:p>
@@ -3171,6 +3171,549 @@
                 <w:szCs w:val="19"/>
               </w:rPr>
               <w:t xml:space="preserve"/>
+            </w:r>
+          </w:p>
+        </w:tc>
+        <w:tc>
+          <w:tcPr>
+            <w:tcW w:type="dxa" w:w="1300"/>
+            <w:tcBorders>
+              <w:top w:val="single" w:color="D9D5CB" w:sz="4"/>
+              <w:left w:val="single" w:color="D9D5CB" w:sz="4"/>
+              <w:bottom w:val="single" w:color="D9D5CB" w:sz="4"/>
+              <w:right w:val="single" w:color="D9D5CB" w:sz="4"/>
+            </w:tcBorders>
+            <w:shd w:fill="E6F5EC" w:color="auto" w:val="clear"/>
+            <w:tcMar>
+              <w:top w:type="dxa" w:w="60"/>
+              <w:left w:type="dxa" w:w="90"/>
+              <w:bottom w:type="dxa" w:w="60"/>
+              <w:right w:type="dxa" w:w="90"/>
+            </w:tcMar>
+            <w:vAlign w:val="top"/>
+          </w:tcPr>
+          <w:p>
+            <w:pPr>
+              <w:spacing w:after="40"/>
+            </w:pPr>
+            <w:r>
+              <w:rPr>
+                <w:rFonts w:ascii="Calibri" w:cs="Calibri" w:eastAsia="Calibri" w:hAnsi="Calibri"/>
+                <w:b/>
+                <w:bCs/>
+                <w:color w:val="14213D"/>
+                <w:sz w:val="19"/>
+                <w:szCs w:val="19"/>
+              </w:rPr>
+              <w:t xml:space="preserve">Fait</w:t>
+            </w:r>
+          </w:p>
+        </w:tc>
+        <w:tc>
+          <w:tcPr>
+            <w:tcW w:type="dxa" w:w="3700"/>
+            <w:tcBorders>
+              <w:top w:val="single" w:color="D9D5CB" w:sz="4"/>
+              <w:left w:val="single" w:color="D9D5CB" w:sz="4"/>
+              <w:bottom w:val="single" w:color="D9D5CB" w:sz="4"/>
+              <w:right w:val="single" w:color="D9D5CB" w:sz="4"/>
+            </w:tcBorders>
+            <w:tcMar>
+              <w:top w:type="dxa" w:w="60"/>
+              <w:left w:type="dxa" w:w="90"/>
+              <w:bottom w:type="dxa" w:w="60"/>
+              <w:right w:type="dxa" w:w="90"/>
+            </w:tcMar>
+            <w:vAlign w:val="top"/>
+          </w:tcPr>
+          <w:p>
+            <w:pPr>
+              <w:spacing w:after="40"/>
+            </w:pPr>
+            <w:r>
+              <w:rPr>
+                <w:rFonts w:ascii="Calibri" w:cs="Calibri" w:eastAsia="Calibri" w:hAnsi="Calibri"/>
+                <w:color w:val="14213D"/>
+                <w:sz w:val="20"/>
+                <w:szCs w:val="20"/>
+              </w:rPr>
+              <w:t xml:space="preserve"/>
+            </w:r>
+          </w:p>
+          <w:p>
+            <w:pPr>
+              <w:spacing w:after="40"/>
+            </w:pPr>
+            <w:r>
+              <w:rPr>
+                <w:rFonts w:ascii="Calibri" w:cs="Calibri" w:eastAsia="Calibri" w:hAnsi="Calibri"/>
+                <w:color w:val="14213D"/>
+                <w:sz w:val="20"/>
+                <w:szCs w:val="20"/>
+              </w:rPr>
+              <w:t xml:space="preserve"/>
+            </w:r>
+          </w:p>
+        </w:tc>
+      </w:tr>
+      <w:tr>
+        <w:tc>
+          <w:tcPr>
+            <w:tcW w:type="dxa" w:w="2300"/>
+            <w:tcBorders>
+              <w:top w:val="single" w:color="D9D5CB" w:sz="4"/>
+              <w:left w:val="single" w:color="D9D5CB" w:sz="4"/>
+              <w:bottom w:val="single" w:color="D9D5CB" w:sz="4"/>
+              <w:right w:val="single" w:color="D9D5CB" w:sz="4"/>
+            </w:tcBorders>
+            <w:tcMar>
+              <w:top w:type="dxa" w:w="60"/>
+              <w:left w:type="dxa" w:w="90"/>
+              <w:bottom w:type="dxa" w:w="60"/>
+              <w:right w:type="dxa" w:w="90"/>
+            </w:tcMar>
+            <w:vAlign w:val="top"/>
+          </w:tcPr>
+          <w:p>
+            <w:pPr>
+              <w:spacing w:after="40"/>
+            </w:pPr>
+            <w:r>
+              <w:rPr>
+                <w:rFonts w:ascii="Calibri" w:cs="Calibri" w:eastAsia="Calibri" w:hAnsi="Calibri"/>
+                <w:b/>
+                <w:bCs/>
+                <w:color w:val="14213D"/>
+                <w:sz w:val="20"/>
+                <w:szCs w:val="20"/>
+              </w:rPr>
+              <w:t xml:space="preserve">Planning : recherche et filtres</w:t>
+            </w:r>
+          </w:p>
+        </w:tc>
+        <w:tc>
+          <w:tcPr>
+            <w:tcW w:type="dxa" w:w="4100"/>
+            <w:tcBorders>
+              <w:top w:val="single" w:color="D9D5CB" w:sz="4"/>
+              <w:left w:val="single" w:color="D9D5CB" w:sz="4"/>
+              <w:bottom w:val="single" w:color="D9D5CB" w:sz="4"/>
+              <w:right w:val="single" w:color="D9D5CB" w:sz="4"/>
+            </w:tcBorders>
+            <w:tcMar>
+              <w:top w:type="dxa" w:w="60"/>
+              <w:left w:type="dxa" w:w="90"/>
+              <w:bottom w:type="dxa" w:w="60"/>
+              <w:right w:type="dxa" w:w="90"/>
+            </w:tcMar>
+            <w:vAlign w:val="top"/>
+          </w:tcPr>
+          <w:p>
+            <w:pPr>
+              <w:spacing w:after="40"/>
+            </w:pPr>
+            <w:r>
+              <w:rPr>
+                <w:rFonts w:ascii="Calibri" w:cs="Calibri" w:eastAsia="Calibri" w:hAnsi="Calibri"/>
+                <w:color w:val="14213D"/>
+                <w:sz w:val="19"/>
+                <w:szCs w:val="19"/>
+              </w:rPr>
+              <w:t xml:space="preserve">Exploitation → Planning des équipes → « À placer » : barre « Chercher quelqu'un » (nom, prénom, poste — accents ignorés) et chips par poste (soudeurs, tuyauteurs, manchonneurs, act. spéc., chauffeurs, aides, chefs, intérim ; encadrement si « Avec l'encadrement »). En tapant un nom, les autres personnes s'estompent aussi sur les chantiers : on repère tout de suite où est quelqu'un.</w:t>
+            </w:r>
+          </w:p>
+        </w:tc>
+        <w:tc>
+          <w:tcPr>
+            <w:tcW w:type="dxa" w:w="3700"/>
+            <w:tcBorders>
+              <w:top w:val="single" w:color="D9D5CB" w:sz="4"/>
+              <w:left w:val="single" w:color="D9D5CB" w:sz="4"/>
+              <w:bottom w:val="single" w:color="D9D5CB" w:sz="4"/>
+              <w:right w:val="single" w:color="D9D5CB" w:sz="4"/>
+            </w:tcBorders>
+            <w:tcMar>
+              <w:top w:type="dxa" w:w="60"/>
+              <w:left w:type="dxa" w:w="90"/>
+              <w:bottom w:type="dxa" w:w="60"/>
+              <w:right w:type="dxa" w:w="90"/>
+            </w:tcMar>
+            <w:vAlign w:val="top"/>
+          </w:tcPr>
+          <w:p>
+            <w:pPr>
+              <w:spacing w:after="40"/>
+            </w:pPr>
+            <w:r>
+              <w:rPr>
+                <w:rFonts w:ascii="Calibri" w:cs="Calibri" w:eastAsia="Calibri" w:hAnsi="Calibri"/>
+                <w:color w:val="14213D"/>
+                <w:sz w:val="19"/>
+                <w:szCs w:val="19"/>
+              </w:rPr>
+              <w:t xml:space="preserve"/>
+            </w:r>
+          </w:p>
+        </w:tc>
+        <w:tc>
+          <w:tcPr>
+            <w:tcW w:type="dxa" w:w="1300"/>
+            <w:tcBorders>
+              <w:top w:val="single" w:color="D9D5CB" w:sz="4"/>
+              <w:left w:val="single" w:color="D9D5CB" w:sz="4"/>
+              <w:bottom w:val="single" w:color="D9D5CB" w:sz="4"/>
+              <w:right w:val="single" w:color="D9D5CB" w:sz="4"/>
+            </w:tcBorders>
+            <w:shd w:fill="E6F5EC" w:color="auto" w:val="clear"/>
+            <w:tcMar>
+              <w:top w:type="dxa" w:w="60"/>
+              <w:left w:type="dxa" w:w="90"/>
+              <w:bottom w:type="dxa" w:w="60"/>
+              <w:right w:type="dxa" w:w="90"/>
+            </w:tcMar>
+            <w:vAlign w:val="top"/>
+          </w:tcPr>
+          <w:p>
+            <w:pPr>
+              <w:spacing w:after="40"/>
+            </w:pPr>
+            <w:r>
+              <w:rPr>
+                <w:rFonts w:ascii="Calibri" w:cs="Calibri" w:eastAsia="Calibri" w:hAnsi="Calibri"/>
+                <w:b/>
+                <w:bCs/>
+                <w:color w:val="14213D"/>
+                <w:sz w:val="19"/>
+                <w:szCs w:val="19"/>
+              </w:rPr>
+              <w:t xml:space="preserve">Fait</w:t>
+            </w:r>
+          </w:p>
+        </w:tc>
+        <w:tc>
+          <w:tcPr>
+            <w:tcW w:type="dxa" w:w="3700"/>
+            <w:tcBorders>
+              <w:top w:val="single" w:color="D9D5CB" w:sz="4"/>
+              <w:left w:val="single" w:color="D9D5CB" w:sz="4"/>
+              <w:bottom w:val="single" w:color="D9D5CB" w:sz="4"/>
+              <w:right w:val="single" w:color="D9D5CB" w:sz="4"/>
+            </w:tcBorders>
+            <w:tcMar>
+              <w:top w:type="dxa" w:w="60"/>
+              <w:left w:type="dxa" w:w="90"/>
+              <w:bottom w:type="dxa" w:w="60"/>
+              <w:right w:type="dxa" w:w="90"/>
+            </w:tcMar>
+            <w:vAlign w:val="top"/>
+          </w:tcPr>
+          <w:p>
+            <w:pPr>
+              <w:spacing w:after="40"/>
+            </w:pPr>
+            <w:r>
+              <w:rPr>
+                <w:rFonts w:ascii="Calibri" w:cs="Calibri" w:eastAsia="Calibri" w:hAnsi="Calibri"/>
+                <w:color w:val="14213D"/>
+                <w:sz w:val="20"/>
+                <w:szCs w:val="20"/>
+              </w:rPr>
+              <w:t xml:space="preserve"/>
+            </w:r>
+          </w:p>
+          <w:p>
+            <w:pPr>
+              <w:spacing w:after="40"/>
+            </w:pPr>
+            <w:r>
+              <w:rPr>
+                <w:rFonts w:ascii="Calibri" w:cs="Calibri" w:eastAsia="Calibri" w:hAnsi="Calibri"/>
+                <w:color w:val="14213D"/>
+                <w:sz w:val="20"/>
+                <w:szCs w:val="20"/>
+              </w:rPr>
+              <w:t xml:space="preserve"/>
+            </w:r>
+          </w:p>
+        </w:tc>
+      </w:tr>
+      <w:tr>
+        <w:tc>
+          <w:tcPr>
+            <w:tcW w:type="dxa" w:w="2300"/>
+            <w:tcBorders>
+              <w:top w:val="single" w:color="D9D5CB" w:sz="4"/>
+              <w:left w:val="single" w:color="D9D5CB" w:sz="4"/>
+              <w:bottom w:val="single" w:color="D9D5CB" w:sz="4"/>
+              <w:right w:val="single" w:color="D9D5CB" w:sz="4"/>
+            </w:tcBorders>
+            <w:tcMar>
+              <w:top w:type="dxa" w:w="60"/>
+              <w:left w:type="dxa" w:w="90"/>
+              <w:bottom w:type="dxa" w:w="60"/>
+              <w:right w:type="dxa" w:w="90"/>
+            </w:tcMar>
+            <w:vAlign w:val="top"/>
+          </w:tcPr>
+          <w:p>
+            <w:pPr>
+              <w:spacing w:after="40"/>
+            </w:pPr>
+            <w:r>
+              <w:rPr>
+                <w:rFonts w:ascii="Calibri" w:cs="Calibri" w:eastAsia="Calibri" w:hAnsi="Calibri"/>
+                <w:b/>
+                <w:bCs/>
+                <w:color w:val="14213D"/>
+                <w:sz w:val="20"/>
+                <w:szCs w:val="20"/>
+              </w:rPr>
+              <w:t xml:space="preserve">Planning : deux équipes sur le même chantier</w:t>
+            </w:r>
+          </w:p>
+        </w:tc>
+        <w:tc>
+          <w:tcPr>
+            <w:tcW w:type="dxa" w:w="4100"/>
+            <w:tcBorders>
+              <w:top w:val="single" w:color="D9D5CB" w:sz="4"/>
+              <w:left w:val="single" w:color="D9D5CB" w:sz="4"/>
+              <w:bottom w:val="single" w:color="D9D5CB" w:sz="4"/>
+              <w:right w:val="single" w:color="D9D5CB" w:sz="4"/>
+            </w:tcBorders>
+            <w:tcMar>
+              <w:top w:type="dxa" w:w="60"/>
+              <w:left w:type="dxa" w:w="90"/>
+              <w:bottom w:type="dxa" w:w="60"/>
+              <w:right w:type="dxa" w:w="90"/>
+            </w:tcMar>
+            <w:vAlign w:val="top"/>
+          </w:tcPr>
+          <w:p>
+            <w:pPr>
+              <w:spacing w:after="40"/>
+            </w:pPr>
+            <w:r>
+              <w:rPr>
+                <w:rFonts w:ascii="Calibri" w:cs="Calibri" w:eastAsia="Calibri" w:hAnsi="Calibri"/>
+                <w:color w:val="14213D"/>
+                <w:sz w:val="19"/>
+                <w:szCs w:val="19"/>
+              </w:rPr>
+              <w:t xml:space="preserve">Quand tu as choisi quelqu'un, la carte du chantier propose « Dans : — / Équipe A / B / C » avant « Placer ici ». Les gens apparaissent groupés par équipe (en-tête « Équipe A · chef : X · n », pastille colorée sur chaque personne). Toucher une personne placée → « Équipe sur ce chantier » pour la changer. L'équipe suit « Reprendre la semaine passée ».</w:t>
+            </w:r>
+          </w:p>
+        </w:tc>
+        <w:tc>
+          <w:tcPr>
+            <w:tcW w:type="dxa" w:w="3700"/>
+            <w:tcBorders>
+              <w:top w:val="single" w:color="D9D5CB" w:sz="4"/>
+              <w:left w:val="single" w:color="D9D5CB" w:sz="4"/>
+              <w:bottom w:val="single" w:color="D9D5CB" w:sz="4"/>
+              <w:right w:val="single" w:color="D9D5CB" w:sz="4"/>
+            </w:tcBorders>
+            <w:tcMar>
+              <w:top w:type="dxa" w:w="60"/>
+              <w:left w:type="dxa" w:w="90"/>
+              <w:bottom w:type="dxa" w:w="60"/>
+              <w:right w:type="dxa" w:w="90"/>
+            </w:tcMar>
+            <w:vAlign w:val="top"/>
+          </w:tcPr>
+          <w:p>
+            <w:pPr>
+              <w:spacing w:after="40"/>
+            </w:pPr>
+            <w:r>
+              <w:rPr>
+                <w:rFonts w:ascii="Calibri" w:cs="Calibri" w:eastAsia="Calibri" w:hAnsi="Calibri"/>
+                <w:color w:val="14213D"/>
+                <w:sz w:val="19"/>
+                <w:szCs w:val="19"/>
+              </w:rPr>
+              <w:t xml:space="preserve">Trois équipes max par chantier (A, B, C) ; dis-moi s'il en faut plus ou des noms libres.</w:t>
+            </w:r>
+          </w:p>
+        </w:tc>
+        <w:tc>
+          <w:tcPr>
+            <w:tcW w:type="dxa" w:w="1300"/>
+            <w:tcBorders>
+              <w:top w:val="single" w:color="D9D5CB" w:sz="4"/>
+              <w:left w:val="single" w:color="D9D5CB" w:sz="4"/>
+              <w:bottom w:val="single" w:color="D9D5CB" w:sz="4"/>
+              <w:right w:val="single" w:color="D9D5CB" w:sz="4"/>
+            </w:tcBorders>
+            <w:shd w:fill="E6F5EC" w:color="auto" w:val="clear"/>
+            <w:tcMar>
+              <w:top w:type="dxa" w:w="60"/>
+              <w:left w:type="dxa" w:w="90"/>
+              <w:bottom w:type="dxa" w:w="60"/>
+              <w:right w:type="dxa" w:w="90"/>
+            </w:tcMar>
+            <w:vAlign w:val="top"/>
+          </w:tcPr>
+          <w:p>
+            <w:pPr>
+              <w:spacing w:after="40"/>
+            </w:pPr>
+            <w:r>
+              <w:rPr>
+                <w:rFonts w:ascii="Calibri" w:cs="Calibri" w:eastAsia="Calibri" w:hAnsi="Calibri"/>
+                <w:b/>
+                <w:bCs/>
+                <w:color w:val="14213D"/>
+                <w:sz w:val="19"/>
+                <w:szCs w:val="19"/>
+              </w:rPr>
+              <w:t xml:space="preserve">Fait</w:t>
+            </w:r>
+          </w:p>
+        </w:tc>
+        <w:tc>
+          <w:tcPr>
+            <w:tcW w:type="dxa" w:w="3700"/>
+            <w:tcBorders>
+              <w:top w:val="single" w:color="D9D5CB" w:sz="4"/>
+              <w:left w:val="single" w:color="D9D5CB" w:sz="4"/>
+              <w:bottom w:val="single" w:color="D9D5CB" w:sz="4"/>
+              <w:right w:val="single" w:color="D9D5CB" w:sz="4"/>
+            </w:tcBorders>
+            <w:tcMar>
+              <w:top w:type="dxa" w:w="60"/>
+              <w:left w:type="dxa" w:w="90"/>
+              <w:bottom w:type="dxa" w:w="60"/>
+              <w:right w:type="dxa" w:w="90"/>
+            </w:tcMar>
+            <w:vAlign w:val="top"/>
+          </w:tcPr>
+          <w:p>
+            <w:pPr>
+              <w:spacing w:after="40"/>
+            </w:pPr>
+            <w:r>
+              <w:rPr>
+                <w:rFonts w:ascii="Calibri" w:cs="Calibri" w:eastAsia="Calibri" w:hAnsi="Calibri"/>
+                <w:color w:val="14213D"/>
+                <w:sz w:val="20"/>
+                <w:szCs w:val="20"/>
+              </w:rPr>
+              <w:t xml:space="preserve"/>
+            </w:r>
+          </w:p>
+          <w:p>
+            <w:pPr>
+              <w:spacing w:after="40"/>
+            </w:pPr>
+            <w:r>
+              <w:rPr>
+                <w:rFonts w:ascii="Calibri" w:cs="Calibri" w:eastAsia="Calibri" w:hAnsi="Calibri"/>
+                <w:color w:val="14213D"/>
+                <w:sz w:val="20"/>
+                <w:szCs w:val="20"/>
+              </w:rPr>
+              <w:t xml:space="preserve"/>
+            </w:r>
+          </w:p>
+        </w:tc>
+      </w:tr>
+      <w:tr>
+        <w:tc>
+          <w:tcPr>
+            <w:tcW w:type="dxa" w:w="2300"/>
+            <w:tcBorders>
+              <w:top w:val="single" w:color="D9D5CB" w:sz="4"/>
+              <w:left w:val="single" w:color="D9D5CB" w:sz="4"/>
+              <w:bottom w:val="single" w:color="D9D5CB" w:sz="4"/>
+              <w:right w:val="single" w:color="D9D5CB" w:sz="4"/>
+            </w:tcBorders>
+            <w:tcMar>
+              <w:top w:type="dxa" w:w="60"/>
+              <w:left w:type="dxa" w:w="90"/>
+              <w:bottom w:type="dxa" w:w="60"/>
+              <w:right w:type="dxa" w:w="90"/>
+            </w:tcMar>
+            <w:vAlign w:val="top"/>
+          </w:tcPr>
+          <w:p>
+            <w:pPr>
+              <w:spacing w:after="40"/>
+            </w:pPr>
+            <w:r>
+              <w:rPr>
+                <w:rFonts w:ascii="Calibri" w:cs="Calibri" w:eastAsia="Calibri" w:hAnsi="Calibri"/>
+                <w:b/>
+                <w:bCs/>
+                <w:color w:val="14213D"/>
+                <w:sz w:val="20"/>
+                <w:szCs w:val="20"/>
+              </w:rPr>
+              <w:t xml:space="preserve">Planning : chef en autonomie, conduite de travaux</w:t>
+            </w:r>
+          </w:p>
+        </w:tc>
+        <w:tc>
+          <w:tcPr>
+            <w:tcW w:type="dxa" w:w="4100"/>
+            <w:tcBorders>
+              <w:top w:val="single" w:color="D9D5CB" w:sz="4"/>
+              <w:left w:val="single" w:color="D9D5CB" w:sz="4"/>
+              <w:bottom w:val="single" w:color="D9D5CB" w:sz="4"/>
+              <w:right w:val="single" w:color="D9D5CB" w:sz="4"/>
+            </w:tcBorders>
+            <w:tcMar>
+              <w:top w:type="dxa" w:w="60"/>
+              <w:left w:type="dxa" w:w="90"/>
+              <w:bottom w:type="dxa" w:w="60"/>
+              <w:right w:type="dxa" w:w="90"/>
+            </w:tcMar>
+            <w:vAlign w:val="top"/>
+          </w:tcPr>
+          <w:p>
+            <w:pPr>
+              <w:spacing w:after="40"/>
+            </w:pPr>
+            <w:r>
+              <w:rPr>
+                <w:rFonts w:ascii="Calibri" w:cs="Calibri" w:eastAsia="Calibri" w:hAnsi="Calibri"/>
+                <w:color w:val="14213D"/>
+                <w:sz w:val="19"/>
+                <w:szCs w:val="19"/>
+              </w:rPr>
+              <w:t xml:space="preserve">Un chef de chantier placé sur deux chantiers le même jour apparaît avec un liseré violet et « chef de chantier · en autonomie : aussi sur … » sur les deux cartes. Un conducteur / responsable placé (« Avec l'encadrement ») apparaît en pointillé bleu « conduite de travaux » (« conducteur de ce chantier » si c'est lui dans la fiche ⚙).</w:t>
+            </w:r>
+          </w:p>
+        </w:tc>
+        <w:tc>
+          <w:tcPr>
+            <w:tcW w:type="dxa" w:w="3700"/>
+            <w:tcBorders>
+              <w:top w:val="single" w:color="D9D5CB" w:sz="4"/>
+              <w:left w:val="single" w:color="D9D5CB" w:sz="4"/>
+              <w:bottom w:val="single" w:color="D9D5CB" w:sz="4"/>
+              <w:right w:val="single" w:color="D9D5CB" w:sz="4"/>
+            </w:tcBorders>
+            <w:tcMar>
+              <w:top w:type="dxa" w:w="60"/>
+              <w:left w:type="dxa" w:w="90"/>
+              <w:bottom w:type="dxa" w:w="60"/>
+              <w:right w:type="dxa" w:w="90"/>
+            </w:tcMar>
+            <w:vAlign w:val="top"/>
+          </w:tcPr>
+          <w:p>
+            <w:pPr>
+              <w:spacing w:after="40"/>
+            </w:pPr>
+            <w:r>
+              <w:rPr>
+                <w:rFonts w:ascii="Calibri" w:cs="Calibri" w:eastAsia="Calibri" w:hAnsi="Calibri"/>
+                <w:color w:val="14213D"/>
+                <w:sz w:val="19"/>
+                <w:szCs w:val="19"/>
+              </w:rPr>
+              <w:t xml:space="preserve">Le « chef de ce chantier » / « conducteur de ce chantier » viennent de la fiche ⚙ du chantier : renseigne-les, c'est aussi ce que lit l'accueil chantier (point 5) et le contrôle chantier.</w:t>
             </w:r>
           </w:p>
         </w:tc>

</xml_diff>

<commit_message>
Section 4 : objectif posé sur le plan + surbrillance opérateur, équipes/cible dans l'objectif, gars sur deux chantiers (jours), bac à sable étanche (demo_/l:) — 40 suites
</commit_message>
<xml_diff>
--- a/app/docs/Feuille_de_route_nuit_09-10-10.docx
+++ b/app/docs/Feuille_de_route_nuit_09-10-10.docx
@@ -84,7 +84,7 @@
           <w:sz w:val="20"/>
           <w:szCs w:val="20"/>
         </w:rPr>
-        <w:t xml:space="preserve">Build livré : 10/10/2026 · 5ee302 (retours du matin, 12 quarts d'heure SCR, planning) (index.html + traceur.html à la racine du dépôt). Sources : app/src (reg.js, docs.js, prevention.js, accueil.js, affaires.js, flotte.js, rh.js, commandes.js, reglement.js + app.js, espace.js, next.js, acces.js, sync.js). Notes techniques : app/NOTES.md.</w:t>
+        <w:t xml:space="preserve">Build livré : 10/10/2026 · c8eafe (retours des points 1 à 4, 12 quarts d'heure SCR, planning, objectif sur le plan, bac à sable) (index.html + traceur.html à la racine du dépôt). Sources : app/src (reg.js, docs.js, prevention.js, accueil.js, affaires.js, flotte.js, rh.js, commandes.js, reglement.js + app.js, espace.js, next.js, acces.js, sync.js). Notes techniques : app/NOTES.md.</w:t>
       </w:r>
     </w:p>
     <w:p>
@@ -122,7 +122,7 @@
           <w:sz w:val="20"/>
           <w:szCs w:val="20"/>
         </w:rPr>
-        <w:t xml:space="preserve">Règle gardée toute la nuit : rien d'ancien n'est supprimé ; 37 suites de tests automatiques passent (30 anciennes + docs, objectifs, affaires, flotte &amp; RH, 3e vague, bureau, retours du 10/10).</w:t>
+        <w:t xml:space="preserve">Règle gardée toute la nuit : rien d'ancien n'est supprimé ; 40 suites de tests automatiques passent (30 anciennes + docs, objectifs, affaires, flotte &amp; RH, 3e vague, bureau, retours du 10/10, planning, objectif sur le plan, bac à sable).</w:t>
       </w:r>
     </w:p>
     <w:p>
@@ -868,7 +868,7 @@
           <w:sz w:val="30"/>
           <w:szCs w:val="30"/>
         </w:rPr>
-        <w:t xml:space="preserve">0 · Tes retours du 10/10 (points 1 à 3) — ce que j'ai fait ce matin</w:t>
+        <w:t xml:space="preserve">0 · Tes retours du 10/10 (points 1 à 4) — ce que j'ai fait aujourd'hui</w:t>
       </w:r>
     </w:p>
     <w:p>
@@ -4473,6 +4473,911 @@
                 <w:szCs w:val="19"/>
               </w:rPr>
               <w:t xml:space="preserve">—</w:t>
+            </w:r>
+          </w:p>
+        </w:tc>
+        <w:tc>
+          <w:tcPr>
+            <w:tcW w:type="dxa" w:w="3700"/>
+            <w:tcBorders>
+              <w:top w:val="single" w:color="D9D5CB" w:sz="4"/>
+              <w:left w:val="single" w:color="D9D5CB" w:sz="4"/>
+              <w:bottom w:val="single" w:color="D9D5CB" w:sz="4"/>
+              <w:right w:val="single" w:color="D9D5CB" w:sz="4"/>
+            </w:tcBorders>
+            <w:tcMar>
+              <w:top w:type="dxa" w:w="60"/>
+              <w:left w:type="dxa" w:w="90"/>
+              <w:bottom w:type="dxa" w:w="60"/>
+              <w:right w:type="dxa" w:w="90"/>
+            </w:tcMar>
+            <w:vAlign w:val="top"/>
+          </w:tcPr>
+          <w:p>
+            <w:pPr>
+              <w:spacing w:after="40"/>
+            </w:pPr>
+            <w:r>
+              <w:rPr>
+                <w:rFonts w:ascii="Calibri" w:cs="Calibri" w:eastAsia="Calibri" w:hAnsi="Calibri"/>
+                <w:color w:val="14213D"/>
+                <w:sz w:val="20"/>
+                <w:szCs w:val="20"/>
+              </w:rPr>
+              <w:t xml:space="preserve"/>
+            </w:r>
+          </w:p>
+          <w:p>
+            <w:pPr>
+              <w:spacing w:after="40"/>
+            </w:pPr>
+            <w:r>
+              <w:rPr>
+                <w:rFonts w:ascii="Calibri" w:cs="Calibri" w:eastAsia="Calibri" w:hAnsi="Calibri"/>
+                <w:color w:val="14213D"/>
+                <w:sz w:val="20"/>
+                <w:szCs w:val="20"/>
+              </w:rPr>
+              <w:t xml:space="preserve"/>
+            </w:r>
+          </w:p>
+        </w:tc>
+      </w:tr>
+      <w:tr>
+        <w:tc>
+          <w:tcPr>
+            <w:tcW w:type="dxa" w:w="2300"/>
+            <w:tcBorders>
+              <w:top w:val="single" w:color="D9D5CB" w:sz="4"/>
+              <w:left w:val="single" w:color="D9D5CB" w:sz="4"/>
+              <w:bottom w:val="single" w:color="D9D5CB" w:sz="4"/>
+              <w:right w:val="single" w:color="D9D5CB" w:sz="4"/>
+            </w:tcBorders>
+            <w:tcMar>
+              <w:top w:type="dxa" w:w="60"/>
+              <w:left w:type="dxa" w:w="90"/>
+              <w:bottom w:type="dxa" w:w="60"/>
+              <w:right w:type="dxa" w:w="90"/>
+            </w:tcMar>
+            <w:vAlign w:val="top"/>
+          </w:tcPr>
+          <w:p>
+            <w:pPr>
+              <w:spacing w:after="40"/>
+            </w:pPr>
+            <w:r>
+              <w:rPr>
+                <w:rFonts w:ascii="Calibri" w:cs="Calibri" w:eastAsia="Calibri" w:hAnsi="Calibri"/>
+                <w:b/>
+                <w:bCs/>
+                <w:color w:val="14213D"/>
+                <w:sz w:val="20"/>
+                <w:szCs w:val="20"/>
+              </w:rPr>
+              <w:t xml:space="preserve">Objectif posé sur le plan</w:t>
+            </w:r>
+          </w:p>
+        </w:tc>
+        <w:tc>
+          <w:tcPr>
+            <w:tcW w:type="dxa" w:w="4100"/>
+            <w:tcBorders>
+              <w:top w:val="single" w:color="D9D5CB" w:sz="4"/>
+              <w:left w:val="single" w:color="D9D5CB" w:sz="4"/>
+              <w:bottom w:val="single" w:color="D9D5CB" w:sz="4"/>
+              <w:right w:val="single" w:color="D9D5CB" w:sz="4"/>
+            </w:tcBorders>
+            <w:tcMar>
+              <w:top w:type="dxa" w:w="60"/>
+              <w:left w:type="dxa" w:w="90"/>
+              <w:bottom w:type="dxa" w:w="60"/>
+              <w:right w:type="dxa" w:w="90"/>
+            </w:tcMar>
+            <w:vAlign w:val="top"/>
+          </w:tcPr>
+          <w:p>
+            <w:pPr>
+              <w:spacing w:after="40"/>
+            </w:pPr>
+            <w:r>
+              <w:rPr>
+                <w:rFonts w:ascii="Calibri" w:cs="Calibri" w:eastAsia="Calibri" w:hAnsi="Calibri"/>
+                <w:color w:val="14213D"/>
+                <w:sz w:val="19"/>
+                <w:szCs w:val="19"/>
+              </w:rPr>
+              <w:t xml:space="preserve">Exploitation → Objectifs de la journée → ➕ : libellé, heures, qui, puis « 📐 Poser sur le plan » : le chantier s'ouvre sur le plan avec la barre de pose (début, fin, sur un tronçon — comme une phase) → « Poser l'objectif ». Dans la liste : « 📐 Feeder · PK 25 → 100 » et bouton 🗺 (plan avec l'objectif en surbrillance). Le menu existant est gardé tel quel.</w:t>
+            </w:r>
+          </w:p>
+        </w:tc>
+        <w:tc>
+          <w:tcPr>
+            <w:tcW w:type="dxa" w:w="3700"/>
+            <w:tcBorders>
+              <w:top w:val="single" w:color="D9D5CB" w:sz="4"/>
+              <w:left w:val="single" w:color="D9D5CB" w:sz="4"/>
+              <w:bottom w:val="single" w:color="D9D5CB" w:sz="4"/>
+              <w:right w:val="single" w:color="D9D5CB" w:sz="4"/>
+            </w:tcBorders>
+            <w:tcMar>
+              <w:top w:type="dxa" w:w="60"/>
+              <w:left w:type="dxa" w:w="90"/>
+              <w:bottom w:type="dxa" w:w="60"/>
+              <w:right w:type="dxa" w:w="90"/>
+            </w:tcMar>
+            <w:vAlign w:val="top"/>
+          </w:tcPr>
+          <w:p>
+            <w:pPr>
+              <w:spacing w:after="40"/>
+            </w:pPr>
+            <w:r>
+              <w:rPr>
+                <w:rFonts w:ascii="Calibri" w:cs="Calibri" w:eastAsia="Calibri" w:hAnsi="Calibri"/>
+                <w:color w:val="14213D"/>
+                <w:sz w:val="19"/>
+                <w:szCs w:val="19"/>
+              </w:rPr>
+              <w:t xml:space="preserve">Un objectif sans tronçon reste possible (« Décharger le camion »).</w:t>
+            </w:r>
+          </w:p>
+        </w:tc>
+        <w:tc>
+          <w:tcPr>
+            <w:tcW w:type="dxa" w:w="1300"/>
+            <w:tcBorders>
+              <w:top w:val="single" w:color="D9D5CB" w:sz="4"/>
+              <w:left w:val="single" w:color="D9D5CB" w:sz="4"/>
+              <w:bottom w:val="single" w:color="D9D5CB" w:sz="4"/>
+              <w:right w:val="single" w:color="D9D5CB" w:sz="4"/>
+            </w:tcBorders>
+            <w:shd w:fill="E6F5EC" w:color="auto" w:val="clear"/>
+            <w:tcMar>
+              <w:top w:type="dxa" w:w="60"/>
+              <w:left w:type="dxa" w:w="90"/>
+              <w:bottom w:type="dxa" w:w="60"/>
+              <w:right w:type="dxa" w:w="90"/>
+            </w:tcMar>
+            <w:vAlign w:val="top"/>
+          </w:tcPr>
+          <w:p>
+            <w:pPr>
+              <w:spacing w:after="40"/>
+            </w:pPr>
+            <w:r>
+              <w:rPr>
+                <w:rFonts w:ascii="Calibri" w:cs="Calibri" w:eastAsia="Calibri" w:hAnsi="Calibri"/>
+                <w:b/>
+                <w:bCs/>
+                <w:color w:val="14213D"/>
+                <w:sz w:val="19"/>
+                <w:szCs w:val="19"/>
+              </w:rPr>
+              <w:t xml:space="preserve">Fait</w:t>
+            </w:r>
+          </w:p>
+        </w:tc>
+        <w:tc>
+          <w:tcPr>
+            <w:tcW w:type="dxa" w:w="3700"/>
+            <w:tcBorders>
+              <w:top w:val="single" w:color="D9D5CB" w:sz="4"/>
+              <w:left w:val="single" w:color="D9D5CB" w:sz="4"/>
+              <w:bottom w:val="single" w:color="D9D5CB" w:sz="4"/>
+              <w:right w:val="single" w:color="D9D5CB" w:sz="4"/>
+            </w:tcBorders>
+            <w:tcMar>
+              <w:top w:type="dxa" w:w="60"/>
+              <w:left w:type="dxa" w:w="90"/>
+              <w:bottom w:type="dxa" w:w="60"/>
+              <w:right w:type="dxa" w:w="90"/>
+            </w:tcMar>
+            <w:vAlign w:val="top"/>
+          </w:tcPr>
+          <w:p>
+            <w:pPr>
+              <w:spacing w:after="40"/>
+            </w:pPr>
+            <w:r>
+              <w:rPr>
+                <w:rFonts w:ascii="Calibri" w:cs="Calibri" w:eastAsia="Calibri" w:hAnsi="Calibri"/>
+                <w:color w:val="14213D"/>
+                <w:sz w:val="20"/>
+                <w:szCs w:val="20"/>
+              </w:rPr>
+              <w:t xml:space="preserve"/>
+            </w:r>
+          </w:p>
+          <w:p>
+            <w:pPr>
+              <w:spacing w:after="40"/>
+            </w:pPr>
+            <w:r>
+              <w:rPr>
+                <w:rFonts w:ascii="Calibri" w:cs="Calibri" w:eastAsia="Calibri" w:hAnsi="Calibri"/>
+                <w:color w:val="14213D"/>
+                <w:sz w:val="20"/>
+                <w:szCs w:val="20"/>
+              </w:rPr>
+              <w:t xml:space="preserve"/>
+            </w:r>
+          </w:p>
+        </w:tc>
+      </w:tr>
+      <w:tr>
+        <w:tc>
+          <w:tcPr>
+            <w:tcW w:type="dxa" w:w="2300"/>
+            <w:tcBorders>
+              <w:top w:val="single" w:color="D9D5CB" w:sz="4"/>
+              <w:left w:val="single" w:color="D9D5CB" w:sz="4"/>
+              <w:bottom w:val="single" w:color="D9D5CB" w:sz="4"/>
+              <w:right w:val="single" w:color="D9D5CB" w:sz="4"/>
+            </w:tcBorders>
+            <w:tcMar>
+              <w:top w:type="dxa" w:w="60"/>
+              <w:left w:type="dxa" w:w="90"/>
+              <w:bottom w:type="dxa" w:w="60"/>
+              <w:right w:type="dxa" w:w="90"/>
+            </w:tcMar>
+            <w:vAlign w:val="top"/>
+          </w:tcPr>
+          <w:p>
+            <w:pPr>
+              <w:spacing w:after="40"/>
+            </w:pPr>
+            <w:r>
+              <w:rPr>
+                <w:rFonts w:ascii="Calibri" w:cs="Calibri" w:eastAsia="Calibri" w:hAnsi="Calibri"/>
+                <w:b/>
+                <w:bCs/>
+                <w:color w:val="14213D"/>
+                <w:sz w:val="20"/>
+                <w:szCs w:val="20"/>
+              </w:rPr>
+              <w:t xml:space="preserve">L'opérateur voit son objectif en surbrillance</w:t>
+            </w:r>
+          </w:p>
+        </w:tc>
+        <w:tc>
+          <w:tcPr>
+            <w:tcW w:type="dxa" w:w="4100"/>
+            <w:tcBorders>
+              <w:top w:val="single" w:color="D9D5CB" w:sz="4"/>
+              <w:left w:val="single" w:color="D9D5CB" w:sz="4"/>
+              <w:bottom w:val="single" w:color="D9D5CB" w:sz="4"/>
+              <w:right w:val="single" w:color="D9D5CB" w:sz="4"/>
+            </w:tcBorders>
+            <w:tcMar>
+              <w:top w:type="dxa" w:w="60"/>
+              <w:left w:type="dxa" w:w="90"/>
+              <w:bottom w:type="dxa" w:w="60"/>
+              <w:right w:type="dxa" w:w="90"/>
+            </w:tcMar>
+            <w:vAlign w:val="top"/>
+          </w:tcPr>
+          <w:p>
+            <w:pPr>
+              <w:spacing w:after="40"/>
+            </w:pPr>
+            <w:r>
+              <w:rPr>
+                <w:rFonts w:ascii="Calibri" w:cs="Calibri" w:eastAsia="Calibri" w:hAnsi="Calibri"/>
+                <w:color w:val="14213D"/>
+                <w:sz w:val="19"/>
+                <w:szCs w:val="19"/>
+              </w:rPr>
+              <w:t xml:space="preserve">Karim ouvre son chantier : onglet Bureau → « Objectif du jour : … · équipe A · 📐 Feeder · PK 25 → 100 · en surbrillance 🎯 sur le plan » (cliquable → plan) ; sur le plan, SON tronçon est surligné avec l'étiquette 🎯. Mon espace et l'accueil le disent aussi.</w:t>
+            </w:r>
+          </w:p>
+        </w:tc>
+        <w:tc>
+          <w:tcPr>
+            <w:tcW w:type="dxa" w:w="3700"/>
+            <w:tcBorders>
+              <w:top w:val="single" w:color="D9D5CB" w:sz="4"/>
+              <w:left w:val="single" w:color="D9D5CB" w:sz="4"/>
+              <w:bottom w:val="single" w:color="D9D5CB" w:sz="4"/>
+              <w:right w:val="single" w:color="D9D5CB" w:sz="4"/>
+            </w:tcBorders>
+            <w:tcMar>
+              <w:top w:type="dxa" w:w="60"/>
+              <w:left w:type="dxa" w:w="90"/>
+              <w:bottom w:type="dxa" w:w="60"/>
+              <w:right w:type="dxa" w:w="90"/>
+            </w:tcMar>
+            <w:vAlign w:val="top"/>
+          </w:tcPr>
+          <w:p>
+            <w:pPr>
+              <w:spacing w:after="40"/>
+            </w:pPr>
+            <w:r>
+              <w:rPr>
+                <w:rFonts w:ascii="Calibri" w:cs="Calibri" w:eastAsia="Calibri" w:hAnsi="Calibri"/>
+                <w:color w:val="14213D"/>
+                <w:sz w:val="19"/>
+                <w:szCs w:val="19"/>
+              </w:rPr>
+              <w:t xml:space="preserve">Seul l'objectif de la personne (ou de son équipe) est surligné, pas ceux des autres.</w:t>
+            </w:r>
+          </w:p>
+        </w:tc>
+        <w:tc>
+          <w:tcPr>
+            <w:tcW w:type="dxa" w:w="1300"/>
+            <w:tcBorders>
+              <w:top w:val="single" w:color="D9D5CB" w:sz="4"/>
+              <w:left w:val="single" w:color="D9D5CB" w:sz="4"/>
+              <w:bottom w:val="single" w:color="D9D5CB" w:sz="4"/>
+              <w:right w:val="single" w:color="D9D5CB" w:sz="4"/>
+            </w:tcBorders>
+            <w:shd w:fill="E6F5EC" w:color="auto" w:val="clear"/>
+            <w:tcMar>
+              <w:top w:type="dxa" w:w="60"/>
+              <w:left w:type="dxa" w:w="90"/>
+              <w:bottom w:type="dxa" w:w="60"/>
+              <w:right w:type="dxa" w:w="90"/>
+            </w:tcMar>
+            <w:vAlign w:val="top"/>
+          </w:tcPr>
+          <w:p>
+            <w:pPr>
+              <w:spacing w:after="40"/>
+            </w:pPr>
+            <w:r>
+              <w:rPr>
+                <w:rFonts w:ascii="Calibri" w:cs="Calibri" w:eastAsia="Calibri" w:hAnsi="Calibri"/>
+                <w:b/>
+                <w:bCs/>
+                <w:color w:val="14213D"/>
+                <w:sz w:val="19"/>
+                <w:szCs w:val="19"/>
+              </w:rPr>
+              <w:t xml:space="preserve">Fait</w:t>
+            </w:r>
+          </w:p>
+        </w:tc>
+        <w:tc>
+          <w:tcPr>
+            <w:tcW w:type="dxa" w:w="3700"/>
+            <w:tcBorders>
+              <w:top w:val="single" w:color="D9D5CB" w:sz="4"/>
+              <w:left w:val="single" w:color="D9D5CB" w:sz="4"/>
+              <w:bottom w:val="single" w:color="D9D5CB" w:sz="4"/>
+              <w:right w:val="single" w:color="D9D5CB" w:sz="4"/>
+            </w:tcBorders>
+            <w:tcMar>
+              <w:top w:type="dxa" w:w="60"/>
+              <w:left w:type="dxa" w:w="90"/>
+              <w:bottom w:type="dxa" w:w="60"/>
+              <w:right w:type="dxa" w:w="90"/>
+            </w:tcMar>
+            <w:vAlign w:val="top"/>
+          </w:tcPr>
+          <w:p>
+            <w:pPr>
+              <w:spacing w:after="40"/>
+            </w:pPr>
+            <w:r>
+              <w:rPr>
+                <w:rFonts w:ascii="Calibri" w:cs="Calibri" w:eastAsia="Calibri" w:hAnsi="Calibri"/>
+                <w:color w:val="14213D"/>
+                <w:sz w:val="20"/>
+                <w:szCs w:val="20"/>
+              </w:rPr>
+              <w:t xml:space="preserve"/>
+            </w:r>
+          </w:p>
+          <w:p>
+            <w:pPr>
+              <w:spacing w:after="40"/>
+            </w:pPr>
+            <w:r>
+              <w:rPr>
+                <w:rFonts w:ascii="Calibri" w:cs="Calibri" w:eastAsia="Calibri" w:hAnsi="Calibri"/>
+                <w:color w:val="14213D"/>
+                <w:sz w:val="20"/>
+                <w:szCs w:val="20"/>
+              </w:rPr>
+              <w:t xml:space="preserve"/>
+            </w:r>
+          </w:p>
+        </w:tc>
+      </w:tr>
+      <w:tr>
+        <w:tc>
+          <w:tcPr>
+            <w:tcW w:type="dxa" w:w="2300"/>
+            <w:tcBorders>
+              <w:top w:val="single" w:color="D9D5CB" w:sz="4"/>
+              <w:left w:val="single" w:color="D9D5CB" w:sz="4"/>
+              <w:bottom w:val="single" w:color="D9D5CB" w:sz="4"/>
+              <w:right w:val="single" w:color="D9D5CB" w:sz="4"/>
+            </w:tcBorders>
+            <w:tcMar>
+              <w:top w:type="dxa" w:w="60"/>
+              <w:left w:type="dxa" w:w="90"/>
+              <w:bottom w:type="dxa" w:w="60"/>
+              <w:right w:type="dxa" w:w="90"/>
+            </w:tcMar>
+            <w:vAlign w:val="top"/>
+          </w:tcPr>
+          <w:p>
+            <w:pPr>
+              <w:spacing w:after="40"/>
+            </w:pPr>
+            <w:r>
+              <w:rPr>
+                <w:rFonts w:ascii="Calibri" w:cs="Calibri" w:eastAsia="Calibri" w:hAnsi="Calibri"/>
+                <w:b/>
+                <w:bCs/>
+                <w:color w:val="14213D"/>
+                <w:sz w:val="20"/>
+                <w:szCs w:val="20"/>
+              </w:rPr>
+              <w:t xml:space="preserve">Objectif : proposer les équipes, cibler quelqu'un</w:t>
+            </w:r>
+          </w:p>
+        </w:tc>
+        <w:tc>
+          <w:tcPr>
+            <w:tcW w:type="dxa" w:w="4100"/>
+            <w:tcBorders>
+              <w:top w:val="single" w:color="D9D5CB" w:sz="4"/>
+              <w:left w:val="single" w:color="D9D5CB" w:sz="4"/>
+              <w:bottom w:val="single" w:color="D9D5CB" w:sz="4"/>
+              <w:right w:val="single" w:color="D9D5CB" w:sz="4"/>
+            </w:tcBorders>
+            <w:tcMar>
+              <w:top w:type="dxa" w:w="60"/>
+              <w:left w:type="dxa" w:w="90"/>
+              <w:bottom w:type="dxa" w:w="60"/>
+              <w:right w:type="dxa" w:w="90"/>
+            </w:tcMar>
+            <w:vAlign w:val="top"/>
+          </w:tcPr>
+          <w:p>
+            <w:pPr>
+              <w:spacing w:after="40"/>
+            </w:pPr>
+            <w:r>
+              <w:rPr>
+                <w:rFonts w:ascii="Calibri" w:cs="Calibri" w:eastAsia="Calibri" w:hAnsi="Calibri"/>
+                <w:color w:val="14213D"/>
+                <w:sz w:val="19"/>
+                <w:szCs w:val="19"/>
+              </w:rPr>
+              <w:t xml:space="preserve">Dans le formulaire, les équipes placées sur ce chantier (planning) sont proposées en chips A / B… : une touche coche tous les membres ; chaque personne reste cochable une par une pour cibler quelqu'un. L'objectif porte l'équipe (« équipe A ») et les personnes.</w:t>
+            </w:r>
+          </w:p>
+        </w:tc>
+        <w:tc>
+          <w:tcPr>
+            <w:tcW w:type="dxa" w:w="3700"/>
+            <w:tcBorders>
+              <w:top w:val="single" w:color="D9D5CB" w:sz="4"/>
+              <w:left w:val="single" w:color="D9D5CB" w:sz="4"/>
+              <w:bottom w:val="single" w:color="D9D5CB" w:sz="4"/>
+              <w:right w:val="single" w:color="D9D5CB" w:sz="4"/>
+            </w:tcBorders>
+            <w:tcMar>
+              <w:top w:type="dxa" w:w="60"/>
+              <w:left w:type="dxa" w:w="90"/>
+              <w:bottom w:type="dxa" w:w="60"/>
+              <w:right w:type="dxa" w:w="90"/>
+            </w:tcMar>
+            <w:vAlign w:val="top"/>
+          </w:tcPr>
+          <w:p>
+            <w:pPr>
+              <w:spacing w:after="40"/>
+            </w:pPr>
+            <w:r>
+              <w:rPr>
+                <w:rFonts w:ascii="Calibri" w:cs="Calibri" w:eastAsia="Calibri" w:hAnsi="Calibri"/>
+                <w:color w:val="14213D"/>
+                <w:sz w:val="19"/>
+                <w:szCs w:val="19"/>
+              </w:rPr>
+              <w:t xml:space="preserve"/>
+            </w:r>
+          </w:p>
+        </w:tc>
+        <w:tc>
+          <w:tcPr>
+            <w:tcW w:type="dxa" w:w="1300"/>
+            <w:tcBorders>
+              <w:top w:val="single" w:color="D9D5CB" w:sz="4"/>
+              <w:left w:val="single" w:color="D9D5CB" w:sz="4"/>
+              <w:bottom w:val="single" w:color="D9D5CB" w:sz="4"/>
+              <w:right w:val="single" w:color="D9D5CB" w:sz="4"/>
+            </w:tcBorders>
+            <w:shd w:fill="E6F5EC" w:color="auto" w:val="clear"/>
+            <w:tcMar>
+              <w:top w:type="dxa" w:w="60"/>
+              <w:left w:type="dxa" w:w="90"/>
+              <w:bottom w:type="dxa" w:w="60"/>
+              <w:right w:type="dxa" w:w="90"/>
+            </w:tcMar>
+            <w:vAlign w:val="top"/>
+          </w:tcPr>
+          <w:p>
+            <w:pPr>
+              <w:spacing w:after="40"/>
+            </w:pPr>
+            <w:r>
+              <w:rPr>
+                <w:rFonts w:ascii="Calibri" w:cs="Calibri" w:eastAsia="Calibri" w:hAnsi="Calibri"/>
+                <w:b/>
+                <w:bCs/>
+                <w:color w:val="14213D"/>
+                <w:sz w:val="19"/>
+                <w:szCs w:val="19"/>
+              </w:rPr>
+              <w:t xml:space="preserve">Fait</w:t>
+            </w:r>
+          </w:p>
+        </w:tc>
+        <w:tc>
+          <w:tcPr>
+            <w:tcW w:type="dxa" w:w="3700"/>
+            <w:tcBorders>
+              <w:top w:val="single" w:color="D9D5CB" w:sz="4"/>
+              <w:left w:val="single" w:color="D9D5CB" w:sz="4"/>
+              <w:bottom w:val="single" w:color="D9D5CB" w:sz="4"/>
+              <w:right w:val="single" w:color="D9D5CB" w:sz="4"/>
+            </w:tcBorders>
+            <w:tcMar>
+              <w:top w:type="dxa" w:w="60"/>
+              <w:left w:type="dxa" w:w="90"/>
+              <w:bottom w:type="dxa" w:w="60"/>
+              <w:right w:type="dxa" w:w="90"/>
+            </w:tcMar>
+            <w:vAlign w:val="top"/>
+          </w:tcPr>
+          <w:p>
+            <w:pPr>
+              <w:spacing w:after="40"/>
+            </w:pPr>
+            <w:r>
+              <w:rPr>
+                <w:rFonts w:ascii="Calibri" w:cs="Calibri" w:eastAsia="Calibri" w:hAnsi="Calibri"/>
+                <w:color w:val="14213D"/>
+                <w:sz w:val="20"/>
+                <w:szCs w:val="20"/>
+              </w:rPr>
+              <w:t xml:space="preserve"/>
+            </w:r>
+          </w:p>
+          <w:p>
+            <w:pPr>
+              <w:spacing w:after="40"/>
+            </w:pPr>
+            <w:r>
+              <w:rPr>
+                <w:rFonts w:ascii="Calibri" w:cs="Calibri" w:eastAsia="Calibri" w:hAnsi="Calibri"/>
+                <w:color w:val="14213D"/>
+                <w:sz w:val="20"/>
+                <w:szCs w:val="20"/>
+              </w:rPr>
+              <w:t xml:space="preserve"/>
+            </w:r>
+          </w:p>
+        </w:tc>
+      </w:tr>
+      <w:tr>
+        <w:tc>
+          <w:tcPr>
+            <w:tcW w:type="dxa" w:w="2300"/>
+            <w:tcBorders>
+              <w:top w:val="single" w:color="D9D5CB" w:sz="4"/>
+              <w:left w:val="single" w:color="D9D5CB" w:sz="4"/>
+              <w:bottom w:val="single" w:color="D9D5CB" w:sz="4"/>
+              <w:right w:val="single" w:color="D9D5CB" w:sz="4"/>
+            </w:tcBorders>
+            <w:tcMar>
+              <w:top w:type="dxa" w:w="60"/>
+              <w:left w:type="dxa" w:w="90"/>
+              <w:bottom w:type="dxa" w:w="60"/>
+              <w:right w:type="dxa" w:w="90"/>
+            </w:tcMar>
+            <w:vAlign w:val="top"/>
+          </w:tcPr>
+          <w:p>
+            <w:pPr>
+              <w:spacing w:after="40"/>
+            </w:pPr>
+            <w:r>
+              <w:rPr>
+                <w:rFonts w:ascii="Calibri" w:cs="Calibri" w:eastAsia="Calibri" w:hAnsi="Calibri"/>
+                <w:b/>
+                <w:bCs/>
+                <w:color w:val="14213D"/>
+                <w:sz w:val="20"/>
+                <w:szCs w:val="20"/>
+              </w:rPr>
+              <w:t xml:space="preserve">Un gars sur deux chantiers dans sa semaine</w:t>
+            </w:r>
+          </w:p>
+        </w:tc>
+        <w:tc>
+          <w:tcPr>
+            <w:tcW w:type="dxa" w:w="4100"/>
+            <w:tcBorders>
+              <w:top w:val="single" w:color="D9D5CB" w:sz="4"/>
+              <w:left w:val="single" w:color="D9D5CB" w:sz="4"/>
+              <w:bottom w:val="single" w:color="D9D5CB" w:sz="4"/>
+              <w:right w:val="single" w:color="D9D5CB" w:sz="4"/>
+            </w:tcBorders>
+            <w:tcMar>
+              <w:top w:type="dxa" w:w="60"/>
+              <w:left w:type="dxa" w:w="90"/>
+              <w:bottom w:type="dxa" w:w="60"/>
+              <w:right w:type="dxa" w:w="90"/>
+            </w:tcMar>
+            <w:vAlign w:val="top"/>
+          </w:tcPr>
+          <w:p>
+            <w:pPr>
+              <w:spacing w:after="40"/>
+            </w:pPr>
+            <w:r>
+              <w:rPr>
+                <w:rFonts w:ascii="Calibri" w:cs="Calibri" w:eastAsia="Calibri" w:hAnsi="Calibri"/>
+                <w:color w:val="14213D"/>
+                <w:sz w:val="19"/>
+                <w:szCs w:val="19"/>
+              </w:rPr>
+              <w:t xml:space="preserve">L'option n'avait pas disparu mais était cachée par les nouvelles cartes : toucher la personne placée → « ↔ Aussi sur un autre chantier » → toucher l'autre chantier → panneau des jours : chaque jour coché est DÉPLACÉ sur ce chantier ; case « En plus de son autre chantier le même jour » (chef en autonomie, ou quelqu'un qui jongle) pour le garder sur les deux.</w:t>
+            </w:r>
+          </w:p>
+        </w:tc>
+        <w:tc>
+          <w:tcPr>
+            <w:tcW w:type="dxa" w:w="3700"/>
+            <w:tcBorders>
+              <w:top w:val="single" w:color="D9D5CB" w:sz="4"/>
+              <w:left w:val="single" w:color="D9D5CB" w:sz="4"/>
+              <w:bottom w:val="single" w:color="D9D5CB" w:sz="4"/>
+              <w:right w:val="single" w:color="D9D5CB" w:sz="4"/>
+            </w:tcBorders>
+            <w:tcMar>
+              <w:top w:type="dxa" w:w="60"/>
+              <w:left w:type="dxa" w:w="90"/>
+              <w:bottom w:type="dxa" w:w="60"/>
+              <w:right w:type="dxa" w:w="90"/>
+            </w:tcMar>
+            <w:vAlign w:val="top"/>
+          </w:tcPr>
+          <w:p>
+            <w:pPr>
+              <w:spacing w:after="40"/>
+            </w:pPr>
+            <w:r>
+              <w:rPr>
+                <w:rFonts w:ascii="Calibri" w:cs="Calibri" w:eastAsia="Calibri" w:hAnsi="Calibri"/>
+                <w:color w:val="14213D"/>
+                <w:sz w:val="19"/>
+                <w:szCs w:val="19"/>
+              </w:rPr>
+              <w:t xml:space="preserve"/>
+            </w:r>
+          </w:p>
+        </w:tc>
+        <w:tc>
+          <w:tcPr>
+            <w:tcW w:type="dxa" w:w="1300"/>
+            <w:tcBorders>
+              <w:top w:val="single" w:color="D9D5CB" w:sz="4"/>
+              <w:left w:val="single" w:color="D9D5CB" w:sz="4"/>
+              <w:bottom w:val="single" w:color="D9D5CB" w:sz="4"/>
+              <w:right w:val="single" w:color="D9D5CB" w:sz="4"/>
+            </w:tcBorders>
+            <w:shd w:fill="FFF4EE" w:color="auto" w:val="clear"/>
+            <w:tcMar>
+              <w:top w:type="dxa" w:w="60"/>
+              <w:left w:type="dxa" w:w="90"/>
+              <w:bottom w:type="dxa" w:w="60"/>
+              <w:right w:type="dxa" w:w="90"/>
+            </w:tcMar>
+            <w:vAlign w:val="top"/>
+          </w:tcPr>
+          <w:p>
+            <w:pPr>
+              <w:spacing w:after="40"/>
+            </w:pPr>
+            <w:r>
+              <w:rPr>
+                <w:rFonts w:ascii="Calibri" w:cs="Calibri" w:eastAsia="Calibri" w:hAnsi="Calibri"/>
+                <w:b/>
+                <w:bCs/>
+                <w:color w:val="14213D"/>
+                <w:sz w:val="19"/>
+                <w:szCs w:val="19"/>
+              </w:rPr>
+              <w:t xml:space="preserve">Corrigé</w:t>
+            </w:r>
+          </w:p>
+        </w:tc>
+        <w:tc>
+          <w:tcPr>
+            <w:tcW w:type="dxa" w:w="3700"/>
+            <w:tcBorders>
+              <w:top w:val="single" w:color="D9D5CB" w:sz="4"/>
+              <w:left w:val="single" w:color="D9D5CB" w:sz="4"/>
+              <w:bottom w:val="single" w:color="D9D5CB" w:sz="4"/>
+              <w:right w:val="single" w:color="D9D5CB" w:sz="4"/>
+            </w:tcBorders>
+            <w:tcMar>
+              <w:top w:type="dxa" w:w="60"/>
+              <w:left w:type="dxa" w:w="90"/>
+              <w:bottom w:type="dxa" w:w="60"/>
+              <w:right w:type="dxa" w:w="90"/>
+            </w:tcMar>
+            <w:vAlign w:val="top"/>
+          </w:tcPr>
+          <w:p>
+            <w:pPr>
+              <w:spacing w:after="40"/>
+            </w:pPr>
+            <w:r>
+              <w:rPr>
+                <w:rFonts w:ascii="Calibri" w:cs="Calibri" w:eastAsia="Calibri" w:hAnsi="Calibri"/>
+                <w:color w:val="14213D"/>
+                <w:sz w:val="20"/>
+                <w:szCs w:val="20"/>
+              </w:rPr>
+              <w:t xml:space="preserve"/>
+            </w:r>
+          </w:p>
+          <w:p>
+            <w:pPr>
+              <w:spacing w:after="40"/>
+            </w:pPr>
+            <w:r>
+              <w:rPr>
+                <w:rFonts w:ascii="Calibri" w:cs="Calibri" w:eastAsia="Calibri" w:hAnsi="Calibri"/>
+                <w:color w:val="14213D"/>
+                <w:sz w:val="20"/>
+                <w:szCs w:val="20"/>
+              </w:rPr>
+              <w:t xml:space="preserve"/>
+            </w:r>
+          </w:p>
+        </w:tc>
+      </w:tr>
+      <w:tr>
+        <w:tc>
+          <w:tcPr>
+            <w:tcW w:type="dxa" w:w="2300"/>
+            <w:tcBorders>
+              <w:top w:val="single" w:color="D9D5CB" w:sz="4"/>
+              <w:left w:val="single" w:color="D9D5CB" w:sz="4"/>
+              <w:bottom w:val="single" w:color="D9D5CB" w:sz="4"/>
+              <w:right w:val="single" w:color="D9D5CB" w:sz="4"/>
+            </w:tcBorders>
+            <w:tcMar>
+              <w:top w:type="dxa" w:w="60"/>
+              <w:left w:type="dxa" w:w="90"/>
+              <w:bottom w:type="dxa" w:w="60"/>
+              <w:right w:type="dxa" w:w="90"/>
+            </w:tcMar>
+            <w:vAlign w:val="top"/>
+          </w:tcPr>
+          <w:p>
+            <w:pPr>
+              <w:spacing w:after="40"/>
+            </w:pPr>
+            <w:r>
+              <w:rPr>
+                <w:rFonts w:ascii="Calibri" w:cs="Calibri" w:eastAsia="Calibri" w:hAnsi="Calibri"/>
+                <w:b/>
+                <w:bCs/>
+                <w:color w:val="14213D"/>
+                <w:sz w:val="20"/>
+                <w:szCs w:val="20"/>
+              </w:rPr>
+              <w:t xml:space="preserve">Tester le vrai logiciel : bac à sable</w:t>
+            </w:r>
+          </w:p>
+        </w:tc>
+        <w:tc>
+          <w:tcPr>
+            <w:tcW w:type="dxa" w:w="4100"/>
+            <w:tcBorders>
+              <w:top w:val="single" w:color="D9D5CB" w:sz="4"/>
+              <w:left w:val="single" w:color="D9D5CB" w:sz="4"/>
+              <w:bottom w:val="single" w:color="D9D5CB" w:sz="4"/>
+              <w:right w:val="single" w:color="D9D5CB" w:sz="4"/>
+            </w:tcBorders>
+            <w:tcMar>
+              <w:top w:type="dxa" w:w="60"/>
+              <w:left w:type="dxa" w:w="90"/>
+              <w:bottom w:type="dxa" w:w="60"/>
+              <w:right w:type="dxa" w:w="90"/>
+            </w:tcMar>
+            <w:vAlign w:val="top"/>
+          </w:tcPr>
+          <w:p>
+            <w:pPr>
+              <w:spacing w:after="40"/>
+            </w:pPr>
+            <w:r>
+              <w:rPr>
+                <w:rFonts w:ascii="Calibri" w:cs="Calibri" w:eastAsia="Calibri" w:hAnsi="Calibri"/>
+                <w:color w:val="14213D"/>
+                <w:sz w:val="19"/>
+                <w:szCs w:val="19"/>
+              </w:rPr>
+              <w:t xml:space="preserve">Connecté, onglet Administrateur → « 🧪 Bac à sable » → « Mettre en place » : chantier « 🧪 Démo — Caen Presqu'île » (copie du Bain-de-Bretagne de démo, fiche, conversation, livraison du jour, 2 objectifs du jour dont « Souder le tronçon 1 » équipe A → Karim), Karim (A) / Julien (B) / Ethan L. placés toute la semaine, Karim pointé depuis 7 h 30, quart d'heure « Incendie » déclenché. Puis « 👁 Voir l'appli comme » → groupe « Bac à sable » → Karim B. : tu AGIS comme lui (soudures, accueil chantier, quart d'heure, pointage…), pas en lecture seule. « ↻ Rejouer le scénario », « 🗑 Retirer le bac à sable » efface tout d'un coup.</w:t>
+            </w:r>
+          </w:p>
+        </w:tc>
+        <w:tc>
+          <w:tcPr>
+            <w:tcW w:type="dxa" w:w="3700"/>
+            <w:tcBorders>
+              <w:top w:val="single" w:color="D9D5CB" w:sz="4"/>
+              <w:left w:val="single" w:color="D9D5CB" w:sz="4"/>
+              <w:bottom w:val="single" w:color="D9D5CB" w:sz="4"/>
+              <w:right w:val="single" w:color="D9D5CB" w:sz="4"/>
+            </w:tcBorders>
+            <w:tcMar>
+              <w:top w:type="dxa" w:w="60"/>
+              <w:left w:type="dxa" w:w="90"/>
+              <w:bottom w:type="dxa" w:w="60"/>
+              <w:right w:type="dxa" w:w="90"/>
+            </w:tcMar>
+            <w:vAlign w:val="top"/>
+          </w:tcPr>
+          <w:p>
+            <w:pPr>
+              <w:spacing w:after="40"/>
+            </w:pPr>
+            <w:r>
+              <w:rPr>
+                <w:rFonts w:ascii="Calibri" w:cs="Calibri" w:eastAsia="Calibri" w:hAnsi="Calibri"/>
+                <w:color w:val="14213D"/>
+                <w:sz w:val="19"/>
+                <w:szCs w:val="19"/>
+              </w:rPr>
+              <w:t xml:space="preserve">RIEN de tout ça ne part au serveur : chantier « demo_… », personnages « l:… », leur planning, pointages, signatures, soudures restent sur ton appareil (vérifié par un test qui espionne tous les appels serveur). Tes collègues ne voient rien. « Voir l'appli comme » un VRAI collègue reste en lecture seule, comme avant.</w:t>
+            </w:r>
+          </w:p>
+        </w:tc>
+        <w:tc>
+          <w:tcPr>
+            <w:tcW w:type="dxa" w:w="1300"/>
+            <w:tcBorders>
+              <w:top w:val="single" w:color="D9D5CB" w:sz="4"/>
+              <w:left w:val="single" w:color="D9D5CB" w:sz="4"/>
+              <w:bottom w:val="single" w:color="D9D5CB" w:sz="4"/>
+              <w:right w:val="single" w:color="D9D5CB" w:sz="4"/>
+            </w:tcBorders>
+            <w:shd w:fill="E6F5EC" w:color="auto" w:val="clear"/>
+            <w:tcMar>
+              <w:top w:type="dxa" w:w="60"/>
+              <w:left w:type="dxa" w:w="90"/>
+              <w:bottom w:type="dxa" w:w="60"/>
+              <w:right w:type="dxa" w:w="90"/>
+            </w:tcMar>
+            <w:vAlign w:val="top"/>
+          </w:tcPr>
+          <w:p>
+            <w:pPr>
+              <w:spacing w:after="40"/>
+            </w:pPr>
+            <w:r>
+              <w:rPr>
+                <w:rFonts w:ascii="Calibri" w:cs="Calibri" w:eastAsia="Calibri" w:hAnsi="Calibri"/>
+                <w:b/>
+                <w:bCs/>
+                <w:color w:val="14213D"/>
+                <w:sz w:val="19"/>
+                <w:szCs w:val="19"/>
+              </w:rPr>
+              <w:t xml:space="preserve">Fait</w:t>
             </w:r>
           </w:p>
         </w:tc>

</xml_diff>

<commit_message>
Objectifs des équipes : vue chantier→équipes→gens par jour/semaine, objectif à l'équipe ou ciblé, soudure par soudure (k/n ✓), notification 🎯 à l'accueil ; planning : deux chantiers le même jour gardés avec ⚠
</commit_message>
<xml_diff>
--- a/app/docs/Feuille_de_route_nuit_09-10-10.docx
+++ b/app/docs/Feuille_de_route_nuit_09-10-10.docx
@@ -84,7 +84,7 @@
           <w:sz w:val="20"/>
           <w:szCs w:val="20"/>
         </w:rPr>
-        <w:t xml:space="preserve">Build livré : 10/10/2026 · c8eafe (retours des points 1 à 4, 12 quarts d'heure SCR, planning, objectif sur le plan, bac à sable) (index.html + traceur.html à la racine du dépôt). Sources : app/src (reg.js, docs.js, prevention.js, accueil.js, affaires.js, flotte.js, rh.js, commandes.js, reglement.js + app.js, espace.js, next.js, acces.js, sync.js). Notes techniques : app/NOTES.md.</w:t>
+        <w:t xml:space="preserve">Build livré : 11/10/2026 · 2b3fe6 (retours des points 1 à 4, objectifs par équipe / jour / soudure, bac à sable) (index.html + traceur.html à la racine du dépôt). Sources : app/src (reg.js, docs.js, prevention.js, accueil.js, affaires.js, flotte.js, rh.js, commandes.js, reglement.js + app.js, espace.js, next.js, acces.js, sync.js). Notes techniques : app/NOTES.md.</w:t>
       </w:r>
     </w:p>
     <w:p>
@@ -868,7 +868,7 @@
           <w:sz w:val="30"/>
           <w:szCs w:val="30"/>
         </w:rPr>
-        <w:t xml:space="preserve">0 · Tes retours du 10/10 (points 1 à 4) — ce que j'ai fait aujourd'hui</w:t>
+        <w:t xml:space="preserve">0 · Tes retours du 10/10 et du 11/10 (points 1 à 4) — ce que j'ai fait</w:t>
       </w:r>
     </w:p>
     <w:p>
@@ -5197,6 +5197,911 @@
                 <w:szCs w:val="19"/>
               </w:rPr>
               <w:t xml:space="preserve">Corrigé</w:t>
+            </w:r>
+          </w:p>
+        </w:tc>
+        <w:tc>
+          <w:tcPr>
+            <w:tcW w:type="dxa" w:w="3700"/>
+            <w:tcBorders>
+              <w:top w:val="single" w:color="D9D5CB" w:sz="4"/>
+              <w:left w:val="single" w:color="D9D5CB" w:sz="4"/>
+              <w:bottom w:val="single" w:color="D9D5CB" w:sz="4"/>
+              <w:right w:val="single" w:color="D9D5CB" w:sz="4"/>
+            </w:tcBorders>
+            <w:tcMar>
+              <w:top w:type="dxa" w:w="60"/>
+              <w:left w:type="dxa" w:w="90"/>
+              <w:bottom w:type="dxa" w:w="60"/>
+              <w:right w:type="dxa" w:w="90"/>
+            </w:tcMar>
+            <w:vAlign w:val="top"/>
+          </w:tcPr>
+          <w:p>
+            <w:pPr>
+              <w:spacing w:after="40"/>
+            </w:pPr>
+            <w:r>
+              <w:rPr>
+                <w:rFonts w:ascii="Calibri" w:cs="Calibri" w:eastAsia="Calibri" w:hAnsi="Calibri"/>
+                <w:color w:val="14213D"/>
+                <w:sz w:val="20"/>
+                <w:szCs w:val="20"/>
+              </w:rPr>
+              <w:t xml:space="preserve"/>
+            </w:r>
+          </w:p>
+          <w:p>
+            <w:pPr>
+              <w:spacing w:after="40"/>
+            </w:pPr>
+            <w:r>
+              <w:rPr>
+                <w:rFonts w:ascii="Calibri" w:cs="Calibri" w:eastAsia="Calibri" w:hAnsi="Calibri"/>
+                <w:color w:val="14213D"/>
+                <w:sz w:val="20"/>
+                <w:szCs w:val="20"/>
+              </w:rPr>
+              <w:t xml:space="preserve"/>
+            </w:r>
+          </w:p>
+        </w:tc>
+      </w:tr>
+      <w:tr>
+        <w:tc>
+          <w:tcPr>
+            <w:tcW w:type="dxa" w:w="2300"/>
+            <w:tcBorders>
+              <w:top w:val="single" w:color="D9D5CB" w:sz="4"/>
+              <w:left w:val="single" w:color="D9D5CB" w:sz="4"/>
+              <w:bottom w:val="single" w:color="D9D5CB" w:sz="4"/>
+              <w:right w:val="single" w:color="D9D5CB" w:sz="4"/>
+            </w:tcBorders>
+            <w:tcMar>
+              <w:top w:type="dxa" w:w="60"/>
+              <w:left w:type="dxa" w:w="90"/>
+              <w:bottom w:type="dxa" w:w="60"/>
+              <w:right w:type="dxa" w:w="90"/>
+            </w:tcMar>
+            <w:vAlign w:val="top"/>
+          </w:tcPr>
+          <w:p>
+            <w:pPr>
+              <w:spacing w:after="40"/>
+            </w:pPr>
+            <w:r>
+              <w:rPr>
+                <w:rFonts w:ascii="Calibri" w:cs="Calibri" w:eastAsia="Calibri" w:hAnsi="Calibri"/>
+                <w:b/>
+                <w:bCs/>
+                <w:color w:val="14213D"/>
+                <w:sz w:val="20"/>
+                <w:szCs w:val="20"/>
+              </w:rPr>
+              <w:t xml:space="preserve">Planning : recocher un jour déjà coché ailleurs enlevait l'autre chantier</w:t>
+            </w:r>
+          </w:p>
+        </w:tc>
+        <w:tc>
+          <w:tcPr>
+            <w:tcW w:type="dxa" w:w="4100"/>
+            <w:tcBorders>
+              <w:top w:val="single" w:color="D9D5CB" w:sz="4"/>
+              <w:left w:val="single" w:color="D9D5CB" w:sz="4"/>
+              <w:bottom w:val="single" w:color="D9D5CB" w:sz="4"/>
+              <w:right w:val="single" w:color="D9D5CB" w:sz="4"/>
+            </w:tcBorders>
+            <w:tcMar>
+              <w:top w:type="dxa" w:w="60"/>
+              <w:left w:type="dxa" w:w="90"/>
+              <w:bottom w:type="dxa" w:w="60"/>
+              <w:right w:type="dxa" w:w="90"/>
+            </w:tcMar>
+            <w:vAlign w:val="top"/>
+          </w:tcPr>
+          <w:p>
+            <w:pPr>
+              <w:spacing w:after="40"/>
+            </w:pPr>
+            <w:r>
+              <w:rPr>
+                <w:rFonts w:ascii="Calibri" w:cs="Calibri" w:eastAsia="Calibri" w:hAnsi="Calibri"/>
+                <w:color w:val="14213D"/>
+                <w:sz w:val="19"/>
+                <w:szCs w:val="19"/>
+              </w:rPr>
+              <w:t xml:space="preserve">Corrigé : un jour coché sur un chantier s'AJOUTE, l'autre chantier est gardé. Indicateur ⚠ : message « jeu. : Julien est sur Caen ET Rennes le même jour — si ce n'est pas voulu, décoche ce jour sur l'autre chantier », jour « ⚠ jeu. 08 ·Rennes » dans les panneaux de jours, pastille du jour cerclée orange, « ⚠ 2 chantiers le même jour (jeu.) : aussi sur Caen » sur la personne (chef : « en autonomie (jeu.) »). Pour qu'il quitte l'autre chantier ce jour-là : décoche le jour sur l'autre carte.</w:t>
+            </w:r>
+          </w:p>
+        </w:tc>
+        <w:tc>
+          <w:tcPr>
+            <w:tcW w:type="dxa" w:w="3700"/>
+            <w:tcBorders>
+              <w:top w:val="single" w:color="D9D5CB" w:sz="4"/>
+              <w:left w:val="single" w:color="D9D5CB" w:sz="4"/>
+              <w:bottom w:val="single" w:color="D9D5CB" w:sz="4"/>
+              <w:right w:val="single" w:color="D9D5CB" w:sz="4"/>
+            </w:tcBorders>
+            <w:tcMar>
+              <w:top w:type="dxa" w:w="60"/>
+              <w:left w:type="dxa" w:w="90"/>
+              <w:bottom w:type="dxa" w:w="60"/>
+              <w:right w:type="dxa" w:w="90"/>
+            </w:tcMar>
+            <w:vAlign w:val="top"/>
+          </w:tcPr>
+          <w:p>
+            <w:pPr>
+              <w:spacing w:after="40"/>
+            </w:pPr>
+            <w:r>
+              <w:rPr>
+                <w:rFonts w:ascii="Calibri" w:cs="Calibri" w:eastAsia="Calibri" w:hAnsi="Calibri"/>
+                <w:color w:val="14213D"/>
+                <w:sz w:val="19"/>
+                <w:szCs w:val="19"/>
+              </w:rPr>
+              <w:t xml:space="preserve">La case « En plus de son autre chantier » a disparu : c'est toujours « en plus », et c'est toi qui enlèves l'autre si tu veux.</w:t>
+            </w:r>
+          </w:p>
+        </w:tc>
+        <w:tc>
+          <w:tcPr>
+            <w:tcW w:type="dxa" w:w="1300"/>
+            <w:tcBorders>
+              <w:top w:val="single" w:color="D9D5CB" w:sz="4"/>
+              <w:left w:val="single" w:color="D9D5CB" w:sz="4"/>
+              <w:bottom w:val="single" w:color="D9D5CB" w:sz="4"/>
+              <w:right w:val="single" w:color="D9D5CB" w:sz="4"/>
+            </w:tcBorders>
+            <w:shd w:fill="FFF4EE" w:color="auto" w:val="clear"/>
+            <w:tcMar>
+              <w:top w:type="dxa" w:w="60"/>
+              <w:left w:type="dxa" w:w="90"/>
+              <w:bottom w:type="dxa" w:w="60"/>
+              <w:right w:type="dxa" w:w="90"/>
+            </w:tcMar>
+            <w:vAlign w:val="top"/>
+          </w:tcPr>
+          <w:p>
+            <w:pPr>
+              <w:spacing w:after="40"/>
+            </w:pPr>
+            <w:r>
+              <w:rPr>
+                <w:rFonts w:ascii="Calibri" w:cs="Calibri" w:eastAsia="Calibri" w:hAnsi="Calibri"/>
+                <w:b/>
+                <w:bCs/>
+                <w:color w:val="14213D"/>
+                <w:sz w:val="19"/>
+                <w:szCs w:val="19"/>
+              </w:rPr>
+              <w:t xml:space="preserve">Corrigé</w:t>
+            </w:r>
+          </w:p>
+        </w:tc>
+        <w:tc>
+          <w:tcPr>
+            <w:tcW w:type="dxa" w:w="3700"/>
+            <w:tcBorders>
+              <w:top w:val="single" w:color="D9D5CB" w:sz="4"/>
+              <w:left w:val="single" w:color="D9D5CB" w:sz="4"/>
+              <w:bottom w:val="single" w:color="D9D5CB" w:sz="4"/>
+              <w:right w:val="single" w:color="D9D5CB" w:sz="4"/>
+            </w:tcBorders>
+            <w:tcMar>
+              <w:top w:type="dxa" w:w="60"/>
+              <w:left w:type="dxa" w:w="90"/>
+              <w:bottom w:type="dxa" w:w="60"/>
+              <w:right w:type="dxa" w:w="90"/>
+            </w:tcMar>
+            <w:vAlign w:val="top"/>
+          </w:tcPr>
+          <w:p>
+            <w:pPr>
+              <w:spacing w:after="40"/>
+            </w:pPr>
+            <w:r>
+              <w:rPr>
+                <w:rFonts w:ascii="Calibri" w:cs="Calibri" w:eastAsia="Calibri" w:hAnsi="Calibri"/>
+                <w:color w:val="14213D"/>
+                <w:sz w:val="20"/>
+                <w:szCs w:val="20"/>
+              </w:rPr>
+              <w:t xml:space="preserve"/>
+            </w:r>
+          </w:p>
+          <w:p>
+            <w:pPr>
+              <w:spacing w:after="40"/>
+            </w:pPr>
+            <w:r>
+              <w:rPr>
+                <w:rFonts w:ascii="Calibri" w:cs="Calibri" w:eastAsia="Calibri" w:hAnsi="Calibri"/>
+                <w:color w:val="14213D"/>
+                <w:sz w:val="20"/>
+                <w:szCs w:val="20"/>
+              </w:rPr>
+              <w:t xml:space="preserve"/>
+            </w:r>
+          </w:p>
+        </w:tc>
+      </w:tr>
+      <w:tr>
+        <w:tc>
+          <w:tcPr>
+            <w:tcW w:type="dxa" w:w="2300"/>
+            <w:tcBorders>
+              <w:top w:val="single" w:color="D9D5CB" w:sz="4"/>
+              <w:left w:val="single" w:color="D9D5CB" w:sz="4"/>
+              <w:bottom w:val="single" w:color="D9D5CB" w:sz="4"/>
+              <w:right w:val="single" w:color="D9D5CB" w:sz="4"/>
+            </w:tcBorders>
+            <w:tcMar>
+              <w:top w:type="dxa" w:w="60"/>
+              <w:left w:type="dxa" w:w="90"/>
+              <w:bottom w:type="dxa" w:w="60"/>
+              <w:right w:type="dxa" w:w="90"/>
+            </w:tcMar>
+            <w:vAlign w:val="top"/>
+          </w:tcPr>
+          <w:p>
+            <w:pPr>
+              <w:spacing w:after="40"/>
+            </w:pPr>
+            <w:r>
+              <w:rPr>
+                <w:rFonts w:ascii="Calibri" w:cs="Calibri" w:eastAsia="Calibri" w:hAnsi="Calibri"/>
+                <w:b/>
+                <w:bCs/>
+                <w:color w:val="14213D"/>
+                <w:sz w:val="20"/>
+                <w:szCs w:val="20"/>
+              </w:rPr>
+              <w:t xml:space="preserve">Objectifs : soudures OU tronçon sur le plan</w:t>
+            </w:r>
+          </w:p>
+        </w:tc>
+        <w:tc>
+          <w:tcPr>
+            <w:tcW w:type="dxa" w:w="4100"/>
+            <w:tcBorders>
+              <w:top w:val="single" w:color="D9D5CB" w:sz="4"/>
+              <w:left w:val="single" w:color="D9D5CB" w:sz="4"/>
+              <w:bottom w:val="single" w:color="D9D5CB" w:sz="4"/>
+              <w:right w:val="single" w:color="D9D5CB" w:sz="4"/>
+            </w:tcBorders>
+            <w:tcMar>
+              <w:top w:type="dxa" w:w="60"/>
+              <w:left w:type="dxa" w:w="90"/>
+              <w:bottom w:type="dxa" w:w="60"/>
+              <w:right w:type="dxa" w:w="90"/>
+            </w:tcMar>
+            <w:vAlign w:val="top"/>
+          </w:tcPr>
+          <w:p>
+            <w:pPr>
+              <w:spacing w:after="40"/>
+            </w:pPr>
+            <w:r>
+              <w:rPr>
+                <w:rFonts w:ascii="Calibri" w:cs="Calibri" w:eastAsia="Calibri" w:hAnsi="Calibri"/>
+                <w:color w:val="14213D"/>
+                <w:sz w:val="19"/>
+                <w:szCs w:val="19"/>
+              </w:rPr>
+              <w:t xml:space="preserve">En pose d'objectif : touche des soudures une à une (cerclées 1, 2, 3… ; re-toucher = retirer) ; des soudures qui se suivent forment le tronçon de la première à la dernière (« 3 soudures → Feeder PK 12 → 36 ») ; début / fin sur la conduite comme avant (toutes les soudures comprises) ; début posé puis soudure touchée = la fin calée dessus. L'objectif garde ses soudures : « 🔧 3 soudures (1/3 ✓) » dans la liste, le Bureau et l'étiquette 🎯 du plan, anneau vert ✓ sur les soudures faites.</w:t>
+            </w:r>
+          </w:p>
+        </w:tc>
+        <w:tc>
+          <w:tcPr>
+            <w:tcW w:type="dxa" w:w="3700"/>
+            <w:tcBorders>
+              <w:top w:val="single" w:color="D9D5CB" w:sz="4"/>
+              <w:left w:val="single" w:color="D9D5CB" w:sz="4"/>
+              <w:bottom w:val="single" w:color="D9D5CB" w:sz="4"/>
+              <w:right w:val="single" w:color="D9D5CB" w:sz="4"/>
+            </w:tcBorders>
+            <w:tcMar>
+              <w:top w:type="dxa" w:w="60"/>
+              <w:left w:type="dxa" w:w="90"/>
+              <w:bottom w:type="dxa" w:w="60"/>
+              <w:right w:type="dxa" w:w="90"/>
+            </w:tcMar>
+            <w:vAlign w:val="top"/>
+          </w:tcPr>
+          <w:p>
+            <w:pPr>
+              <w:spacing w:after="40"/>
+            </w:pPr>
+            <w:r>
+              <w:rPr>
+                <w:rFonts w:ascii="Calibri" w:cs="Calibri" w:eastAsia="Calibri" w:hAnsi="Calibri"/>
+                <w:color w:val="14213D"/>
+                <w:sz w:val="19"/>
+                <w:szCs w:val="19"/>
+              </w:rPr>
+              <w:t xml:space="preserve">Soudée, contrôlée ou manchonnée = faite.</w:t>
+            </w:r>
+          </w:p>
+        </w:tc>
+        <w:tc>
+          <w:tcPr>
+            <w:tcW w:type="dxa" w:w="1300"/>
+            <w:tcBorders>
+              <w:top w:val="single" w:color="D9D5CB" w:sz="4"/>
+              <w:left w:val="single" w:color="D9D5CB" w:sz="4"/>
+              <w:bottom w:val="single" w:color="D9D5CB" w:sz="4"/>
+              <w:right w:val="single" w:color="D9D5CB" w:sz="4"/>
+            </w:tcBorders>
+            <w:shd w:fill="E6F5EC" w:color="auto" w:val="clear"/>
+            <w:tcMar>
+              <w:top w:type="dxa" w:w="60"/>
+              <w:left w:type="dxa" w:w="90"/>
+              <w:bottom w:type="dxa" w:w="60"/>
+              <w:right w:type="dxa" w:w="90"/>
+            </w:tcMar>
+            <w:vAlign w:val="top"/>
+          </w:tcPr>
+          <w:p>
+            <w:pPr>
+              <w:spacing w:after="40"/>
+            </w:pPr>
+            <w:r>
+              <w:rPr>
+                <w:rFonts w:ascii="Calibri" w:cs="Calibri" w:eastAsia="Calibri" w:hAnsi="Calibri"/>
+                <w:b/>
+                <w:bCs/>
+                <w:color w:val="14213D"/>
+                <w:sz w:val="19"/>
+                <w:szCs w:val="19"/>
+              </w:rPr>
+              <w:t xml:space="preserve">Fait</w:t>
+            </w:r>
+          </w:p>
+        </w:tc>
+        <w:tc>
+          <w:tcPr>
+            <w:tcW w:type="dxa" w:w="3700"/>
+            <w:tcBorders>
+              <w:top w:val="single" w:color="D9D5CB" w:sz="4"/>
+              <w:left w:val="single" w:color="D9D5CB" w:sz="4"/>
+              <w:bottom w:val="single" w:color="D9D5CB" w:sz="4"/>
+              <w:right w:val="single" w:color="D9D5CB" w:sz="4"/>
+            </w:tcBorders>
+            <w:tcMar>
+              <w:top w:type="dxa" w:w="60"/>
+              <w:left w:type="dxa" w:w="90"/>
+              <w:bottom w:type="dxa" w:w="60"/>
+              <w:right w:type="dxa" w:w="90"/>
+            </w:tcMar>
+            <w:vAlign w:val="top"/>
+          </w:tcPr>
+          <w:p>
+            <w:pPr>
+              <w:spacing w:after="40"/>
+            </w:pPr>
+            <w:r>
+              <w:rPr>
+                <w:rFonts w:ascii="Calibri" w:cs="Calibri" w:eastAsia="Calibri" w:hAnsi="Calibri"/>
+                <w:color w:val="14213D"/>
+                <w:sz w:val="20"/>
+                <w:szCs w:val="20"/>
+              </w:rPr>
+              <w:t xml:space="preserve"/>
+            </w:r>
+          </w:p>
+          <w:p>
+            <w:pPr>
+              <w:spacing w:after="40"/>
+            </w:pPr>
+            <w:r>
+              <w:rPr>
+                <w:rFonts w:ascii="Calibri" w:cs="Calibri" w:eastAsia="Calibri" w:hAnsi="Calibri"/>
+                <w:color w:val="14213D"/>
+                <w:sz w:val="20"/>
+                <w:szCs w:val="20"/>
+              </w:rPr>
+              <w:t xml:space="preserve"/>
+            </w:r>
+          </w:p>
+        </w:tc>
+      </w:tr>
+      <w:tr>
+        <w:tc>
+          <w:tcPr>
+            <w:tcW w:type="dxa" w:w="2300"/>
+            <w:tcBorders>
+              <w:top w:val="single" w:color="D9D5CB" w:sz="4"/>
+              <w:left w:val="single" w:color="D9D5CB" w:sz="4"/>
+              <w:bottom w:val="single" w:color="D9D5CB" w:sz="4"/>
+              <w:right w:val="single" w:color="D9D5CB" w:sz="4"/>
+            </w:tcBorders>
+            <w:tcMar>
+              <w:top w:type="dxa" w:w="60"/>
+              <w:left w:type="dxa" w:w="90"/>
+              <w:bottom w:type="dxa" w:w="60"/>
+              <w:right w:type="dxa" w:w="90"/>
+            </w:tcMar>
+            <w:vAlign w:val="top"/>
+          </w:tcPr>
+          <w:p>
+            <w:pPr>
+              <w:spacing w:after="40"/>
+            </w:pPr>
+            <w:r>
+              <w:rPr>
+                <w:rFonts w:ascii="Calibri" w:cs="Calibri" w:eastAsia="Calibri" w:hAnsi="Calibri"/>
+                <w:b/>
+                <w:bCs/>
+                <w:color w:val="14213D"/>
+                <w:sz w:val="20"/>
+                <w:szCs w:val="20"/>
+              </w:rPr>
+              <w:t xml:space="preserve">Menu objectifs = comme le planning : chantier → équipes → l'objectif à l'équipe</w:t>
+            </w:r>
+          </w:p>
+        </w:tc>
+        <w:tc>
+          <w:tcPr>
+            <w:tcW w:type="dxa" w:w="4100"/>
+            <w:tcBorders>
+              <w:top w:val="single" w:color="D9D5CB" w:sz="4"/>
+              <w:left w:val="single" w:color="D9D5CB" w:sz="4"/>
+              <w:bottom w:val="single" w:color="D9D5CB" w:sz="4"/>
+              <w:right w:val="single" w:color="D9D5CB" w:sz="4"/>
+            </w:tcBorders>
+            <w:tcMar>
+              <w:top w:type="dxa" w:w="60"/>
+              <w:left w:type="dxa" w:w="90"/>
+              <w:bottom w:type="dxa" w:w="60"/>
+              <w:right w:type="dxa" w:w="90"/>
+            </w:tcMar>
+            <w:vAlign w:val="top"/>
+          </w:tcPr>
+          <w:p>
+            <w:pPr>
+              <w:spacing w:after="40"/>
+            </w:pPr>
+            <w:r>
+              <w:rPr>
+                <w:rFonts w:ascii="Calibri" w:cs="Calibri" w:eastAsia="Calibri" w:hAnsi="Calibri"/>
+                <w:color w:val="14213D"/>
+                <w:sz w:val="19"/>
+                <w:szCs w:val="19"/>
+              </w:rPr>
+              <w:t xml:space="preserve">Exploitation → « Objectifs des équipes » : semaine (◀ ▶), 5 jours avec le nombre d'objectifs, puis une carte par chantier : chef en tête, chaque équipe du planning (A, B… avec ses gens), ses objectifs sous elle et « ➕ Objectif équipe A » ; « Sans équipe · tout le chantier » pour le reste. Dans le formulaire : rien de coché = toute l'équipe, cocher = cibler quelqu'un.</w:t>
+            </w:r>
+          </w:p>
+        </w:tc>
+        <w:tc>
+          <w:tcPr>
+            <w:tcW w:type="dxa" w:w="3700"/>
+            <w:tcBorders>
+              <w:top w:val="single" w:color="D9D5CB" w:sz="4"/>
+              <w:left w:val="single" w:color="D9D5CB" w:sz="4"/>
+              <w:bottom w:val="single" w:color="D9D5CB" w:sz="4"/>
+              <w:right w:val="single" w:color="D9D5CB" w:sz="4"/>
+            </w:tcBorders>
+            <w:tcMar>
+              <w:top w:type="dxa" w:w="60"/>
+              <w:left w:type="dxa" w:w="90"/>
+              <w:bottom w:type="dxa" w:w="60"/>
+              <w:right w:type="dxa" w:w="90"/>
+            </w:tcMar>
+            <w:vAlign w:val="top"/>
+          </w:tcPr>
+          <w:p>
+            <w:pPr>
+              <w:spacing w:after="40"/>
+            </w:pPr>
+            <w:r>
+              <w:rPr>
+                <w:rFonts w:ascii="Calibri" w:cs="Calibri" w:eastAsia="Calibri" w:hAnsi="Calibri"/>
+                <w:color w:val="14213D"/>
+                <w:sz w:val="19"/>
+                <w:szCs w:val="19"/>
+              </w:rPr>
+              <w:t xml:space="preserve">Un objectif porte une équipe (« toute l'équipe A (Karim) ») ou des personnes (« → Karim »).</w:t>
+            </w:r>
+          </w:p>
+        </w:tc>
+        <w:tc>
+          <w:tcPr>
+            <w:tcW w:type="dxa" w:w="1300"/>
+            <w:tcBorders>
+              <w:top w:val="single" w:color="D9D5CB" w:sz="4"/>
+              <w:left w:val="single" w:color="D9D5CB" w:sz="4"/>
+              <w:bottom w:val="single" w:color="D9D5CB" w:sz="4"/>
+              <w:right w:val="single" w:color="D9D5CB" w:sz="4"/>
+            </w:tcBorders>
+            <w:shd w:fill="E6F5EC" w:color="auto" w:val="clear"/>
+            <w:tcMar>
+              <w:top w:type="dxa" w:w="60"/>
+              <w:left w:type="dxa" w:w="90"/>
+              <w:bottom w:type="dxa" w:w="60"/>
+              <w:right w:type="dxa" w:w="90"/>
+            </w:tcMar>
+            <w:vAlign w:val="top"/>
+          </w:tcPr>
+          <w:p>
+            <w:pPr>
+              <w:spacing w:after="40"/>
+            </w:pPr>
+            <w:r>
+              <w:rPr>
+                <w:rFonts w:ascii="Calibri" w:cs="Calibri" w:eastAsia="Calibri" w:hAnsi="Calibri"/>
+                <w:b/>
+                <w:bCs/>
+                <w:color w:val="14213D"/>
+                <w:sz w:val="19"/>
+                <w:szCs w:val="19"/>
+              </w:rPr>
+              <w:t xml:space="preserve">Fait</w:t>
+            </w:r>
+          </w:p>
+        </w:tc>
+        <w:tc>
+          <w:tcPr>
+            <w:tcW w:type="dxa" w:w="3700"/>
+            <w:tcBorders>
+              <w:top w:val="single" w:color="D9D5CB" w:sz="4"/>
+              <w:left w:val="single" w:color="D9D5CB" w:sz="4"/>
+              <w:bottom w:val="single" w:color="D9D5CB" w:sz="4"/>
+              <w:right w:val="single" w:color="D9D5CB" w:sz="4"/>
+            </w:tcBorders>
+            <w:tcMar>
+              <w:top w:type="dxa" w:w="60"/>
+              <w:left w:type="dxa" w:w="90"/>
+              <w:bottom w:type="dxa" w:w="60"/>
+              <w:right w:type="dxa" w:w="90"/>
+            </w:tcMar>
+            <w:vAlign w:val="top"/>
+          </w:tcPr>
+          <w:p>
+            <w:pPr>
+              <w:spacing w:after="40"/>
+            </w:pPr>
+            <w:r>
+              <w:rPr>
+                <w:rFonts w:ascii="Calibri" w:cs="Calibri" w:eastAsia="Calibri" w:hAnsi="Calibri"/>
+                <w:color w:val="14213D"/>
+                <w:sz w:val="20"/>
+                <w:szCs w:val="20"/>
+              </w:rPr>
+              <w:t xml:space="preserve"/>
+            </w:r>
+          </w:p>
+          <w:p>
+            <w:pPr>
+              <w:spacing w:after="40"/>
+            </w:pPr>
+            <w:r>
+              <w:rPr>
+                <w:rFonts w:ascii="Calibri" w:cs="Calibri" w:eastAsia="Calibri" w:hAnsi="Calibri"/>
+                <w:color w:val="14213D"/>
+                <w:sz w:val="20"/>
+                <w:szCs w:val="20"/>
+              </w:rPr>
+              <w:t xml:space="preserve"/>
+            </w:r>
+          </w:p>
+        </w:tc>
+      </w:tr>
+      <w:tr>
+        <w:tc>
+          <w:tcPr>
+            <w:tcW w:type="dxa" w:w="2300"/>
+            <w:tcBorders>
+              <w:top w:val="single" w:color="D9D5CB" w:sz="4"/>
+              <w:left w:val="single" w:color="D9D5CB" w:sz="4"/>
+              <w:bottom w:val="single" w:color="D9D5CB" w:sz="4"/>
+              <w:right w:val="single" w:color="D9D5CB" w:sz="4"/>
+            </w:tcBorders>
+            <w:tcMar>
+              <w:top w:type="dxa" w:w="60"/>
+              <w:left w:type="dxa" w:w="90"/>
+              <w:bottom w:type="dxa" w:w="60"/>
+              <w:right w:type="dxa" w:w="90"/>
+            </w:tcMar>
+            <w:vAlign w:val="top"/>
+          </w:tcPr>
+          <w:p>
+            <w:pPr>
+              <w:spacing w:after="40"/>
+            </w:pPr>
+            <w:r>
+              <w:rPr>
+                <w:rFonts w:ascii="Calibri" w:cs="Calibri" w:eastAsia="Calibri" w:hAnsi="Calibri"/>
+                <w:b/>
+                <w:bCs/>
+                <w:color w:val="14213D"/>
+                <w:sz w:val="20"/>
+                <w:szCs w:val="20"/>
+              </w:rPr>
+              <w:t xml:space="preserve">Notification à l'accueil de l'opérateur</w:t>
+            </w:r>
+          </w:p>
+        </w:tc>
+        <w:tc>
+          <w:tcPr>
+            <w:tcW w:type="dxa" w:w="4100"/>
+            <w:tcBorders>
+              <w:top w:val="single" w:color="D9D5CB" w:sz="4"/>
+              <w:left w:val="single" w:color="D9D5CB" w:sz="4"/>
+              <w:bottom w:val="single" w:color="D9D5CB" w:sz="4"/>
+              <w:right w:val="single" w:color="D9D5CB" w:sz="4"/>
+            </w:tcBorders>
+            <w:tcMar>
+              <w:top w:type="dxa" w:w="60"/>
+              <w:left w:type="dxa" w:w="90"/>
+              <w:bottom w:type="dxa" w:w="60"/>
+              <w:right w:type="dxa" w:w="90"/>
+            </w:tcMar>
+            <w:vAlign w:val="top"/>
+          </w:tcPr>
+          <w:p>
+            <w:pPr>
+              <w:spacing w:after="40"/>
+            </w:pPr>
+            <w:r>
+              <w:rPr>
+                <w:rFonts w:ascii="Calibri" w:cs="Calibri" w:eastAsia="Calibri" w:hAnsi="Calibri"/>
+                <w:color w:val="14213D"/>
+                <w:sz w:val="19"/>
+                <w:szCs w:val="19"/>
+              </w:rPr>
+              <w:t xml:space="preserve">Accueil de Karim : « 🎯 Objectif du jour : Souder le tronçon 1 · 6 h estimées · équipe A · Caen — 📐 Feeder · PK 25 → 100 · en surbrillance 🎯 sur le plan · posé par Ethan L. » (toucher → le plan en surbrillance, sinon le Bureau), après les documents / accueil / quart d'heure obligatoires. Le héros garde son bloc 🎯.</w:t>
+            </w:r>
+          </w:p>
+        </w:tc>
+        <w:tc>
+          <w:tcPr>
+            <w:tcW w:type="dxa" w:w="3700"/>
+            <w:tcBorders>
+              <w:top w:val="single" w:color="D9D5CB" w:sz="4"/>
+              <w:left w:val="single" w:color="D9D5CB" w:sz="4"/>
+              <w:bottom w:val="single" w:color="D9D5CB" w:sz="4"/>
+              <w:right w:val="single" w:color="D9D5CB" w:sz="4"/>
+            </w:tcBorders>
+            <w:tcMar>
+              <w:top w:type="dxa" w:w="60"/>
+              <w:left w:type="dxa" w:w="90"/>
+              <w:bottom w:type="dxa" w:w="60"/>
+              <w:right w:type="dxa" w:w="90"/>
+            </w:tcMar>
+            <w:vAlign w:val="top"/>
+          </w:tcPr>
+          <w:p>
+            <w:pPr>
+              <w:spacing w:after="40"/>
+            </w:pPr>
+            <w:r>
+              <w:rPr>
+                <w:rFonts w:ascii="Calibri" w:cs="Calibri" w:eastAsia="Calibri" w:hAnsi="Calibri"/>
+                <w:color w:val="14213D"/>
+                <w:sz w:val="19"/>
+                <w:szCs w:val="19"/>
+              </w:rPr>
+              <w:t xml:space="preserve"/>
+            </w:r>
+          </w:p>
+        </w:tc>
+        <w:tc>
+          <w:tcPr>
+            <w:tcW w:type="dxa" w:w="1300"/>
+            <w:tcBorders>
+              <w:top w:val="single" w:color="D9D5CB" w:sz="4"/>
+              <w:left w:val="single" w:color="D9D5CB" w:sz="4"/>
+              <w:bottom w:val="single" w:color="D9D5CB" w:sz="4"/>
+              <w:right w:val="single" w:color="D9D5CB" w:sz="4"/>
+            </w:tcBorders>
+            <w:shd w:fill="E6F5EC" w:color="auto" w:val="clear"/>
+            <w:tcMar>
+              <w:top w:type="dxa" w:w="60"/>
+              <w:left w:type="dxa" w:w="90"/>
+              <w:bottom w:type="dxa" w:w="60"/>
+              <w:right w:type="dxa" w:w="90"/>
+            </w:tcMar>
+            <w:vAlign w:val="top"/>
+          </w:tcPr>
+          <w:p>
+            <w:pPr>
+              <w:spacing w:after="40"/>
+            </w:pPr>
+            <w:r>
+              <w:rPr>
+                <w:rFonts w:ascii="Calibri" w:cs="Calibri" w:eastAsia="Calibri" w:hAnsi="Calibri"/>
+                <w:b/>
+                <w:bCs/>
+                <w:color w:val="14213D"/>
+                <w:sz w:val="19"/>
+                <w:szCs w:val="19"/>
+              </w:rPr>
+              <w:t xml:space="preserve">Fait</w:t>
+            </w:r>
+          </w:p>
+        </w:tc>
+        <w:tc>
+          <w:tcPr>
+            <w:tcW w:type="dxa" w:w="3700"/>
+            <w:tcBorders>
+              <w:top w:val="single" w:color="D9D5CB" w:sz="4"/>
+              <w:left w:val="single" w:color="D9D5CB" w:sz="4"/>
+              <w:bottom w:val="single" w:color="D9D5CB" w:sz="4"/>
+              <w:right w:val="single" w:color="D9D5CB" w:sz="4"/>
+            </w:tcBorders>
+            <w:tcMar>
+              <w:top w:type="dxa" w:w="60"/>
+              <w:left w:type="dxa" w:w="90"/>
+              <w:bottom w:type="dxa" w:w="60"/>
+              <w:right w:type="dxa" w:w="90"/>
+            </w:tcMar>
+            <w:vAlign w:val="top"/>
+          </w:tcPr>
+          <w:p>
+            <w:pPr>
+              <w:spacing w:after="40"/>
+            </w:pPr>
+            <w:r>
+              <w:rPr>
+                <w:rFonts w:ascii="Calibri" w:cs="Calibri" w:eastAsia="Calibri" w:hAnsi="Calibri"/>
+                <w:color w:val="14213D"/>
+                <w:sz w:val="20"/>
+                <w:szCs w:val="20"/>
+              </w:rPr>
+              <w:t xml:space="preserve"/>
+            </w:r>
+          </w:p>
+          <w:p>
+            <w:pPr>
+              <w:spacing w:after="40"/>
+            </w:pPr>
+            <w:r>
+              <w:rPr>
+                <w:rFonts w:ascii="Calibri" w:cs="Calibri" w:eastAsia="Calibri" w:hAnsi="Calibri"/>
+                <w:color w:val="14213D"/>
+                <w:sz w:val="20"/>
+                <w:szCs w:val="20"/>
+              </w:rPr>
+              <w:t xml:space="preserve"/>
+            </w:r>
+          </w:p>
+        </w:tc>
+      </w:tr>
+      <w:tr>
+        <w:tc>
+          <w:tcPr>
+            <w:tcW w:type="dxa" w:w="2300"/>
+            <w:tcBorders>
+              <w:top w:val="single" w:color="D9D5CB" w:sz="4"/>
+              <w:left w:val="single" w:color="D9D5CB" w:sz="4"/>
+              <w:bottom w:val="single" w:color="D9D5CB" w:sz="4"/>
+              <w:right w:val="single" w:color="D9D5CB" w:sz="4"/>
+            </w:tcBorders>
+            <w:tcMar>
+              <w:top w:type="dxa" w:w="60"/>
+              <w:left w:type="dxa" w:w="90"/>
+              <w:bottom w:type="dxa" w:w="60"/>
+              <w:right w:type="dxa" w:w="90"/>
+            </w:tcMar>
+            <w:vAlign w:val="top"/>
+          </w:tcPr>
+          <w:p>
+            <w:pPr>
+              <w:spacing w:after="40"/>
+            </w:pPr>
+            <w:r>
+              <w:rPr>
+                <w:rFonts w:ascii="Calibri" w:cs="Calibri" w:eastAsia="Calibri" w:hAnsi="Calibri"/>
+                <w:b/>
+                <w:bCs/>
+                <w:color w:val="14213D"/>
+                <w:sz w:val="20"/>
+                <w:szCs w:val="20"/>
+              </w:rPr>
+              <w:t xml:space="preserve">Jours sur les objectifs : planifier la semaine</w:t>
+            </w:r>
+          </w:p>
+        </w:tc>
+        <w:tc>
+          <w:tcPr>
+            <w:tcW w:type="dxa" w:w="4100"/>
+            <w:tcBorders>
+              <w:top w:val="single" w:color="D9D5CB" w:sz="4"/>
+              <w:left w:val="single" w:color="D9D5CB" w:sz="4"/>
+              <w:bottom w:val="single" w:color="D9D5CB" w:sz="4"/>
+              <w:right w:val="single" w:color="D9D5CB" w:sz="4"/>
+            </w:tcBorders>
+            <w:tcMar>
+              <w:top w:type="dxa" w:w="60"/>
+              <w:left w:type="dxa" w:w="90"/>
+              <w:bottom w:type="dxa" w:w="60"/>
+              <w:right w:type="dxa" w:w="90"/>
+            </w:tcMar>
+            <w:vAlign w:val="top"/>
+          </w:tcPr>
+          <w:p>
+            <w:pPr>
+              <w:spacing w:after="40"/>
+            </w:pPr>
+            <w:r>
+              <w:rPr>
+                <w:rFonts w:ascii="Calibri" w:cs="Calibri" w:eastAsia="Calibri" w:hAnsi="Calibri"/>
+                <w:color w:val="14213D"/>
+                <w:sz w:val="19"/>
+                <w:szCs w:val="19"/>
+              </w:rPr>
+              <w:t xml:space="preserve">Le formulaire a les 5 jours de la semaine à cocher (le même objectif sur chaque jour coché), la vue se parcourt par semaine (passée / cette semaine / prochaine) et par jour. Karim voit aussi « 🎯 Objectif de lun. 12/10 : … » (à savoir) quand son chef a déjà posé la suite.</w:t>
+            </w:r>
+          </w:p>
+        </w:tc>
+        <w:tc>
+          <w:tcPr>
+            <w:tcW w:type="dxa" w:w="3700"/>
+            <w:tcBorders>
+              <w:top w:val="single" w:color="D9D5CB" w:sz="4"/>
+              <w:left w:val="single" w:color="D9D5CB" w:sz="4"/>
+              <w:bottom w:val="single" w:color="D9D5CB" w:sz="4"/>
+              <w:right w:val="single" w:color="D9D5CB" w:sz="4"/>
+            </w:tcBorders>
+            <w:tcMar>
+              <w:top w:type="dxa" w:w="60"/>
+              <w:left w:type="dxa" w:w="90"/>
+              <w:bottom w:type="dxa" w:w="60"/>
+              <w:right w:type="dxa" w:w="90"/>
+            </w:tcMar>
+            <w:vAlign w:val="top"/>
+          </w:tcPr>
+          <w:p>
+            <w:pPr>
+              <w:spacing w:after="40"/>
+            </w:pPr>
+            <w:r>
+              <w:rPr>
+                <w:rFonts w:ascii="Calibri" w:cs="Calibri" w:eastAsia="Calibri" w:hAnsi="Calibri"/>
+                <w:color w:val="14213D"/>
+                <w:sz w:val="19"/>
+                <w:szCs w:val="19"/>
+              </w:rPr>
+              <w:t xml:space="preserve"/>
+            </w:r>
+          </w:p>
+        </w:tc>
+        <w:tc>
+          <w:tcPr>
+            <w:tcW w:type="dxa" w:w="1300"/>
+            <w:tcBorders>
+              <w:top w:val="single" w:color="D9D5CB" w:sz="4"/>
+              <w:left w:val="single" w:color="D9D5CB" w:sz="4"/>
+              <w:bottom w:val="single" w:color="D9D5CB" w:sz="4"/>
+              <w:right w:val="single" w:color="D9D5CB" w:sz="4"/>
+            </w:tcBorders>
+            <w:shd w:fill="E6F5EC" w:color="auto" w:val="clear"/>
+            <w:tcMar>
+              <w:top w:type="dxa" w:w="60"/>
+              <w:left w:type="dxa" w:w="90"/>
+              <w:bottom w:type="dxa" w:w="60"/>
+              <w:right w:type="dxa" w:w="90"/>
+            </w:tcMar>
+            <w:vAlign w:val="top"/>
+          </w:tcPr>
+          <w:p>
+            <w:pPr>
+              <w:spacing w:after="40"/>
+            </w:pPr>
+            <w:r>
+              <w:rPr>
+                <w:rFonts w:ascii="Calibri" w:cs="Calibri" w:eastAsia="Calibri" w:hAnsi="Calibri"/>
+                <w:b/>
+                <w:bCs/>
+                <w:color w:val="14213D"/>
+                <w:sz w:val="19"/>
+                <w:szCs w:val="19"/>
+              </w:rPr>
+              <w:t xml:space="preserve">Fait</w:t>
             </w:r>
           </w:p>
         </w:tc>

</xml_diff>

<commit_message>
Objectifs sur le plan : tronçons par conduite + n° de soudure + soudures induites (k/n ✓), soudure/manchonnage superposés, pose qui survit au rechargement, Ta semaine, météo (fiche + bouton ☀)
</commit_message>
<xml_diff>
--- a/app/docs/Feuille_de_route_nuit_09-10-10.docx
+++ b/app/docs/Feuille_de_route_nuit_09-10-10.docx
@@ -84,7 +84,7 @@
           <w:sz w:val="20"/>
           <w:szCs w:val="20"/>
         </w:rPr>
-        <w:t xml:space="preserve">Build livré : 11/10/2026 · 2b3fe6 (retours des points 1 à 4, objectifs par équipe / jour / soudure, bac à sable) (index.html + traceur.html à la racine du dépôt). Sources : app/src (reg.js, docs.js, prevention.js, accueil.js, affaires.js, flotte.js, rh.js, commandes.js, reglement.js + app.js, espace.js, next.js, acces.js, sync.js). Notes techniques : app/NOTES.md.</w:t>
+        <w:t xml:space="preserve">Build livré : 11/10/2026 · 9189db (retours des points 1 à 4, objectifs par équipe / jour / soudure, bac à sable) (index.html + traceur.html à la racine du dépôt). Sources : app/src (reg.js, docs.js, prevention.js, accueil.js, affaires.js, flotte.js, rh.js, commandes.js, reglement.js + app.js, espace.js, next.js, acces.js, sync.js). Notes techniques : app/NOTES.md.</w:t>
       </w:r>
     </w:p>
     <w:p>
@@ -122,7 +122,7 @@
           <w:sz w:val="20"/>
           <w:szCs w:val="20"/>
         </w:rPr>
-        <w:t xml:space="preserve">Règle gardée toute la nuit : rien d'ancien n'est supprimé ; 40 suites de tests automatiques passent (30 anciennes + docs, objectifs, affaires, flotte &amp; RH, 3e vague, bureau, retours du 10/10, planning, objectif sur le plan, bac à sable).</w:t>
+        <w:t xml:space="preserve">Règle gardée toute la nuit : rien d'ancien n'est supprimé ; 41 suites de tests automatiques passent (30 anciennes + docs, objectifs, affaires, flotte &amp; RH, 3e vague, bureau, retours du 10/10, planning, objectif sur le plan, bac à sable, objectifs &amp; serveur).</w:t>
       </w:r>
     </w:p>
     <w:p>
@@ -6035,6 +6035,1273 @@
                 <w:szCs w:val="19"/>
               </w:rPr>
               <w:t xml:space="preserve">Le formulaire a les 5 jours de la semaine à cocher (le même objectif sur chaque jour coché), la vue se parcourt par semaine (passée / cette semaine / prochaine) et par jour. Karim voit aussi « 🎯 Objectif de lun. 12/10 : … » (à savoir) quand son chef a déjà posé la suite.</w:t>
+            </w:r>
+          </w:p>
+        </w:tc>
+        <w:tc>
+          <w:tcPr>
+            <w:tcW w:type="dxa" w:w="3700"/>
+            <w:tcBorders>
+              <w:top w:val="single" w:color="D9D5CB" w:sz="4"/>
+              <w:left w:val="single" w:color="D9D5CB" w:sz="4"/>
+              <w:bottom w:val="single" w:color="D9D5CB" w:sz="4"/>
+              <w:right w:val="single" w:color="D9D5CB" w:sz="4"/>
+            </w:tcBorders>
+            <w:tcMar>
+              <w:top w:type="dxa" w:w="60"/>
+              <w:left w:type="dxa" w:w="90"/>
+              <w:bottom w:type="dxa" w:w="60"/>
+              <w:right w:type="dxa" w:w="90"/>
+            </w:tcMar>
+            <w:vAlign w:val="top"/>
+          </w:tcPr>
+          <w:p>
+            <w:pPr>
+              <w:spacing w:after="40"/>
+            </w:pPr>
+            <w:r>
+              <w:rPr>
+                <w:rFonts w:ascii="Calibri" w:cs="Calibri" w:eastAsia="Calibri" w:hAnsi="Calibri"/>
+                <w:color w:val="14213D"/>
+                <w:sz w:val="19"/>
+                <w:szCs w:val="19"/>
+              </w:rPr>
+              <w:t xml:space="preserve"/>
+            </w:r>
+          </w:p>
+        </w:tc>
+        <w:tc>
+          <w:tcPr>
+            <w:tcW w:type="dxa" w:w="1300"/>
+            <w:tcBorders>
+              <w:top w:val="single" w:color="D9D5CB" w:sz="4"/>
+              <w:left w:val="single" w:color="D9D5CB" w:sz="4"/>
+              <w:bottom w:val="single" w:color="D9D5CB" w:sz="4"/>
+              <w:right w:val="single" w:color="D9D5CB" w:sz="4"/>
+            </w:tcBorders>
+            <w:shd w:fill="E6F5EC" w:color="auto" w:val="clear"/>
+            <w:tcMar>
+              <w:top w:type="dxa" w:w="60"/>
+              <w:left w:type="dxa" w:w="90"/>
+              <w:bottom w:type="dxa" w:w="60"/>
+              <w:right w:type="dxa" w:w="90"/>
+            </w:tcMar>
+            <w:vAlign w:val="top"/>
+          </w:tcPr>
+          <w:p>
+            <w:pPr>
+              <w:spacing w:after="40"/>
+            </w:pPr>
+            <w:r>
+              <w:rPr>
+                <w:rFonts w:ascii="Calibri" w:cs="Calibri" w:eastAsia="Calibri" w:hAnsi="Calibri"/>
+                <w:b/>
+                <w:bCs/>
+                <w:color w:val="14213D"/>
+                <w:sz w:val="19"/>
+                <w:szCs w:val="19"/>
+              </w:rPr>
+              <w:t xml:space="preserve">Fait</w:t>
+            </w:r>
+          </w:p>
+        </w:tc>
+        <w:tc>
+          <w:tcPr>
+            <w:tcW w:type="dxa" w:w="3700"/>
+            <w:tcBorders>
+              <w:top w:val="single" w:color="D9D5CB" w:sz="4"/>
+              <w:left w:val="single" w:color="D9D5CB" w:sz="4"/>
+              <w:bottom w:val="single" w:color="D9D5CB" w:sz="4"/>
+              <w:right w:val="single" w:color="D9D5CB" w:sz="4"/>
+            </w:tcBorders>
+            <w:tcMar>
+              <w:top w:type="dxa" w:w="60"/>
+              <w:left w:type="dxa" w:w="90"/>
+              <w:bottom w:type="dxa" w:w="60"/>
+              <w:right w:type="dxa" w:w="90"/>
+            </w:tcMar>
+            <w:vAlign w:val="top"/>
+          </w:tcPr>
+          <w:p>
+            <w:pPr>
+              <w:spacing w:after="40"/>
+            </w:pPr>
+            <w:r>
+              <w:rPr>
+                <w:rFonts w:ascii="Calibri" w:cs="Calibri" w:eastAsia="Calibri" w:hAnsi="Calibri"/>
+                <w:color w:val="14213D"/>
+                <w:sz w:val="20"/>
+                <w:szCs w:val="20"/>
+              </w:rPr>
+              <w:t xml:space="preserve"/>
+            </w:r>
+          </w:p>
+          <w:p>
+            <w:pPr>
+              <w:spacing w:after="40"/>
+            </w:pPr>
+            <w:r>
+              <w:rPr>
+                <w:rFonts w:ascii="Calibri" w:cs="Calibri" w:eastAsia="Calibri" w:hAnsi="Calibri"/>
+                <w:color w:val="14213D"/>
+                <w:sz w:val="20"/>
+                <w:szCs w:val="20"/>
+              </w:rPr>
+              <w:t xml:space="preserve"/>
+            </w:r>
+          </w:p>
+        </w:tc>
+      </w:tr>
+      <w:tr>
+        <w:tc>
+          <w:tcPr>
+            <w:tcW w:type="dxa" w:w="2300"/>
+            <w:tcBorders>
+              <w:top w:val="single" w:color="D9D5CB" w:sz="4"/>
+              <w:left w:val="single" w:color="D9D5CB" w:sz="4"/>
+              <w:bottom w:val="single" w:color="D9D5CB" w:sz="4"/>
+              <w:right w:val="single" w:color="D9D5CB" w:sz="4"/>
+            </w:tcBorders>
+            <w:tcMar>
+              <w:top w:type="dxa" w:w="60"/>
+              <w:left w:type="dxa" w:w="90"/>
+              <w:bottom w:type="dxa" w:w="60"/>
+              <w:right w:type="dxa" w:w="90"/>
+            </w:tcMar>
+            <w:vAlign w:val="top"/>
+          </w:tcPr>
+          <w:p>
+            <w:pPr>
+              <w:spacing w:after="40"/>
+            </w:pPr>
+            <w:r>
+              <w:rPr>
+                <w:rFonts w:ascii="Calibri" w:cs="Calibri" w:eastAsia="Calibri" w:hAnsi="Calibri"/>
+                <w:b/>
+                <w:bCs/>
+                <w:color w:val="14213D"/>
+                <w:sz w:val="20"/>
+                <w:szCs w:val="20"/>
+              </w:rPr>
+              <w:t xml:space="preserve">Tronçon : « ça ne prend pas tout ce qui est cliqué »</w:t>
+            </w:r>
+          </w:p>
+        </w:tc>
+        <w:tc>
+          <w:tcPr>
+            <w:tcW w:type="dxa" w:w="4100"/>
+            <w:tcBorders>
+              <w:top w:val="single" w:color="D9D5CB" w:sz="4"/>
+              <w:left w:val="single" w:color="D9D5CB" w:sz="4"/>
+              <w:bottom w:val="single" w:color="D9D5CB" w:sz="4"/>
+              <w:right w:val="single" w:color="D9D5CB" w:sz="4"/>
+            </w:tcBorders>
+            <w:tcMar>
+              <w:top w:type="dxa" w:w="60"/>
+              <w:left w:type="dxa" w:w="90"/>
+              <w:bottom w:type="dxa" w:w="60"/>
+              <w:right w:type="dxa" w:w="90"/>
+            </w:tcMar>
+            <w:vAlign w:val="top"/>
+          </w:tcPr>
+          <w:p>
+            <w:pPr>
+              <w:spacing w:after="40"/>
+            </w:pPr>
+            <w:r>
+              <w:rPr>
+                <w:rFonts w:ascii="Calibri" w:cs="Calibri" w:eastAsia="Calibri" w:hAnsi="Calibri"/>
+                <w:color w:val="14213D"/>
+                <w:sz w:val="19"/>
+                <w:szCs w:val="19"/>
+              </w:rPr>
+              <w:t xml:space="preserve">Corrigé : l'aller et le retour n'ont pas les mêmes numéros de soudure autour des coudes, l'outil les mélangeait. Maintenant : par conduite, des soudures qui se suivent = un tronçon de la première à la dernière ; le PK d'une soudure est sa vraie position sur l'axe. Un tube sur deux cliqué = des soudures isolées (cerclées), pas de tronçon : pour tout prendre, touche la conduite au début puis à la fin (ou la soudure de fin).</w:t>
+            </w:r>
+          </w:p>
+        </w:tc>
+        <w:tc>
+          <w:tcPr>
+            <w:tcW w:type="dxa" w:w="3700"/>
+            <w:tcBorders>
+              <w:top w:val="single" w:color="D9D5CB" w:sz="4"/>
+              <w:left w:val="single" w:color="D9D5CB" w:sz="4"/>
+              <w:bottom w:val="single" w:color="D9D5CB" w:sz="4"/>
+              <w:right w:val="single" w:color="D9D5CB" w:sz="4"/>
+            </w:tcBorders>
+            <w:tcMar>
+              <w:top w:type="dxa" w:w="60"/>
+              <w:left w:type="dxa" w:w="90"/>
+              <w:bottom w:type="dxa" w:w="60"/>
+              <w:right w:type="dxa" w:w="90"/>
+            </w:tcMar>
+            <w:vAlign w:val="top"/>
+          </w:tcPr>
+          <w:p>
+            <w:pPr>
+              <w:spacing w:after="40"/>
+            </w:pPr>
+            <w:r>
+              <w:rPr>
+                <w:rFonts w:ascii="Calibri" w:cs="Calibri" w:eastAsia="Calibri" w:hAnsi="Calibri"/>
+                <w:color w:val="14213D"/>
+                <w:sz w:val="19"/>
+                <w:szCs w:val="19"/>
+              </w:rPr>
+              <w:t xml:space="preserve"/>
+            </w:r>
+          </w:p>
+        </w:tc>
+        <w:tc>
+          <w:tcPr>
+            <w:tcW w:type="dxa" w:w="1300"/>
+            <w:tcBorders>
+              <w:top w:val="single" w:color="D9D5CB" w:sz="4"/>
+              <w:left w:val="single" w:color="D9D5CB" w:sz="4"/>
+              <w:bottom w:val="single" w:color="D9D5CB" w:sz="4"/>
+              <w:right w:val="single" w:color="D9D5CB" w:sz="4"/>
+            </w:tcBorders>
+            <w:shd w:fill="FFF4EE" w:color="auto" w:val="clear"/>
+            <w:tcMar>
+              <w:top w:type="dxa" w:w="60"/>
+              <w:left w:type="dxa" w:w="90"/>
+              <w:bottom w:type="dxa" w:w="60"/>
+              <w:right w:type="dxa" w:w="90"/>
+            </w:tcMar>
+            <w:vAlign w:val="top"/>
+          </w:tcPr>
+          <w:p>
+            <w:pPr>
+              <w:spacing w:after="40"/>
+            </w:pPr>
+            <w:r>
+              <w:rPr>
+                <w:rFonts w:ascii="Calibri" w:cs="Calibri" w:eastAsia="Calibri" w:hAnsi="Calibri"/>
+                <w:b/>
+                <w:bCs/>
+                <w:color w:val="14213D"/>
+                <w:sz w:val="19"/>
+                <w:szCs w:val="19"/>
+              </w:rPr>
+              <w:t xml:space="preserve">Corrigé</w:t>
+            </w:r>
+          </w:p>
+        </w:tc>
+        <w:tc>
+          <w:tcPr>
+            <w:tcW w:type="dxa" w:w="3700"/>
+            <w:tcBorders>
+              <w:top w:val="single" w:color="D9D5CB" w:sz="4"/>
+              <w:left w:val="single" w:color="D9D5CB" w:sz="4"/>
+              <w:bottom w:val="single" w:color="D9D5CB" w:sz="4"/>
+              <w:right w:val="single" w:color="D9D5CB" w:sz="4"/>
+            </w:tcBorders>
+            <w:tcMar>
+              <w:top w:type="dxa" w:w="60"/>
+              <w:left w:type="dxa" w:w="90"/>
+              <w:bottom w:type="dxa" w:w="60"/>
+              <w:right w:type="dxa" w:w="90"/>
+            </w:tcMar>
+            <w:vAlign w:val="top"/>
+          </w:tcPr>
+          <w:p>
+            <w:pPr>
+              <w:spacing w:after="40"/>
+            </w:pPr>
+            <w:r>
+              <w:rPr>
+                <w:rFonts w:ascii="Calibri" w:cs="Calibri" w:eastAsia="Calibri" w:hAnsi="Calibri"/>
+                <w:color w:val="14213D"/>
+                <w:sz w:val="20"/>
+                <w:szCs w:val="20"/>
+              </w:rPr>
+              <w:t xml:space="preserve"/>
+            </w:r>
+          </w:p>
+          <w:p>
+            <w:pPr>
+              <w:spacing w:after="40"/>
+            </w:pPr>
+            <w:r>
+              <w:rPr>
+                <w:rFonts w:ascii="Calibri" w:cs="Calibri" w:eastAsia="Calibri" w:hAnsi="Calibri"/>
+                <w:color w:val="14213D"/>
+                <w:sz w:val="20"/>
+                <w:szCs w:val="20"/>
+              </w:rPr>
+              <w:t xml:space="preserve"/>
+            </w:r>
+          </w:p>
+        </w:tc>
+      </w:tr>
+      <w:tr>
+        <w:tc>
+          <w:tcPr>
+            <w:tcW w:type="dxa" w:w="2300"/>
+            <w:tcBorders>
+              <w:top w:val="single" w:color="D9D5CB" w:sz="4"/>
+              <w:left w:val="single" w:color="D9D5CB" w:sz="4"/>
+              <w:bottom w:val="single" w:color="D9D5CB" w:sz="4"/>
+              <w:right w:val="single" w:color="D9D5CB" w:sz="4"/>
+            </w:tcBorders>
+            <w:tcMar>
+              <w:top w:type="dxa" w:w="60"/>
+              <w:left w:type="dxa" w:w="90"/>
+              <w:bottom w:type="dxa" w:w="60"/>
+              <w:right w:type="dxa" w:w="90"/>
+            </w:tcMar>
+            <w:vAlign w:val="top"/>
+          </w:tcPr>
+          <w:p>
+            <w:pPr>
+              <w:spacing w:after="40"/>
+            </w:pPr>
+            <w:r>
+              <w:rPr>
+                <w:rFonts w:ascii="Calibri" w:cs="Calibri" w:eastAsia="Calibri" w:hAnsi="Calibri"/>
+                <w:b/>
+                <w:bCs/>
+                <w:color w:val="14213D"/>
+                <w:sz w:val="20"/>
+                <w:szCs w:val="20"/>
+              </w:rPr>
+              <w:t xml:space="preserve">Le nombre de soudures que ça induit</w:t>
+            </w:r>
+          </w:p>
+        </w:tc>
+        <w:tc>
+          <w:tcPr>
+            <w:tcW w:type="dxa" w:w="4100"/>
+            <w:tcBorders>
+              <w:top w:val="single" w:color="D9D5CB" w:sz="4"/>
+              <w:left w:val="single" w:color="D9D5CB" w:sz="4"/>
+              <w:bottom w:val="single" w:color="D9D5CB" w:sz="4"/>
+              <w:right w:val="single" w:color="D9D5CB" w:sz="4"/>
+            </w:tcBorders>
+            <w:tcMar>
+              <w:top w:type="dxa" w:w="60"/>
+              <w:left w:type="dxa" w:w="90"/>
+              <w:bottom w:type="dxa" w:w="60"/>
+              <w:right w:type="dxa" w:w="90"/>
+            </w:tcMar>
+            <w:vAlign w:val="top"/>
+          </w:tcPr>
+          <w:p>
+            <w:pPr>
+              <w:spacing w:after="40"/>
+            </w:pPr>
+            <w:r>
+              <w:rPr>
+                <w:rFonts w:ascii="Calibri" w:cs="Calibri" w:eastAsia="Calibri" w:hAnsi="Calibri"/>
+                <w:color w:val="14213D"/>
+                <w:sz w:val="19"/>
+                <w:szCs w:val="19"/>
+              </w:rPr>
+              <w:t xml:space="preserve">Chaque objectif sur le plan affiche « 🔧 n soudures (k/n ✓) » : les soudures touchées + toutes celles des deux conduites couvertes par un tronçon début / fin ; k = soudées (manchonnage : manchons posés). Dans la liste, le Bureau, l'accueil, la notification et l'étiquette 🎯 sur le plan.</w:t>
+            </w:r>
+          </w:p>
+        </w:tc>
+        <w:tc>
+          <w:tcPr>
+            <w:tcW w:type="dxa" w:w="3700"/>
+            <w:tcBorders>
+              <w:top w:val="single" w:color="D9D5CB" w:sz="4"/>
+              <w:left w:val="single" w:color="D9D5CB" w:sz="4"/>
+              <w:bottom w:val="single" w:color="D9D5CB" w:sz="4"/>
+              <w:right w:val="single" w:color="D9D5CB" w:sz="4"/>
+            </w:tcBorders>
+            <w:tcMar>
+              <w:top w:type="dxa" w:w="60"/>
+              <w:left w:type="dxa" w:w="90"/>
+              <w:bottom w:type="dxa" w:w="60"/>
+              <w:right w:type="dxa" w:w="90"/>
+            </w:tcMar>
+            <w:vAlign w:val="top"/>
+          </w:tcPr>
+          <w:p>
+            <w:pPr>
+              <w:spacing w:after="40"/>
+            </w:pPr>
+            <w:r>
+              <w:rPr>
+                <w:rFonts w:ascii="Calibri" w:cs="Calibri" w:eastAsia="Calibri" w:hAnsi="Calibri"/>
+                <w:color w:val="14213D"/>
+                <w:sz w:val="19"/>
+                <w:szCs w:val="19"/>
+              </w:rPr>
+              <w:t xml:space="preserve"/>
+            </w:r>
+          </w:p>
+        </w:tc>
+        <w:tc>
+          <w:tcPr>
+            <w:tcW w:type="dxa" w:w="1300"/>
+            <w:tcBorders>
+              <w:top w:val="single" w:color="D9D5CB" w:sz="4"/>
+              <w:left w:val="single" w:color="D9D5CB" w:sz="4"/>
+              <w:bottom w:val="single" w:color="D9D5CB" w:sz="4"/>
+              <w:right w:val="single" w:color="D9D5CB" w:sz="4"/>
+            </w:tcBorders>
+            <w:shd w:fill="E6F5EC" w:color="auto" w:val="clear"/>
+            <w:tcMar>
+              <w:top w:type="dxa" w:w="60"/>
+              <w:left w:type="dxa" w:w="90"/>
+              <w:bottom w:type="dxa" w:w="60"/>
+              <w:right w:type="dxa" w:w="90"/>
+            </w:tcMar>
+            <w:vAlign w:val="top"/>
+          </w:tcPr>
+          <w:p>
+            <w:pPr>
+              <w:spacing w:after="40"/>
+            </w:pPr>
+            <w:r>
+              <w:rPr>
+                <w:rFonts w:ascii="Calibri" w:cs="Calibri" w:eastAsia="Calibri" w:hAnsi="Calibri"/>
+                <w:b/>
+                <w:bCs/>
+                <w:color w:val="14213D"/>
+                <w:sz w:val="19"/>
+                <w:szCs w:val="19"/>
+              </w:rPr>
+              <w:t xml:space="preserve">Fait</w:t>
+            </w:r>
+          </w:p>
+        </w:tc>
+        <w:tc>
+          <w:tcPr>
+            <w:tcW w:type="dxa" w:w="3700"/>
+            <w:tcBorders>
+              <w:top w:val="single" w:color="D9D5CB" w:sz="4"/>
+              <w:left w:val="single" w:color="D9D5CB" w:sz="4"/>
+              <w:bottom w:val="single" w:color="D9D5CB" w:sz="4"/>
+              <w:right w:val="single" w:color="D9D5CB" w:sz="4"/>
+            </w:tcBorders>
+            <w:tcMar>
+              <w:top w:type="dxa" w:w="60"/>
+              <w:left w:type="dxa" w:w="90"/>
+              <w:bottom w:type="dxa" w:w="60"/>
+              <w:right w:type="dxa" w:w="90"/>
+            </w:tcMar>
+            <w:vAlign w:val="top"/>
+          </w:tcPr>
+          <w:p>
+            <w:pPr>
+              <w:spacing w:after="40"/>
+            </w:pPr>
+            <w:r>
+              <w:rPr>
+                <w:rFonts w:ascii="Calibri" w:cs="Calibri" w:eastAsia="Calibri" w:hAnsi="Calibri"/>
+                <w:color w:val="14213D"/>
+                <w:sz w:val="20"/>
+                <w:szCs w:val="20"/>
+              </w:rPr>
+              <w:t xml:space="preserve"/>
+            </w:r>
+          </w:p>
+          <w:p>
+            <w:pPr>
+              <w:spacing w:after="40"/>
+            </w:pPr>
+            <w:r>
+              <w:rPr>
+                <w:rFonts w:ascii="Calibri" w:cs="Calibri" w:eastAsia="Calibri" w:hAnsi="Calibri"/>
+                <w:color w:val="14213D"/>
+                <w:sz w:val="20"/>
+                <w:szCs w:val="20"/>
+              </w:rPr>
+              <w:t xml:space="preserve"/>
+            </w:r>
+          </w:p>
+        </w:tc>
+      </w:tr>
+      <w:tr>
+        <w:tc>
+          <w:tcPr>
+            <w:tcW w:type="dxa" w:w="2300"/>
+            <w:tcBorders>
+              <w:top w:val="single" w:color="D9D5CB" w:sz="4"/>
+              <w:left w:val="single" w:color="D9D5CB" w:sz="4"/>
+              <w:bottom w:val="single" w:color="D9D5CB" w:sz="4"/>
+              <w:right w:val="single" w:color="D9D5CB" w:sz="4"/>
+            </w:tcBorders>
+            <w:tcMar>
+              <w:top w:type="dxa" w:w="60"/>
+              <w:left w:type="dxa" w:w="90"/>
+              <w:bottom w:type="dxa" w:w="60"/>
+              <w:right w:type="dxa" w:w="90"/>
+            </w:tcMar>
+            <w:vAlign w:val="top"/>
+          </w:tcPr>
+          <w:p>
+            <w:pPr>
+              <w:spacing w:after="40"/>
+            </w:pPr>
+            <w:r>
+              <w:rPr>
+                <w:rFonts w:ascii="Calibri" w:cs="Calibri" w:eastAsia="Calibri" w:hAnsi="Calibri"/>
+                <w:b/>
+                <w:bCs/>
+                <w:color w:val="14213D"/>
+                <w:sz w:val="20"/>
+                <w:szCs w:val="20"/>
+              </w:rPr>
+              <w:t xml:space="preserve">« Ligne L13 » : personne ne sait ce que c'est</w:t>
+            </w:r>
+          </w:p>
+        </w:tc>
+        <w:tc>
+          <w:tcPr>
+            <w:tcW w:type="dxa" w:w="4100"/>
+            <w:tcBorders>
+              <w:top w:val="single" w:color="D9D5CB" w:sz="4"/>
+              <w:left w:val="single" w:color="D9D5CB" w:sz="4"/>
+              <w:bottom w:val="single" w:color="D9D5CB" w:sz="4"/>
+              <w:right w:val="single" w:color="D9D5CB" w:sz="4"/>
+            </w:tcBorders>
+            <w:tcMar>
+              <w:top w:type="dxa" w:w="60"/>
+              <w:left w:type="dxa" w:w="90"/>
+              <w:bottom w:type="dxa" w:w="60"/>
+              <w:right w:type="dxa" w:w="90"/>
+            </w:tcMar>
+            <w:vAlign w:val="top"/>
+          </w:tcPr>
+          <w:p>
+            <w:pPr>
+              <w:spacing w:after="40"/>
+            </w:pPr>
+            <w:r>
+              <w:rPr>
+                <w:rFonts w:ascii="Calibri" w:cs="Calibri" w:eastAsia="Calibri" w:hAnsi="Calibri"/>
+                <w:color w:val="14213D"/>
+                <w:sz w:val="19"/>
+                <w:szCs w:val="19"/>
+              </w:rPr>
+              <w:t xml:space="preserve">Les tronçons se nomment par leurs soudures : « S-0004 → S-0008 · S-0014 → S-0018 » (premier → dernier n° par conduite). Le PK n'apparaît que si le tronçon ne contient aucune soudure.</w:t>
+            </w:r>
+          </w:p>
+        </w:tc>
+        <w:tc>
+          <w:tcPr>
+            <w:tcW w:type="dxa" w:w="3700"/>
+            <w:tcBorders>
+              <w:top w:val="single" w:color="D9D5CB" w:sz="4"/>
+              <w:left w:val="single" w:color="D9D5CB" w:sz="4"/>
+              <w:bottom w:val="single" w:color="D9D5CB" w:sz="4"/>
+              <w:right w:val="single" w:color="D9D5CB" w:sz="4"/>
+            </w:tcBorders>
+            <w:tcMar>
+              <w:top w:type="dxa" w:w="60"/>
+              <w:left w:type="dxa" w:w="90"/>
+              <w:bottom w:type="dxa" w:w="60"/>
+              <w:right w:type="dxa" w:w="90"/>
+            </w:tcMar>
+            <w:vAlign w:val="top"/>
+          </w:tcPr>
+          <w:p>
+            <w:pPr>
+              <w:spacing w:after="40"/>
+            </w:pPr>
+            <w:r>
+              <w:rPr>
+                <w:rFonts w:ascii="Calibri" w:cs="Calibri" w:eastAsia="Calibri" w:hAnsi="Calibri"/>
+                <w:color w:val="14213D"/>
+                <w:sz w:val="19"/>
+                <w:szCs w:val="19"/>
+              </w:rPr>
+              <w:t xml:space="preserve"/>
+            </w:r>
+          </w:p>
+        </w:tc>
+        <w:tc>
+          <w:tcPr>
+            <w:tcW w:type="dxa" w:w="1300"/>
+            <w:tcBorders>
+              <w:top w:val="single" w:color="D9D5CB" w:sz="4"/>
+              <w:left w:val="single" w:color="D9D5CB" w:sz="4"/>
+              <w:bottom w:val="single" w:color="D9D5CB" w:sz="4"/>
+              <w:right w:val="single" w:color="D9D5CB" w:sz="4"/>
+            </w:tcBorders>
+            <w:shd w:fill="E6F5EC" w:color="auto" w:val="clear"/>
+            <w:tcMar>
+              <w:top w:type="dxa" w:w="60"/>
+              <w:left w:type="dxa" w:w="90"/>
+              <w:bottom w:type="dxa" w:w="60"/>
+              <w:right w:type="dxa" w:w="90"/>
+            </w:tcMar>
+            <w:vAlign w:val="top"/>
+          </w:tcPr>
+          <w:p>
+            <w:pPr>
+              <w:spacing w:after="40"/>
+            </w:pPr>
+            <w:r>
+              <w:rPr>
+                <w:rFonts w:ascii="Calibri" w:cs="Calibri" w:eastAsia="Calibri" w:hAnsi="Calibri"/>
+                <w:b/>
+                <w:bCs/>
+                <w:color w:val="14213D"/>
+                <w:sz w:val="19"/>
+                <w:szCs w:val="19"/>
+              </w:rPr>
+              <w:t xml:space="preserve">Fait</w:t>
+            </w:r>
+          </w:p>
+        </w:tc>
+        <w:tc>
+          <w:tcPr>
+            <w:tcW w:type="dxa" w:w="3700"/>
+            <w:tcBorders>
+              <w:top w:val="single" w:color="D9D5CB" w:sz="4"/>
+              <w:left w:val="single" w:color="D9D5CB" w:sz="4"/>
+              <w:bottom w:val="single" w:color="D9D5CB" w:sz="4"/>
+              <w:right w:val="single" w:color="D9D5CB" w:sz="4"/>
+            </w:tcBorders>
+            <w:tcMar>
+              <w:top w:type="dxa" w:w="60"/>
+              <w:left w:type="dxa" w:w="90"/>
+              <w:bottom w:type="dxa" w:w="60"/>
+              <w:right w:type="dxa" w:w="90"/>
+            </w:tcMar>
+            <w:vAlign w:val="top"/>
+          </w:tcPr>
+          <w:p>
+            <w:pPr>
+              <w:spacing w:after="40"/>
+            </w:pPr>
+            <w:r>
+              <w:rPr>
+                <w:rFonts w:ascii="Calibri" w:cs="Calibri" w:eastAsia="Calibri" w:hAnsi="Calibri"/>
+                <w:color w:val="14213D"/>
+                <w:sz w:val="20"/>
+                <w:szCs w:val="20"/>
+              </w:rPr>
+              <w:t xml:space="preserve"/>
+            </w:r>
+          </w:p>
+          <w:p>
+            <w:pPr>
+              <w:spacing w:after="40"/>
+            </w:pPr>
+            <w:r>
+              <w:rPr>
+                <w:rFonts w:ascii="Calibri" w:cs="Calibri" w:eastAsia="Calibri" w:hAnsi="Calibri"/>
+                <w:color w:val="14213D"/>
+                <w:sz w:val="20"/>
+                <w:szCs w:val="20"/>
+              </w:rPr>
+              <w:t xml:space="preserve"/>
+            </w:r>
+          </w:p>
+        </w:tc>
+      </w:tr>
+      <w:tr>
+        <w:tc>
+          <w:tcPr>
+            <w:tcW w:type="dxa" w:w="2300"/>
+            <w:tcBorders>
+              <w:top w:val="single" w:color="D9D5CB" w:sz="4"/>
+              <w:left w:val="single" w:color="D9D5CB" w:sz="4"/>
+              <w:bottom w:val="single" w:color="D9D5CB" w:sz="4"/>
+              <w:right w:val="single" w:color="D9D5CB" w:sz="4"/>
+            </w:tcBorders>
+            <w:tcMar>
+              <w:top w:type="dxa" w:w="60"/>
+              <w:left w:type="dxa" w:w="90"/>
+              <w:bottom w:type="dxa" w:w="60"/>
+              <w:right w:type="dxa" w:w="90"/>
+            </w:tcMar>
+            <w:vAlign w:val="top"/>
+          </w:tcPr>
+          <w:p>
+            <w:pPr>
+              <w:spacing w:after="40"/>
+            </w:pPr>
+            <w:r>
+              <w:rPr>
+                <w:rFonts w:ascii="Calibri" w:cs="Calibri" w:eastAsia="Calibri" w:hAnsi="Calibri"/>
+                <w:b/>
+                <w:bCs/>
+                <w:color w:val="14213D"/>
+                <w:sz w:val="20"/>
+                <w:szCs w:val="20"/>
+              </w:rPr>
+              <w:t xml:space="preserve">Superposer soudure et manchonnage sur le même tronçon</w:t>
+            </w:r>
+          </w:p>
+        </w:tc>
+        <w:tc>
+          <w:tcPr>
+            <w:tcW w:type="dxa" w:w="4100"/>
+            <w:tcBorders>
+              <w:top w:val="single" w:color="D9D5CB" w:sz="4"/>
+              <w:left w:val="single" w:color="D9D5CB" w:sz="4"/>
+              <w:bottom w:val="single" w:color="D9D5CB" w:sz="4"/>
+              <w:right w:val="single" w:color="D9D5CB" w:sz="4"/>
+            </w:tcBorders>
+            <w:tcMar>
+              <w:top w:type="dxa" w:w="60"/>
+              <w:left w:type="dxa" w:w="90"/>
+              <w:bottom w:type="dxa" w:w="60"/>
+              <w:right w:type="dxa" w:w="90"/>
+            </w:tcMar>
+            <w:vAlign w:val="top"/>
+          </w:tcPr>
+          <w:p>
+            <w:pPr>
+              <w:spacing w:after="40"/>
+            </w:pPr>
+            <w:r>
+              <w:rPr>
+                <w:rFonts w:ascii="Calibri" w:cs="Calibri" w:eastAsia="Calibri" w:hAnsi="Calibri"/>
+                <w:color w:val="14213D"/>
+                <w:sz w:val="19"/>
+                <w:szCs w:val="19"/>
+              </w:rPr>
+              <w:t xml:space="preserve">Couleur par type : soudure orange (large, dessous), manchonnage violet pointillé (fin, dessus) ; les étiquettes 🎯 s'empilent au lieu de se cacher ; chacun a son avancement (soudées / manchonnées).</w:t>
+            </w:r>
+          </w:p>
+        </w:tc>
+        <w:tc>
+          <w:tcPr>
+            <w:tcW w:type="dxa" w:w="3700"/>
+            <w:tcBorders>
+              <w:top w:val="single" w:color="D9D5CB" w:sz="4"/>
+              <w:left w:val="single" w:color="D9D5CB" w:sz="4"/>
+              <w:bottom w:val="single" w:color="D9D5CB" w:sz="4"/>
+              <w:right w:val="single" w:color="D9D5CB" w:sz="4"/>
+            </w:tcBorders>
+            <w:tcMar>
+              <w:top w:type="dxa" w:w="60"/>
+              <w:left w:type="dxa" w:w="90"/>
+              <w:bottom w:type="dxa" w:w="60"/>
+              <w:right w:type="dxa" w:w="90"/>
+            </w:tcMar>
+            <w:vAlign w:val="top"/>
+          </w:tcPr>
+          <w:p>
+            <w:pPr>
+              <w:spacing w:after="40"/>
+            </w:pPr>
+            <w:r>
+              <w:rPr>
+                <w:rFonts w:ascii="Calibri" w:cs="Calibri" w:eastAsia="Calibri" w:hAnsi="Calibri"/>
+                <w:color w:val="14213D"/>
+                <w:sz w:val="19"/>
+                <w:szCs w:val="19"/>
+              </w:rPr>
+              <w:t xml:space="preserve"/>
+            </w:r>
+          </w:p>
+        </w:tc>
+        <w:tc>
+          <w:tcPr>
+            <w:tcW w:type="dxa" w:w="1300"/>
+            <w:tcBorders>
+              <w:top w:val="single" w:color="D9D5CB" w:sz="4"/>
+              <w:left w:val="single" w:color="D9D5CB" w:sz="4"/>
+              <w:bottom w:val="single" w:color="D9D5CB" w:sz="4"/>
+              <w:right w:val="single" w:color="D9D5CB" w:sz="4"/>
+            </w:tcBorders>
+            <w:shd w:fill="E6F5EC" w:color="auto" w:val="clear"/>
+            <w:tcMar>
+              <w:top w:type="dxa" w:w="60"/>
+              <w:left w:type="dxa" w:w="90"/>
+              <w:bottom w:type="dxa" w:w="60"/>
+              <w:right w:type="dxa" w:w="90"/>
+            </w:tcMar>
+            <w:vAlign w:val="top"/>
+          </w:tcPr>
+          <w:p>
+            <w:pPr>
+              <w:spacing w:after="40"/>
+            </w:pPr>
+            <w:r>
+              <w:rPr>
+                <w:rFonts w:ascii="Calibri" w:cs="Calibri" w:eastAsia="Calibri" w:hAnsi="Calibri"/>
+                <w:b/>
+                <w:bCs/>
+                <w:color w:val="14213D"/>
+                <w:sz w:val="19"/>
+                <w:szCs w:val="19"/>
+              </w:rPr>
+              <w:t xml:space="preserve">Fait</w:t>
+            </w:r>
+          </w:p>
+        </w:tc>
+        <w:tc>
+          <w:tcPr>
+            <w:tcW w:type="dxa" w:w="3700"/>
+            <w:tcBorders>
+              <w:top w:val="single" w:color="D9D5CB" w:sz="4"/>
+              <w:left w:val="single" w:color="D9D5CB" w:sz="4"/>
+              <w:bottom w:val="single" w:color="D9D5CB" w:sz="4"/>
+              <w:right w:val="single" w:color="D9D5CB" w:sz="4"/>
+            </w:tcBorders>
+            <w:tcMar>
+              <w:top w:type="dxa" w:w="60"/>
+              <w:left w:type="dxa" w:w="90"/>
+              <w:bottom w:type="dxa" w:w="60"/>
+              <w:right w:type="dxa" w:w="90"/>
+            </w:tcMar>
+            <w:vAlign w:val="top"/>
+          </w:tcPr>
+          <w:p>
+            <w:pPr>
+              <w:spacing w:after="40"/>
+            </w:pPr>
+            <w:r>
+              <w:rPr>
+                <w:rFonts w:ascii="Calibri" w:cs="Calibri" w:eastAsia="Calibri" w:hAnsi="Calibri"/>
+                <w:color w:val="14213D"/>
+                <w:sz w:val="20"/>
+                <w:szCs w:val="20"/>
+              </w:rPr>
+              <w:t xml:space="preserve"/>
+            </w:r>
+          </w:p>
+          <w:p>
+            <w:pPr>
+              <w:spacing w:after="40"/>
+            </w:pPr>
+            <w:r>
+              <w:rPr>
+                <w:rFonts w:ascii="Calibri" w:cs="Calibri" w:eastAsia="Calibri" w:hAnsi="Calibri"/>
+                <w:color w:val="14213D"/>
+                <w:sz w:val="20"/>
+                <w:szCs w:val="20"/>
+              </w:rPr>
+              <w:t xml:space="preserve"/>
+            </w:r>
+          </w:p>
+        </w:tc>
+      </w:tr>
+      <w:tr>
+        <w:tc>
+          <w:tcPr>
+            <w:tcW w:type="dxa" w:w="2300"/>
+            <w:tcBorders>
+              <w:top w:val="single" w:color="D9D5CB" w:sz="4"/>
+              <w:left w:val="single" w:color="D9D5CB" w:sz="4"/>
+              <w:bottom w:val="single" w:color="D9D5CB" w:sz="4"/>
+              <w:right w:val="single" w:color="D9D5CB" w:sz="4"/>
+            </w:tcBorders>
+            <w:tcMar>
+              <w:top w:type="dxa" w:w="60"/>
+              <w:left w:type="dxa" w:w="90"/>
+              <w:bottom w:type="dxa" w:w="60"/>
+              <w:right w:type="dxa" w:w="90"/>
+            </w:tcMar>
+            <w:vAlign w:val="top"/>
+          </w:tcPr>
+          <w:p>
+            <w:pPr>
+              <w:spacing w:after="40"/>
+            </w:pPr>
+            <w:r>
+              <w:rPr>
+                <w:rFonts w:ascii="Calibri" w:cs="Calibri" w:eastAsia="Calibri" w:hAnsi="Calibri"/>
+                <w:b/>
+                <w:bCs/>
+                <w:color w:val="14213D"/>
+                <w:sz w:val="20"/>
+                <w:szCs w:val="20"/>
+              </w:rPr>
+              <w:t xml:space="preserve">« x soudures rechargées » ferme la pose</w:t>
+            </w:r>
+          </w:p>
+        </w:tc>
+        <w:tc>
+          <w:tcPr>
+            <w:tcW w:type="dxa" w:w="4100"/>
+            <w:tcBorders>
+              <w:top w:val="single" w:color="D9D5CB" w:sz="4"/>
+              <w:left w:val="single" w:color="D9D5CB" w:sz="4"/>
+              <w:bottom w:val="single" w:color="D9D5CB" w:sz="4"/>
+              <w:right w:val="single" w:color="D9D5CB" w:sz="4"/>
+            </w:tcBorders>
+            <w:tcMar>
+              <w:top w:type="dxa" w:w="60"/>
+              <w:left w:type="dxa" w:w="90"/>
+              <w:bottom w:type="dxa" w:w="60"/>
+              <w:right w:type="dxa" w:w="90"/>
+            </w:tcMar>
+            <w:vAlign w:val="top"/>
+          </w:tcPr>
+          <w:p>
+            <w:pPr>
+              <w:spacing w:after="40"/>
+            </w:pPr>
+            <w:r>
+              <w:rPr>
+                <w:rFonts w:ascii="Calibri" w:cs="Calibri" w:eastAsia="Calibri" w:hAnsi="Calibri"/>
+                <w:color w:val="14213D"/>
+                <w:sz w:val="19"/>
+                <w:szCs w:val="19"/>
+              </w:rPr>
+              <w:t xml:space="preserve">Cause : poser un objectif écrivait au serveur sans aligner la date locale → 90 s plus tard l'appli croyait le serveur plus récent et rechargeait le chantier (ce qui fermait la pose). Corrigé : date alignée, aucun rechargement pendant une saisie sur le plan, et si le chantier se recharge quand même, la pose survit. En prime : un objectif posé par un autre appareil arrive tout de suite.</w:t>
+            </w:r>
+          </w:p>
+        </w:tc>
+        <w:tc>
+          <w:tcPr>
+            <w:tcW w:type="dxa" w:w="3700"/>
+            <w:tcBorders>
+              <w:top w:val="single" w:color="D9D5CB" w:sz="4"/>
+              <w:left w:val="single" w:color="D9D5CB" w:sz="4"/>
+              <w:bottom w:val="single" w:color="D9D5CB" w:sz="4"/>
+              <w:right w:val="single" w:color="D9D5CB" w:sz="4"/>
+            </w:tcBorders>
+            <w:tcMar>
+              <w:top w:type="dxa" w:w="60"/>
+              <w:left w:type="dxa" w:w="90"/>
+              <w:bottom w:type="dxa" w:w="60"/>
+              <w:right w:type="dxa" w:w="90"/>
+            </w:tcMar>
+            <w:vAlign w:val="top"/>
+          </w:tcPr>
+          <w:p>
+            <w:pPr>
+              <w:spacing w:after="40"/>
+            </w:pPr>
+            <w:r>
+              <w:rPr>
+                <w:rFonts w:ascii="Calibri" w:cs="Calibri" w:eastAsia="Calibri" w:hAnsi="Calibri"/>
+                <w:color w:val="14213D"/>
+                <w:sz w:val="19"/>
+                <w:szCs w:val="19"/>
+              </w:rPr>
+              <w:t xml:space="preserve">Vérifié par un test avec serveur simulé (e2e_objsync).</w:t>
+            </w:r>
+          </w:p>
+        </w:tc>
+        <w:tc>
+          <w:tcPr>
+            <w:tcW w:type="dxa" w:w="1300"/>
+            <w:tcBorders>
+              <w:top w:val="single" w:color="D9D5CB" w:sz="4"/>
+              <w:left w:val="single" w:color="D9D5CB" w:sz="4"/>
+              <w:bottom w:val="single" w:color="D9D5CB" w:sz="4"/>
+              <w:right w:val="single" w:color="D9D5CB" w:sz="4"/>
+            </w:tcBorders>
+            <w:shd w:fill="FFF4EE" w:color="auto" w:val="clear"/>
+            <w:tcMar>
+              <w:top w:type="dxa" w:w="60"/>
+              <w:left w:type="dxa" w:w="90"/>
+              <w:bottom w:type="dxa" w:w="60"/>
+              <w:right w:type="dxa" w:w="90"/>
+            </w:tcMar>
+            <w:vAlign w:val="top"/>
+          </w:tcPr>
+          <w:p>
+            <w:pPr>
+              <w:spacing w:after="40"/>
+            </w:pPr>
+            <w:r>
+              <w:rPr>
+                <w:rFonts w:ascii="Calibri" w:cs="Calibri" w:eastAsia="Calibri" w:hAnsi="Calibri"/>
+                <w:b/>
+                <w:bCs/>
+                <w:color w:val="14213D"/>
+                <w:sz w:val="19"/>
+                <w:szCs w:val="19"/>
+              </w:rPr>
+              <w:t xml:space="preserve">Corrigé</w:t>
+            </w:r>
+          </w:p>
+        </w:tc>
+        <w:tc>
+          <w:tcPr>
+            <w:tcW w:type="dxa" w:w="3700"/>
+            <w:tcBorders>
+              <w:top w:val="single" w:color="D9D5CB" w:sz="4"/>
+              <w:left w:val="single" w:color="D9D5CB" w:sz="4"/>
+              <w:bottom w:val="single" w:color="D9D5CB" w:sz="4"/>
+              <w:right w:val="single" w:color="D9D5CB" w:sz="4"/>
+            </w:tcBorders>
+            <w:tcMar>
+              <w:top w:type="dxa" w:w="60"/>
+              <w:left w:type="dxa" w:w="90"/>
+              <w:bottom w:type="dxa" w:w="60"/>
+              <w:right w:type="dxa" w:w="90"/>
+            </w:tcMar>
+            <w:vAlign w:val="top"/>
+          </w:tcPr>
+          <w:p>
+            <w:pPr>
+              <w:spacing w:after="40"/>
+            </w:pPr>
+            <w:r>
+              <w:rPr>
+                <w:rFonts w:ascii="Calibri" w:cs="Calibri" w:eastAsia="Calibri" w:hAnsi="Calibri"/>
+                <w:color w:val="14213D"/>
+                <w:sz w:val="20"/>
+                <w:szCs w:val="20"/>
+              </w:rPr>
+              <w:t xml:space="preserve"/>
+            </w:r>
+          </w:p>
+          <w:p>
+            <w:pPr>
+              <w:spacing w:after="40"/>
+            </w:pPr>
+            <w:r>
+              <w:rPr>
+                <w:rFonts w:ascii="Calibri" w:cs="Calibri" w:eastAsia="Calibri" w:hAnsi="Calibri"/>
+                <w:color w:val="14213D"/>
+                <w:sz w:val="20"/>
+                <w:szCs w:val="20"/>
+              </w:rPr>
+              <w:t xml:space="preserve"/>
+            </w:r>
+          </w:p>
+        </w:tc>
+      </w:tr>
+      <w:tr>
+        <w:tc>
+          <w:tcPr>
+            <w:tcW w:type="dxa" w:w="2300"/>
+            <w:tcBorders>
+              <w:top w:val="single" w:color="D9D5CB" w:sz="4"/>
+              <w:left w:val="single" w:color="D9D5CB" w:sz="4"/>
+              <w:bottom w:val="single" w:color="D9D5CB" w:sz="4"/>
+              <w:right w:val="single" w:color="D9D5CB" w:sz="4"/>
+            </w:tcBorders>
+            <w:tcMar>
+              <w:top w:type="dxa" w:w="60"/>
+              <w:left w:type="dxa" w:w="90"/>
+              <w:bottom w:type="dxa" w:w="60"/>
+              <w:right w:type="dxa" w:w="90"/>
+            </w:tcMar>
+            <w:vAlign w:val="top"/>
+          </w:tcPr>
+          <w:p>
+            <w:pPr>
+              <w:spacing w:after="40"/>
+            </w:pPr>
+            <w:r>
+              <w:rPr>
+                <w:rFonts w:ascii="Calibri" w:cs="Calibri" w:eastAsia="Calibri" w:hAnsi="Calibri"/>
+                <w:b/>
+                <w:bCs/>
+                <w:color w:val="14213D"/>
+                <w:sz w:val="20"/>
+                <w:szCs w:val="20"/>
+              </w:rPr>
+              <w:t xml:space="preserve">Je ne vois plus la météo</w:t>
+            </w:r>
+          </w:p>
+        </w:tc>
+        <w:tc>
+          <w:tcPr>
+            <w:tcW w:type="dxa" w:w="4100"/>
+            <w:tcBorders>
+              <w:top w:val="single" w:color="D9D5CB" w:sz="4"/>
+              <w:left w:val="single" w:color="D9D5CB" w:sz="4"/>
+              <w:bottom w:val="single" w:color="D9D5CB" w:sz="4"/>
+              <w:right w:val="single" w:color="D9D5CB" w:sz="4"/>
+            </w:tcBorders>
+            <w:tcMar>
+              <w:top w:type="dxa" w:w="60"/>
+              <w:left w:type="dxa" w:w="90"/>
+              <w:bottom w:type="dxa" w:w="60"/>
+              <w:right w:type="dxa" w:w="90"/>
+            </w:tcMar>
+            <w:vAlign w:val="top"/>
+          </w:tcPr>
+          <w:p>
+            <w:pPr>
+              <w:spacing w:after="40"/>
+            </w:pPr>
+            <w:r>
+              <w:rPr>
+                <w:rFonts w:ascii="Calibri" w:cs="Calibri" w:eastAsia="Calibri" w:hAnsi="Calibri"/>
+                <w:color w:val="14213D"/>
+                <w:sz w:val="19"/>
+                <w:szCs w:val="19"/>
+              </w:rPr>
+              <w:t xml:space="preserve">Un bug empêchait la ville de la fiche de remonter quand le chantier n'avait pas de position serveur → pas de géocodage → pas de météo. Corrigé. Et bouton « ☀ Météo » dans l'en-tête du planning : recharge et te dit, s'il manque encore un chantier, pourquoi (ni position ni ville dans la fiche, ou l'erreur réseau).</w:t>
+            </w:r>
+          </w:p>
+        </w:tc>
+        <w:tc>
+          <w:tcPr>
+            <w:tcW w:type="dxa" w:w="3700"/>
+            <w:tcBorders>
+              <w:top w:val="single" w:color="D9D5CB" w:sz="4"/>
+              <w:left w:val="single" w:color="D9D5CB" w:sz="4"/>
+              <w:bottom w:val="single" w:color="D9D5CB" w:sz="4"/>
+              <w:right w:val="single" w:color="D9D5CB" w:sz="4"/>
+            </w:tcBorders>
+            <w:tcMar>
+              <w:top w:type="dxa" w:w="60"/>
+              <w:left w:type="dxa" w:w="90"/>
+              <w:bottom w:type="dxa" w:w="60"/>
+              <w:right w:type="dxa" w:w="90"/>
+            </w:tcMar>
+            <w:vAlign w:val="top"/>
+          </w:tcPr>
+          <w:p>
+            <w:pPr>
+              <w:spacing w:after="40"/>
+            </w:pPr>
+            <w:r>
+              <w:rPr>
+                <w:rFonts w:ascii="Calibri" w:cs="Calibri" w:eastAsia="Calibri" w:hAnsi="Calibri"/>
+                <w:color w:val="14213D"/>
+                <w:sz w:val="19"/>
+                <w:szCs w:val="19"/>
+              </w:rPr>
+              <w:t xml:space="preserve">Si la météo manque encore : touche « ☀ Météo » et lis le message.</w:t>
+            </w:r>
+          </w:p>
+        </w:tc>
+        <w:tc>
+          <w:tcPr>
+            <w:tcW w:type="dxa" w:w="1300"/>
+            <w:tcBorders>
+              <w:top w:val="single" w:color="D9D5CB" w:sz="4"/>
+              <w:left w:val="single" w:color="D9D5CB" w:sz="4"/>
+              <w:bottom w:val="single" w:color="D9D5CB" w:sz="4"/>
+              <w:right w:val="single" w:color="D9D5CB" w:sz="4"/>
+            </w:tcBorders>
+            <w:shd w:fill="FFF4EE" w:color="auto" w:val="clear"/>
+            <w:tcMar>
+              <w:top w:type="dxa" w:w="60"/>
+              <w:left w:type="dxa" w:w="90"/>
+              <w:bottom w:type="dxa" w:w="60"/>
+              <w:right w:type="dxa" w:w="90"/>
+            </w:tcMar>
+            <w:vAlign w:val="top"/>
+          </w:tcPr>
+          <w:p>
+            <w:pPr>
+              <w:spacing w:after="40"/>
+            </w:pPr>
+            <w:r>
+              <w:rPr>
+                <w:rFonts w:ascii="Calibri" w:cs="Calibri" w:eastAsia="Calibri" w:hAnsi="Calibri"/>
+                <w:b/>
+                <w:bCs/>
+                <w:color w:val="14213D"/>
+                <w:sz w:val="19"/>
+                <w:szCs w:val="19"/>
+              </w:rPr>
+              <w:t xml:space="preserve">Corrigé</w:t>
+            </w:r>
+          </w:p>
+        </w:tc>
+        <w:tc>
+          <w:tcPr>
+            <w:tcW w:type="dxa" w:w="3700"/>
+            <w:tcBorders>
+              <w:top w:val="single" w:color="D9D5CB" w:sz="4"/>
+              <w:left w:val="single" w:color="D9D5CB" w:sz="4"/>
+              <w:bottom w:val="single" w:color="D9D5CB" w:sz="4"/>
+              <w:right w:val="single" w:color="D9D5CB" w:sz="4"/>
+            </w:tcBorders>
+            <w:tcMar>
+              <w:top w:type="dxa" w:w="60"/>
+              <w:left w:type="dxa" w:w="90"/>
+              <w:bottom w:type="dxa" w:w="60"/>
+              <w:right w:type="dxa" w:w="90"/>
+            </w:tcMar>
+            <w:vAlign w:val="top"/>
+          </w:tcPr>
+          <w:p>
+            <w:pPr>
+              <w:spacing w:after="40"/>
+            </w:pPr>
+            <w:r>
+              <w:rPr>
+                <w:rFonts w:ascii="Calibri" w:cs="Calibri" w:eastAsia="Calibri" w:hAnsi="Calibri"/>
+                <w:color w:val="14213D"/>
+                <w:sz w:val="20"/>
+                <w:szCs w:val="20"/>
+              </w:rPr>
+              <w:t xml:space="preserve"/>
+            </w:r>
+          </w:p>
+          <w:p>
+            <w:pPr>
+              <w:spacing w:after="40"/>
+            </w:pPr>
+            <w:r>
+              <w:rPr>
+                <w:rFonts w:ascii="Calibri" w:cs="Calibri" w:eastAsia="Calibri" w:hAnsi="Calibri"/>
+                <w:color w:val="14213D"/>
+                <w:sz w:val="20"/>
+                <w:szCs w:val="20"/>
+              </w:rPr>
+              <w:t xml:space="preserve"/>
+            </w:r>
+          </w:p>
+        </w:tc>
+      </w:tr>
+      <w:tr>
+        <w:tc>
+          <w:tcPr>
+            <w:tcW w:type="dxa" w:w="2300"/>
+            <w:tcBorders>
+              <w:top w:val="single" w:color="D9D5CB" w:sz="4"/>
+              <w:left w:val="single" w:color="D9D5CB" w:sz="4"/>
+              <w:bottom w:val="single" w:color="D9D5CB" w:sz="4"/>
+              <w:right w:val="single" w:color="D9D5CB" w:sz="4"/>
+            </w:tcBorders>
+            <w:tcMar>
+              <w:top w:type="dxa" w:w="60"/>
+              <w:left w:type="dxa" w:w="90"/>
+              <w:bottom w:type="dxa" w:w="60"/>
+              <w:right w:type="dxa" w:w="90"/>
+            </w:tcMar>
+            <w:vAlign w:val="top"/>
+          </w:tcPr>
+          <w:p>
+            <w:pPr>
+              <w:spacing w:after="40"/>
+            </w:pPr>
+            <w:r>
+              <w:rPr>
+                <w:rFonts w:ascii="Calibri" w:cs="Calibri" w:eastAsia="Calibri" w:hAnsi="Calibri"/>
+                <w:b/>
+                <w:bCs/>
+                <w:color w:val="14213D"/>
+                <w:sz w:val="20"/>
+                <w:szCs w:val="20"/>
+              </w:rPr>
+              <w:t xml:space="preserve">Le gars voit ses objectifs à la journée + raccourci plan</w:t>
+            </w:r>
+          </w:p>
+        </w:tc>
+        <w:tc>
+          <w:tcPr>
+            <w:tcW w:type="dxa" w:w="4100"/>
+            <w:tcBorders>
+              <w:top w:val="single" w:color="D9D5CB" w:sz="4"/>
+              <w:left w:val="single" w:color="D9D5CB" w:sz="4"/>
+              <w:bottom w:val="single" w:color="D9D5CB" w:sz="4"/>
+              <w:right w:val="single" w:color="D9D5CB" w:sz="4"/>
+            </w:tcBorders>
+            <w:tcMar>
+              <w:top w:type="dxa" w:w="60"/>
+              <w:left w:type="dxa" w:w="90"/>
+              <w:bottom w:type="dxa" w:w="60"/>
+              <w:right w:type="dxa" w:w="90"/>
+            </w:tcMar>
+            <w:vAlign w:val="top"/>
+          </w:tcPr>
+          <w:p>
+            <w:pPr>
+              <w:spacing w:after="40"/>
+            </w:pPr>
+            <w:r>
+              <w:rPr>
+                <w:rFonts w:ascii="Calibri" w:cs="Calibri" w:eastAsia="Calibri" w:hAnsi="Calibri"/>
+                <w:color w:val="14213D"/>
+                <w:sz w:val="19"/>
+                <w:szCs w:val="19"/>
+              </w:rPr>
+              <w:t xml:space="preserve">Mon espace → Planning (Ta semaine) : la tuile du jour porte « 🎯 n », la carte du jour liste « 🎯 Tes objectifs du jour · n missions · h » avec un bouton 🗺 qui ouvre le plan en surbrillance. Toujours sur l'accueil (héros + notification) et dans le Bureau du chantier.</w:t>
             </w:r>
           </w:p>
         </w:tc>

</xml_diff>

<commit_message>
Objectifs : soudures/manchons par DN, périmètre chefs & conducteurs, semaine qui arrive le week-end (météo) + maquette « nouvelle ventilation » (4 territoires, plan avec une seule barre de pose)
</commit_message>
<xml_diff>
--- a/app/docs/Feuille_de_route_nuit_09-10-10.docx
+++ b/app/docs/Feuille_de_route_nuit_09-10-10.docx
@@ -84,7 +84,7 @@
           <w:sz w:val="20"/>
           <w:szCs w:val="20"/>
         </w:rPr>
-        <w:t xml:space="preserve">Build livré : 11/10/2026 · 9189db (retours des points 1 à 4, objectifs par équipe / jour / soudure, bac à sable) (index.html + traceur.html à la racine du dépôt). Sources : app/src (reg.js, docs.js, prevention.js, accueil.js, affaires.js, flotte.js, rh.js, commandes.js, reglement.js + app.js, espace.js, next.js, acces.js, sync.js). Notes techniques : app/NOTES.md.</w:t>
+        <w:t xml:space="preserve">Build livré : 11/10/2026 · 748a65 (retours des points 1 à 4, objectifs par équipe / jour / soudure / DN, bac à sable, maquette nouvelle ventilation) (index.html + traceur.html à la racine du dépôt). Sources : app/src (reg.js, docs.js, prevention.js, accueil.js, affaires.js, flotte.js, rh.js, commandes.js, reglement.js + app.js, espace.js, next.js, acces.js, sync.js). Notes techniques : app/NOTES.md.</w:t>
       </w:r>
     </w:p>
     <w:p>
@@ -7369,6 +7369,730 @@
                 <w:szCs w:val="19"/>
               </w:rPr>
               <w:t xml:space="preserve">Fait</w:t>
+            </w:r>
+          </w:p>
+        </w:tc>
+        <w:tc>
+          <w:tcPr>
+            <w:tcW w:type="dxa" w:w="3700"/>
+            <w:tcBorders>
+              <w:top w:val="single" w:color="D9D5CB" w:sz="4"/>
+              <w:left w:val="single" w:color="D9D5CB" w:sz="4"/>
+              <w:bottom w:val="single" w:color="D9D5CB" w:sz="4"/>
+              <w:right w:val="single" w:color="D9D5CB" w:sz="4"/>
+            </w:tcBorders>
+            <w:tcMar>
+              <w:top w:type="dxa" w:w="60"/>
+              <w:left w:type="dxa" w:w="90"/>
+              <w:bottom w:type="dxa" w:w="60"/>
+              <w:right w:type="dxa" w:w="90"/>
+            </w:tcMar>
+            <w:vAlign w:val="top"/>
+          </w:tcPr>
+          <w:p>
+            <w:pPr>
+              <w:spacing w:after="40"/>
+            </w:pPr>
+            <w:r>
+              <w:rPr>
+                <w:rFonts w:ascii="Calibri" w:cs="Calibri" w:eastAsia="Calibri" w:hAnsi="Calibri"/>
+                <w:color w:val="14213D"/>
+                <w:sz w:val="20"/>
+                <w:szCs w:val="20"/>
+              </w:rPr>
+              <w:t xml:space="preserve"/>
+            </w:r>
+          </w:p>
+          <w:p>
+            <w:pPr>
+              <w:spacing w:after="40"/>
+            </w:pPr>
+            <w:r>
+              <w:rPr>
+                <w:rFonts w:ascii="Calibri" w:cs="Calibri" w:eastAsia="Calibri" w:hAnsi="Calibri"/>
+                <w:color w:val="14213D"/>
+                <w:sz w:val="20"/>
+                <w:szCs w:val="20"/>
+              </w:rPr>
+              <w:t xml:space="preserve"/>
+            </w:r>
+          </w:p>
+        </w:tc>
+      </w:tr>
+      <w:tr>
+        <w:tc>
+          <w:tcPr>
+            <w:tcW w:type="dxa" w:w="2300"/>
+            <w:tcBorders>
+              <w:top w:val="single" w:color="D9D5CB" w:sz="4"/>
+              <w:left w:val="single" w:color="D9D5CB" w:sz="4"/>
+              <w:bottom w:val="single" w:color="D9D5CB" w:sz="4"/>
+              <w:right w:val="single" w:color="D9D5CB" w:sz="4"/>
+            </w:tcBorders>
+            <w:tcMar>
+              <w:top w:type="dxa" w:w="60"/>
+              <w:left w:type="dxa" w:w="90"/>
+              <w:bottom w:type="dxa" w:w="60"/>
+              <w:right w:type="dxa" w:w="90"/>
+            </w:tcMar>
+            <w:vAlign w:val="top"/>
+          </w:tcPr>
+          <w:p>
+            <w:pPr>
+              <w:spacing w:after="40"/>
+            </w:pPr>
+            <w:r>
+              <w:rPr>
+                <w:rFonts w:ascii="Calibri" w:cs="Calibri" w:eastAsia="Calibri" w:hAnsi="Calibri"/>
+                <w:b/>
+                <w:bCs/>
+                <w:color w:val="14213D"/>
+                <w:sz w:val="20"/>
+                <w:szCs w:val="20"/>
+              </w:rPr>
+              <w:t xml:space="preserve">Soudures et manchons par DN</w:t>
+            </w:r>
+          </w:p>
+        </w:tc>
+        <w:tc>
+          <w:tcPr>
+            <w:tcW w:type="dxa" w:w="4100"/>
+            <w:tcBorders>
+              <w:top w:val="single" w:color="D9D5CB" w:sz="4"/>
+              <w:left w:val="single" w:color="D9D5CB" w:sz="4"/>
+              <w:bottom w:val="single" w:color="D9D5CB" w:sz="4"/>
+              <w:right w:val="single" w:color="D9D5CB" w:sz="4"/>
+            </w:tcBorders>
+            <w:tcMar>
+              <w:top w:type="dxa" w:w="60"/>
+              <w:left w:type="dxa" w:w="90"/>
+              <w:bottom w:type="dxa" w:w="60"/>
+              <w:right w:type="dxa" w:w="90"/>
+            </w:tcMar>
+            <w:vAlign w:val="top"/>
+          </w:tcPr>
+          <w:p>
+            <w:pPr>
+              <w:spacing w:after="40"/>
+            </w:pPr>
+            <w:r>
+              <w:rPr>
+                <w:rFonts w:ascii="Calibri" w:cs="Calibri" w:eastAsia="Calibri" w:hAnsi="Calibri"/>
+                <w:color w:val="14213D"/>
+                <w:sz w:val="19"/>
+                <w:szCs w:val="19"/>
+              </w:rPr>
+              <w:t xml:space="preserve">Chaque objectif détaille maintenant « DN 150 × 8 (2 ✓) · DN 100 × 4 (1 ✓) » — dans la liste des objectifs, le Bureau, l'accueil, la notification et Ta semaine du gars (manchonnage : manchons).</w:t>
+            </w:r>
+          </w:p>
+        </w:tc>
+        <w:tc>
+          <w:tcPr>
+            <w:tcW w:type="dxa" w:w="3700"/>
+            <w:tcBorders>
+              <w:top w:val="single" w:color="D9D5CB" w:sz="4"/>
+              <w:left w:val="single" w:color="D9D5CB" w:sz="4"/>
+              <w:bottom w:val="single" w:color="D9D5CB" w:sz="4"/>
+              <w:right w:val="single" w:color="D9D5CB" w:sz="4"/>
+            </w:tcBorders>
+            <w:tcMar>
+              <w:top w:type="dxa" w:w="60"/>
+              <w:left w:type="dxa" w:w="90"/>
+              <w:bottom w:type="dxa" w:w="60"/>
+              <w:right w:type="dxa" w:w="90"/>
+            </w:tcMar>
+            <w:vAlign w:val="top"/>
+          </w:tcPr>
+          <w:p>
+            <w:pPr>
+              <w:spacing w:after="40"/>
+            </w:pPr>
+            <w:r>
+              <w:rPr>
+                <w:rFonts w:ascii="Calibri" w:cs="Calibri" w:eastAsia="Calibri" w:hAnsi="Calibri"/>
+                <w:color w:val="14213D"/>
+                <w:sz w:val="19"/>
+                <w:szCs w:val="19"/>
+              </w:rPr>
+              <w:t xml:space="preserve"/>
+            </w:r>
+          </w:p>
+        </w:tc>
+        <w:tc>
+          <w:tcPr>
+            <w:tcW w:type="dxa" w:w="1300"/>
+            <w:tcBorders>
+              <w:top w:val="single" w:color="D9D5CB" w:sz="4"/>
+              <w:left w:val="single" w:color="D9D5CB" w:sz="4"/>
+              <w:bottom w:val="single" w:color="D9D5CB" w:sz="4"/>
+              <w:right w:val="single" w:color="D9D5CB" w:sz="4"/>
+            </w:tcBorders>
+            <w:shd w:fill="E6F5EC" w:color="auto" w:val="clear"/>
+            <w:tcMar>
+              <w:top w:type="dxa" w:w="60"/>
+              <w:left w:type="dxa" w:w="90"/>
+              <w:bottom w:type="dxa" w:w="60"/>
+              <w:right w:type="dxa" w:w="90"/>
+            </w:tcMar>
+            <w:vAlign w:val="top"/>
+          </w:tcPr>
+          <w:p>
+            <w:pPr>
+              <w:spacing w:after="40"/>
+            </w:pPr>
+            <w:r>
+              <w:rPr>
+                <w:rFonts w:ascii="Calibri" w:cs="Calibri" w:eastAsia="Calibri" w:hAnsi="Calibri"/>
+                <w:b/>
+                <w:bCs/>
+                <w:color w:val="14213D"/>
+                <w:sz w:val="19"/>
+                <w:szCs w:val="19"/>
+              </w:rPr>
+              <w:t xml:space="preserve">Fait</w:t>
+            </w:r>
+          </w:p>
+        </w:tc>
+        <w:tc>
+          <w:tcPr>
+            <w:tcW w:type="dxa" w:w="3700"/>
+            <w:tcBorders>
+              <w:top w:val="single" w:color="D9D5CB" w:sz="4"/>
+              <w:left w:val="single" w:color="D9D5CB" w:sz="4"/>
+              <w:bottom w:val="single" w:color="D9D5CB" w:sz="4"/>
+              <w:right w:val="single" w:color="D9D5CB" w:sz="4"/>
+            </w:tcBorders>
+            <w:tcMar>
+              <w:top w:type="dxa" w:w="60"/>
+              <w:left w:type="dxa" w:w="90"/>
+              <w:bottom w:type="dxa" w:w="60"/>
+              <w:right w:type="dxa" w:w="90"/>
+            </w:tcMar>
+            <w:vAlign w:val="top"/>
+          </w:tcPr>
+          <w:p>
+            <w:pPr>
+              <w:spacing w:after="40"/>
+            </w:pPr>
+            <w:r>
+              <w:rPr>
+                <w:rFonts w:ascii="Calibri" w:cs="Calibri" w:eastAsia="Calibri" w:hAnsi="Calibri"/>
+                <w:color w:val="14213D"/>
+                <w:sz w:val="20"/>
+                <w:szCs w:val="20"/>
+              </w:rPr>
+              <w:t xml:space="preserve"/>
+            </w:r>
+          </w:p>
+          <w:p>
+            <w:pPr>
+              <w:spacing w:after="40"/>
+            </w:pPr>
+            <w:r>
+              <w:rPr>
+                <w:rFonts w:ascii="Calibri" w:cs="Calibri" w:eastAsia="Calibri" w:hAnsi="Calibri"/>
+                <w:color w:val="14213D"/>
+                <w:sz w:val="20"/>
+                <w:szCs w:val="20"/>
+              </w:rPr>
+              <w:t xml:space="preserve"/>
+            </w:r>
+          </w:p>
+        </w:tc>
+      </w:tr>
+      <w:tr>
+        <w:tc>
+          <w:tcPr>
+            <w:tcW w:type="dxa" w:w="2300"/>
+            <w:tcBorders>
+              <w:top w:val="single" w:color="D9D5CB" w:sz="4"/>
+              <w:left w:val="single" w:color="D9D5CB" w:sz="4"/>
+              <w:bottom w:val="single" w:color="D9D5CB" w:sz="4"/>
+              <w:right w:val="single" w:color="D9D5CB" w:sz="4"/>
+            </w:tcBorders>
+            <w:tcMar>
+              <w:top w:type="dxa" w:w="60"/>
+              <w:left w:type="dxa" w:w="90"/>
+              <w:bottom w:type="dxa" w:w="60"/>
+              <w:right w:type="dxa" w:w="90"/>
+            </w:tcMar>
+            <w:vAlign w:val="top"/>
+          </w:tcPr>
+          <w:p>
+            <w:pPr>
+              <w:spacing w:after="40"/>
+            </w:pPr>
+            <w:r>
+              <w:rPr>
+                <w:rFonts w:ascii="Calibri" w:cs="Calibri" w:eastAsia="Calibri" w:hAnsi="Calibri"/>
+                <w:b/>
+                <w:bCs/>
+                <w:color w:val="14213D"/>
+                <w:sz w:val="20"/>
+                <w:szCs w:val="20"/>
+              </w:rPr>
+              <w:t xml:space="preserve">Pas de météo alors que Saint-Lô est géoréférencé</w:t>
+            </w:r>
+          </w:p>
+        </w:tc>
+        <w:tc>
+          <w:tcPr>
+            <w:tcW w:type="dxa" w:w="4100"/>
+            <w:tcBorders>
+              <w:top w:val="single" w:color="D9D5CB" w:sz="4"/>
+              <w:left w:val="single" w:color="D9D5CB" w:sz="4"/>
+              <w:bottom w:val="single" w:color="D9D5CB" w:sz="4"/>
+              <w:right w:val="single" w:color="D9D5CB" w:sz="4"/>
+            </w:tcBorders>
+            <w:tcMar>
+              <w:top w:type="dxa" w:w="60"/>
+              <w:left w:type="dxa" w:w="90"/>
+              <w:bottom w:type="dxa" w:w="60"/>
+              <w:right w:type="dxa" w:w="90"/>
+            </w:tcMar>
+            <w:vAlign w:val="top"/>
+          </w:tcPr>
+          <w:p>
+            <w:pPr>
+              <w:spacing w:after="40"/>
+            </w:pPr>
+            <w:r>
+              <w:rPr>
+                <w:rFonts w:ascii="Calibri" w:cs="Calibri" w:eastAsia="Calibri" w:hAnsi="Calibri"/>
+                <w:color w:val="14213D"/>
+                <w:sz w:val="19"/>
+                <w:szCs w:val="19"/>
+              </w:rPr>
+              <w:t xml:space="preserve">Trouvé : tu regardais un dimanche. « Cette semaine » = lundi → vendredi déjà passés, et la météo n'existe que pour les 7 jours devant → rien à afficher sur ces jours-là. Corrigé : le week-end, planning, objectifs et Ta semaine s'ouvrent sur la semaine qui arrive (donc avec sa météo). La météo du jour est aussi dans l'en-tête de chaque chantier de la vue Objectifs.</w:t>
+            </w:r>
+          </w:p>
+        </w:tc>
+        <w:tc>
+          <w:tcPr>
+            <w:tcW w:type="dxa" w:w="3700"/>
+            <w:tcBorders>
+              <w:top w:val="single" w:color="D9D5CB" w:sz="4"/>
+              <w:left w:val="single" w:color="D9D5CB" w:sz="4"/>
+              <w:bottom w:val="single" w:color="D9D5CB" w:sz="4"/>
+              <w:right w:val="single" w:color="D9D5CB" w:sz="4"/>
+            </w:tcBorders>
+            <w:tcMar>
+              <w:top w:type="dxa" w:w="60"/>
+              <w:left w:type="dxa" w:w="90"/>
+              <w:bottom w:type="dxa" w:w="60"/>
+              <w:right w:type="dxa" w:w="90"/>
+            </w:tcMar>
+            <w:vAlign w:val="top"/>
+          </w:tcPr>
+          <w:p>
+            <w:pPr>
+              <w:spacing w:after="40"/>
+            </w:pPr>
+            <w:r>
+              <w:rPr>
+                <w:rFonts w:ascii="Calibri" w:cs="Calibri" w:eastAsia="Calibri" w:hAnsi="Calibri"/>
+                <w:color w:val="14213D"/>
+                <w:sz w:val="19"/>
+                <w:szCs w:val="19"/>
+              </w:rPr>
+              <w:t xml:space="preserve">Si un jour il n'y a toujours rien un lundi : « ☀ Météo » dans l'en-tête du planning te dit pourquoi.</w:t>
+            </w:r>
+          </w:p>
+        </w:tc>
+        <w:tc>
+          <w:tcPr>
+            <w:tcW w:type="dxa" w:w="1300"/>
+            <w:tcBorders>
+              <w:top w:val="single" w:color="D9D5CB" w:sz="4"/>
+              <w:left w:val="single" w:color="D9D5CB" w:sz="4"/>
+              <w:bottom w:val="single" w:color="D9D5CB" w:sz="4"/>
+              <w:right w:val="single" w:color="D9D5CB" w:sz="4"/>
+            </w:tcBorders>
+            <w:shd w:fill="FFF4EE" w:color="auto" w:val="clear"/>
+            <w:tcMar>
+              <w:top w:type="dxa" w:w="60"/>
+              <w:left w:type="dxa" w:w="90"/>
+              <w:bottom w:type="dxa" w:w="60"/>
+              <w:right w:type="dxa" w:w="90"/>
+            </w:tcMar>
+            <w:vAlign w:val="top"/>
+          </w:tcPr>
+          <w:p>
+            <w:pPr>
+              <w:spacing w:after="40"/>
+            </w:pPr>
+            <w:r>
+              <w:rPr>
+                <w:rFonts w:ascii="Calibri" w:cs="Calibri" w:eastAsia="Calibri" w:hAnsi="Calibri"/>
+                <w:b/>
+                <w:bCs/>
+                <w:color w:val="14213D"/>
+                <w:sz w:val="19"/>
+                <w:szCs w:val="19"/>
+              </w:rPr>
+              <w:t xml:space="preserve">Corrigé</w:t>
+            </w:r>
+          </w:p>
+        </w:tc>
+        <w:tc>
+          <w:tcPr>
+            <w:tcW w:type="dxa" w:w="3700"/>
+            <w:tcBorders>
+              <w:top w:val="single" w:color="D9D5CB" w:sz="4"/>
+              <w:left w:val="single" w:color="D9D5CB" w:sz="4"/>
+              <w:bottom w:val="single" w:color="D9D5CB" w:sz="4"/>
+              <w:right w:val="single" w:color="D9D5CB" w:sz="4"/>
+            </w:tcBorders>
+            <w:tcMar>
+              <w:top w:type="dxa" w:w="60"/>
+              <w:left w:type="dxa" w:w="90"/>
+              <w:bottom w:type="dxa" w:w="60"/>
+              <w:right w:type="dxa" w:w="90"/>
+            </w:tcMar>
+            <w:vAlign w:val="top"/>
+          </w:tcPr>
+          <w:p>
+            <w:pPr>
+              <w:spacing w:after="40"/>
+            </w:pPr>
+            <w:r>
+              <w:rPr>
+                <w:rFonts w:ascii="Calibri" w:cs="Calibri" w:eastAsia="Calibri" w:hAnsi="Calibri"/>
+                <w:color w:val="14213D"/>
+                <w:sz w:val="20"/>
+                <w:szCs w:val="20"/>
+              </w:rPr>
+              <w:t xml:space="preserve"/>
+            </w:r>
+          </w:p>
+          <w:p>
+            <w:pPr>
+              <w:spacing w:after="40"/>
+            </w:pPr>
+            <w:r>
+              <w:rPr>
+                <w:rFonts w:ascii="Calibri" w:cs="Calibri" w:eastAsia="Calibri" w:hAnsi="Calibri"/>
+                <w:color w:val="14213D"/>
+                <w:sz w:val="20"/>
+                <w:szCs w:val="20"/>
+              </w:rPr>
+              <w:t xml:space="preserve"/>
+            </w:r>
+          </w:p>
+        </w:tc>
+      </w:tr>
+      <w:tr>
+        <w:tc>
+          <w:tcPr>
+            <w:tcW w:type="dxa" w:w="2300"/>
+            <w:tcBorders>
+              <w:top w:val="single" w:color="D9D5CB" w:sz="4"/>
+              <w:left w:val="single" w:color="D9D5CB" w:sz="4"/>
+              <w:bottom w:val="single" w:color="D9D5CB" w:sz="4"/>
+              <w:right w:val="single" w:color="D9D5CB" w:sz="4"/>
+            </w:tcBorders>
+            <w:tcMar>
+              <w:top w:type="dxa" w:w="60"/>
+              <w:left w:type="dxa" w:w="90"/>
+              <w:bottom w:type="dxa" w:w="60"/>
+              <w:right w:type="dxa" w:w="90"/>
+            </w:tcMar>
+            <w:vAlign w:val="top"/>
+          </w:tcPr>
+          <w:p>
+            <w:pPr>
+              <w:spacing w:after="40"/>
+            </w:pPr>
+            <w:r>
+              <w:rPr>
+                <w:rFonts w:ascii="Calibri" w:cs="Calibri" w:eastAsia="Calibri" w:hAnsi="Calibri"/>
+                <w:b/>
+                <w:bCs/>
+                <w:color w:val="14213D"/>
+                <w:sz w:val="20"/>
+                <w:szCs w:val="20"/>
+              </w:rPr>
+              <w:t xml:space="preserve">Chefs et conducteurs : leur équipe / leur chantier seulement</w:t>
+            </w:r>
+          </w:p>
+        </w:tc>
+        <w:tc>
+          <w:tcPr>
+            <w:tcW w:type="dxa" w:w="4100"/>
+            <w:tcBorders>
+              <w:top w:val="single" w:color="D9D5CB" w:sz="4"/>
+              <w:left w:val="single" w:color="D9D5CB" w:sz="4"/>
+              <w:bottom w:val="single" w:color="D9D5CB" w:sz="4"/>
+              <w:right w:val="single" w:color="D9D5CB" w:sz="4"/>
+            </w:tcBorders>
+            <w:tcMar>
+              <w:top w:type="dxa" w:w="60"/>
+              <w:left w:type="dxa" w:w="90"/>
+              <w:bottom w:type="dxa" w:w="60"/>
+              <w:right w:type="dxa" w:w="90"/>
+            </w:tcMar>
+            <w:vAlign w:val="top"/>
+          </w:tcPr>
+          <w:p>
+            <w:pPr>
+              <w:spacing w:after="40"/>
+            </w:pPr>
+            <w:r>
+              <w:rPr>
+                <w:rFonts w:ascii="Calibri" w:cs="Calibri" w:eastAsia="Calibri" w:hAnsi="Calibri"/>
+                <w:color w:val="14213D"/>
+                <w:sz w:val="19"/>
+                <w:szCs w:val="19"/>
+              </w:rPr>
+              <w:t xml:space="preserve">Objectifs des équipes : un conducteur voit ses chantiers (fiche ou placement) ; un chef voit ses chantiers, et seulement SON équipe sur un chantier dont un autre est le chef en fiche. Direction / resp. exploitation / admin : tout (le secteur s'il y en a un), tes chantiers d'abord.</w:t>
+            </w:r>
+          </w:p>
+        </w:tc>
+        <w:tc>
+          <w:tcPr>
+            <w:tcW w:type="dxa" w:w="3700"/>
+            <w:tcBorders>
+              <w:top w:val="single" w:color="D9D5CB" w:sz="4"/>
+              <w:left w:val="single" w:color="D9D5CB" w:sz="4"/>
+              <w:bottom w:val="single" w:color="D9D5CB" w:sz="4"/>
+              <w:right w:val="single" w:color="D9D5CB" w:sz="4"/>
+            </w:tcBorders>
+            <w:tcMar>
+              <w:top w:type="dxa" w:w="60"/>
+              <w:left w:type="dxa" w:w="90"/>
+              <w:bottom w:type="dxa" w:w="60"/>
+              <w:right w:type="dxa" w:w="90"/>
+            </w:tcMar>
+            <w:vAlign w:val="top"/>
+          </w:tcPr>
+          <w:p>
+            <w:pPr>
+              <w:spacing w:after="40"/>
+            </w:pPr>
+            <w:r>
+              <w:rPr>
+                <w:rFonts w:ascii="Calibri" w:cs="Calibri" w:eastAsia="Calibri" w:hAnsi="Calibri"/>
+                <w:color w:val="14213D"/>
+                <w:sz w:val="19"/>
+                <w:szCs w:val="19"/>
+              </w:rPr>
+              <w:t xml:space="preserve">Vérifié par test avec un chef non admin (e2e_objsync 4).</w:t>
+            </w:r>
+          </w:p>
+        </w:tc>
+        <w:tc>
+          <w:tcPr>
+            <w:tcW w:type="dxa" w:w="1300"/>
+            <w:tcBorders>
+              <w:top w:val="single" w:color="D9D5CB" w:sz="4"/>
+              <w:left w:val="single" w:color="D9D5CB" w:sz="4"/>
+              <w:bottom w:val="single" w:color="D9D5CB" w:sz="4"/>
+              <w:right w:val="single" w:color="D9D5CB" w:sz="4"/>
+            </w:tcBorders>
+            <w:shd w:fill="E6F5EC" w:color="auto" w:val="clear"/>
+            <w:tcMar>
+              <w:top w:type="dxa" w:w="60"/>
+              <w:left w:type="dxa" w:w="90"/>
+              <w:bottom w:type="dxa" w:w="60"/>
+              <w:right w:type="dxa" w:w="90"/>
+            </w:tcMar>
+            <w:vAlign w:val="top"/>
+          </w:tcPr>
+          <w:p>
+            <w:pPr>
+              <w:spacing w:after="40"/>
+            </w:pPr>
+            <w:r>
+              <w:rPr>
+                <w:rFonts w:ascii="Calibri" w:cs="Calibri" w:eastAsia="Calibri" w:hAnsi="Calibri"/>
+                <w:b/>
+                <w:bCs/>
+                <w:color w:val="14213D"/>
+                <w:sz w:val="19"/>
+                <w:szCs w:val="19"/>
+              </w:rPr>
+              <w:t xml:space="preserve">Fait</w:t>
+            </w:r>
+          </w:p>
+        </w:tc>
+        <w:tc>
+          <w:tcPr>
+            <w:tcW w:type="dxa" w:w="3700"/>
+            <w:tcBorders>
+              <w:top w:val="single" w:color="D9D5CB" w:sz="4"/>
+              <w:left w:val="single" w:color="D9D5CB" w:sz="4"/>
+              <w:bottom w:val="single" w:color="D9D5CB" w:sz="4"/>
+              <w:right w:val="single" w:color="D9D5CB" w:sz="4"/>
+            </w:tcBorders>
+            <w:tcMar>
+              <w:top w:type="dxa" w:w="60"/>
+              <w:left w:type="dxa" w:w="90"/>
+              <w:bottom w:type="dxa" w:w="60"/>
+              <w:right w:type="dxa" w:w="90"/>
+            </w:tcMar>
+            <w:vAlign w:val="top"/>
+          </w:tcPr>
+          <w:p>
+            <w:pPr>
+              <w:spacing w:after="40"/>
+            </w:pPr>
+            <w:r>
+              <w:rPr>
+                <w:rFonts w:ascii="Calibri" w:cs="Calibri" w:eastAsia="Calibri" w:hAnsi="Calibri"/>
+                <w:color w:val="14213D"/>
+                <w:sz w:val="20"/>
+                <w:szCs w:val="20"/>
+              </w:rPr>
+              <w:t xml:space="preserve"/>
+            </w:r>
+          </w:p>
+          <w:p>
+            <w:pPr>
+              <w:spacing w:after="40"/>
+            </w:pPr>
+            <w:r>
+              <w:rPr>
+                <w:rFonts w:ascii="Calibri" w:cs="Calibri" w:eastAsia="Calibri" w:hAnsi="Calibri"/>
+                <w:color w:val="14213D"/>
+                <w:sz w:val="20"/>
+                <w:szCs w:val="20"/>
+              </w:rPr>
+              <w:t xml:space="preserve"/>
+            </w:r>
+          </w:p>
+        </w:tc>
+      </w:tr>
+      <w:tr>
+        <w:tc>
+          <w:tcPr>
+            <w:tcW w:type="dxa" w:w="2300"/>
+            <w:tcBorders>
+              <w:top w:val="single" w:color="D9D5CB" w:sz="4"/>
+              <w:left w:val="single" w:color="D9D5CB" w:sz="4"/>
+              <w:bottom w:val="single" w:color="D9D5CB" w:sz="4"/>
+              <w:right w:val="single" w:color="D9D5CB" w:sz="4"/>
+            </w:tcBorders>
+            <w:tcMar>
+              <w:top w:type="dxa" w:w="60"/>
+              <w:left w:type="dxa" w:w="90"/>
+              <w:bottom w:type="dxa" w:w="60"/>
+              <w:right w:type="dxa" w:w="90"/>
+            </w:tcMar>
+            <w:vAlign w:val="top"/>
+          </w:tcPr>
+          <w:p>
+            <w:pPr>
+              <w:spacing w:after="40"/>
+            </w:pPr>
+            <w:r>
+              <w:rPr>
+                <w:rFonts w:ascii="Calibri" w:cs="Calibri" w:eastAsia="Calibri" w:hAnsi="Calibri"/>
+                <w:b/>
+                <w:bCs/>
+                <w:color w:val="14213D"/>
+                <w:sz w:val="20"/>
+                <w:szCs w:val="20"/>
+              </w:rPr>
+              <w:t xml:space="preserve">Refonte globale de la ventilation (maquette)</w:t>
+            </w:r>
+          </w:p>
+        </w:tc>
+        <w:tc>
+          <w:tcPr>
+            <w:tcW w:type="dxa" w:w="4100"/>
+            <w:tcBorders>
+              <w:top w:val="single" w:color="D9D5CB" w:sz="4"/>
+              <w:left w:val="single" w:color="D9D5CB" w:sz="4"/>
+              <w:bottom w:val="single" w:color="D9D5CB" w:sz="4"/>
+              <w:right w:val="single" w:color="D9D5CB" w:sz="4"/>
+            </w:tcBorders>
+            <w:tcMar>
+              <w:top w:type="dxa" w:w="60"/>
+              <w:left w:type="dxa" w:w="90"/>
+              <w:bottom w:type="dxa" w:w="60"/>
+              <w:right w:type="dxa" w:w="90"/>
+            </w:tcMar>
+            <w:vAlign w:val="top"/>
+          </w:tcPr>
+          <w:p>
+            <w:pPr>
+              <w:spacing w:after="40"/>
+            </w:pPr>
+            <w:r>
+              <w:rPr>
+                <w:rFonts w:ascii="Calibri" w:cs="Calibri" w:eastAsia="Calibri" w:hAnsi="Calibri"/>
+                <w:color w:val="14213D"/>
+                <w:sz w:val="19"/>
+                <w:szCs w:val="19"/>
+              </w:rPr>
+              <w:t xml:space="preserve">app/maquette_ventilation.html — à ouvrir sur ton téléphone ET sur PC, cliquable, « voir comme » Karim / Paul / Julie / Ethan / Nadia, bouton « ⓘ la ventilation » (ancien → nouveau). 4 territoires : 🏠 Aujourd'hui (cockpit) · 📍 Chantiers (un chantier = Plan plein écran avec UN « ＋ Poser » et UNE barre de pose, Vie du chantier, Technique) · 👥 Équipes (Planning · Objectifs · Heures · Sécurité · Gens) · 🏢 Entreprise (Pilotage · Affaires · Commandes · Flotte · Documents · Traceur · Administration) · 👤 Moi par l'avatar. Chaque métier ne voit que ses territoires. La pose d'objectif est jouable dans la maquette.</w:t>
+            </w:r>
+          </w:p>
+        </w:tc>
+        <w:tc>
+          <w:tcPr>
+            <w:tcW w:type="dxa" w:w="3700"/>
+            <w:tcBorders>
+              <w:top w:val="single" w:color="D9D5CB" w:sz="4"/>
+              <w:left w:val="single" w:color="D9D5CB" w:sz="4"/>
+              <w:bottom w:val="single" w:color="D9D5CB" w:sz="4"/>
+              <w:right w:val="single" w:color="D9D5CB" w:sz="4"/>
+            </w:tcBorders>
+            <w:tcMar>
+              <w:top w:type="dxa" w:w="60"/>
+              <w:left w:type="dxa" w:w="90"/>
+              <w:bottom w:type="dxa" w:w="60"/>
+              <w:right w:type="dxa" w:w="90"/>
+            </w:tcMar>
+            <w:vAlign w:val="top"/>
+          </w:tcPr>
+          <w:p>
+            <w:pPr>
+              <w:spacing w:after="40"/>
+            </w:pPr>
+            <w:r>
+              <w:rPr>
+                <w:rFonts w:ascii="Calibri" w:cs="Calibri" w:eastAsia="Calibri" w:hAnsi="Calibri"/>
+                <w:color w:val="14213D"/>
+                <w:sz w:val="19"/>
+                <w:szCs w:val="19"/>
+              </w:rPr>
+              <w:t xml:space="preserve">RIEN n'est porté dans l'appli tant que tu n'as pas validé (ou corrigé) : dis-moi ce qui claque et ce qui ne va pas, écran par écran, puis je porte par lots sans rien supprimer.</w:t>
+            </w:r>
+          </w:p>
+        </w:tc>
+        <w:tc>
+          <w:tcPr>
+            <w:tcW w:type="dxa" w:w="1300"/>
+            <w:tcBorders>
+              <w:top w:val="single" w:color="D9D5CB" w:sz="4"/>
+              <w:left w:val="single" w:color="D9D5CB" w:sz="4"/>
+              <w:bottom w:val="single" w:color="D9D5CB" w:sz="4"/>
+              <w:right w:val="single" w:color="D9D5CB" w:sz="4"/>
+            </w:tcBorders>
+            <w:shd w:fill="FFF4EE" w:color="auto" w:val="clear"/>
+            <w:tcMar>
+              <w:top w:type="dxa" w:w="60"/>
+              <w:left w:type="dxa" w:w="90"/>
+              <w:bottom w:type="dxa" w:w="60"/>
+              <w:right w:type="dxa" w:w="90"/>
+            </w:tcMar>
+            <w:vAlign w:val="top"/>
+          </w:tcPr>
+          <w:p>
+            <w:pPr>
+              <w:spacing w:after="40"/>
+            </w:pPr>
+            <w:r>
+              <w:rPr>
+                <w:rFonts w:ascii="Calibri" w:cs="Calibri" w:eastAsia="Calibri" w:hAnsi="Calibri"/>
+                <w:b/>
+                <w:bCs/>
+                <w:color w:val="14213D"/>
+                <w:sz w:val="19"/>
+                <w:szCs w:val="19"/>
+              </w:rPr>
+              <w:t xml:space="preserve">À valider</w:t>
             </w:r>
           </w:p>
         </w:tc>

</xml_diff>

<commit_message>
Ventilation (hubs, facettes, + Poser), agir comme, raccourci planning, ma semaine (.ics), retours Word 5-9
</commit_message>
<xml_diff>
--- a/app/docs/Feuille_de_route_nuit_09-10-10.docx
+++ b/app/docs/Feuille_de_route_nuit_09-10-10.docx
@@ -1080,6 +1080,187 @@
                 <w:szCs w:val="19"/>
               </w:rPr>
               <w:t xml:space="preserve">Vos commentaires</w:t>
+            </w:r>
+          </w:p>
+        </w:tc>
+      </w:tr>
+      <w:tr>
+        <w:tc>
+          <w:tcPr>
+            <w:tcW w:type="dxa" w:w="2300"/>
+            <w:tcBorders>
+              <w:top w:val="single" w:color="D9D5CB" w:sz="4"/>
+              <w:left w:val="single" w:color="D9D5CB" w:sz="4"/>
+              <w:bottom w:val="single" w:color="D9D5CB" w:sz="4"/>
+              <w:right w:val="single" w:color="D9D5CB" w:sz="4"/>
+            </w:tcBorders>
+            <w:tcMar>
+              <w:top w:type="dxa" w:w="60"/>
+              <w:left w:type="dxa" w:w="90"/>
+              <w:bottom w:type="dxa" w:w="60"/>
+              <w:right w:type="dxa" w:w="90"/>
+            </w:tcMar>
+            <w:vAlign w:val="top"/>
+          </w:tcPr>
+          <w:p>
+            <w:pPr>
+              <w:spacing w:after="40"/>
+            </w:pPr>
+            <w:r>
+              <w:rPr>
+                <w:rFonts w:ascii="Calibri" w:cs="Calibri" w:eastAsia="Calibri" w:hAnsi="Calibri"/>
+                <w:b/>
+                <w:bCs/>
+                <w:color w:val="14213D"/>
+                <w:sz w:val="20"/>
+                <w:szCs w:val="20"/>
+              </w:rPr>
+              <w:t xml:space="preserve">12/10 — tes retours du Word fini (sections 5 à 9), la maquette, « agir comme », le raccourci du planning, « ma semaine »</w:t>
+            </w:r>
+          </w:p>
+        </w:tc>
+        <w:tc>
+          <w:tcPr>
+            <w:tcW w:type="dxa" w:w="4100"/>
+            <w:tcBorders>
+              <w:top w:val="single" w:color="D9D5CB" w:sz="4"/>
+              <w:left w:val="single" w:color="D9D5CB" w:sz="4"/>
+              <w:bottom w:val="single" w:color="D9D5CB" w:sz="4"/>
+              <w:right w:val="single" w:color="D9D5CB" w:sz="4"/>
+            </w:tcBorders>
+            <w:tcMar>
+              <w:top w:type="dxa" w:w="60"/>
+              <w:left w:type="dxa" w:w="90"/>
+              <w:bottom w:type="dxa" w:w="60"/>
+              <w:right w:type="dxa" w:w="90"/>
+            </w:tcMar>
+            <w:vAlign w:val="top"/>
+          </w:tcPr>
+          <w:p>
+            <w:pPr>
+              <w:spacing w:after="40"/>
+            </w:pPr>
+            <w:r>
+              <w:rPr>
+                <w:rFonts w:ascii="Calibri" w:cs="Calibri" w:eastAsia="Calibri" w:hAnsi="Calibri"/>
+                <w:color w:val="14213D"/>
+                <w:sz w:val="19"/>
+                <w:szCs w:val="19"/>
+              </w:rPr>
+              <w:t xml:space="preserve">Tout est dans la NOUVELLE feuille : app/docs/Feuille_de_route_controle_12-10.docx (build 9c7d2e). Celle-ci reste la référence des points 1 à 4.</w:t>
+            </w:r>
+          </w:p>
+        </w:tc>
+        <w:tc>
+          <w:tcPr>
+            <w:tcW w:type="dxa" w:w="3700"/>
+            <w:tcBorders>
+              <w:top w:val="single" w:color="D9D5CB" w:sz="4"/>
+              <w:left w:val="single" w:color="D9D5CB" w:sz="4"/>
+              <w:bottom w:val="single" w:color="D9D5CB" w:sz="4"/>
+              <w:right w:val="single" w:color="D9D5CB" w:sz="4"/>
+            </w:tcBorders>
+            <w:tcMar>
+              <w:top w:type="dxa" w:w="60"/>
+              <w:left w:type="dxa" w:w="90"/>
+              <w:bottom w:type="dxa" w:w="60"/>
+              <w:right w:type="dxa" w:w="90"/>
+            </w:tcMar>
+            <w:vAlign w:val="top"/>
+          </w:tcPr>
+          <w:p>
+            <w:pPr>
+              <w:spacing w:after="40"/>
+            </w:pPr>
+            <w:r>
+              <w:rPr>
+                <w:rFonts w:ascii="Calibri" w:cs="Calibri" w:eastAsia="Calibri" w:hAnsi="Calibri"/>
+                <w:color w:val="14213D"/>
+                <w:sz w:val="19"/>
+                <w:szCs w:val="19"/>
+              </w:rPr>
+              <w:t xml:space="preserve"/>
+            </w:r>
+          </w:p>
+        </w:tc>
+        <w:tc>
+          <w:tcPr>
+            <w:tcW w:type="dxa" w:w="1300"/>
+            <w:tcBorders>
+              <w:top w:val="single" w:color="D9D5CB" w:sz="4"/>
+              <w:left w:val="single" w:color="D9D5CB" w:sz="4"/>
+              <w:bottom w:val="single" w:color="D9D5CB" w:sz="4"/>
+              <w:right w:val="single" w:color="D9D5CB" w:sz="4"/>
+            </w:tcBorders>
+            <w:shd w:fill="E6F5EC" w:color="auto" w:val="clear"/>
+            <w:tcMar>
+              <w:top w:type="dxa" w:w="60"/>
+              <w:left w:type="dxa" w:w="90"/>
+              <w:bottom w:type="dxa" w:w="60"/>
+              <w:right w:type="dxa" w:w="90"/>
+            </w:tcMar>
+            <w:vAlign w:val="top"/>
+          </w:tcPr>
+          <w:p>
+            <w:pPr>
+              <w:spacing w:after="40"/>
+            </w:pPr>
+            <w:r>
+              <w:rPr>
+                <w:rFonts w:ascii="Calibri" w:cs="Calibri" w:eastAsia="Calibri" w:hAnsi="Calibri"/>
+                <w:b/>
+                <w:bCs/>
+                <w:color w:val="14213D"/>
+                <w:sz w:val="19"/>
+                <w:szCs w:val="19"/>
+              </w:rPr>
+              <w:t xml:space="preserve">Fait → voir l'autre feuille</w:t>
+            </w:r>
+          </w:p>
+        </w:tc>
+        <w:tc>
+          <w:tcPr>
+            <w:tcW w:type="dxa" w:w="3700"/>
+            <w:tcBorders>
+              <w:top w:val="single" w:color="D9D5CB" w:sz="4"/>
+              <w:left w:val="single" w:color="D9D5CB" w:sz="4"/>
+              <w:bottom w:val="single" w:color="D9D5CB" w:sz="4"/>
+              <w:right w:val="single" w:color="D9D5CB" w:sz="4"/>
+            </w:tcBorders>
+            <w:tcMar>
+              <w:top w:type="dxa" w:w="60"/>
+              <w:left w:type="dxa" w:w="90"/>
+              <w:bottom w:type="dxa" w:w="60"/>
+              <w:right w:type="dxa" w:w="90"/>
+            </w:tcMar>
+            <w:vAlign w:val="top"/>
+          </w:tcPr>
+          <w:p>
+            <w:pPr>
+              <w:spacing w:after="40"/>
+            </w:pPr>
+            <w:r>
+              <w:rPr>
+                <w:rFonts w:ascii="Calibri" w:cs="Calibri" w:eastAsia="Calibri" w:hAnsi="Calibri"/>
+                <w:color w:val="14213D"/>
+                <w:sz w:val="20"/>
+                <w:szCs w:val="20"/>
+              </w:rPr>
+              <w:t xml:space="preserve"/>
+            </w:r>
+          </w:p>
+          <w:p>
+            <w:pPr>
+              <w:spacing w:after="40"/>
+            </w:pPr>
+            <w:r>
+              <w:rPr>
+                <w:rFonts w:ascii="Calibri" w:cs="Calibri" w:eastAsia="Calibri" w:hAnsi="Calibri"/>
+                <w:color w:val="14213D"/>
+                <w:sz w:val="20"/>
+                <w:szCs w:val="20"/>
+              </w:rPr>
+              <w:t xml:space="preserve"/>
             </w:r>
           </w:p>
         </w:tc>

</xml_diff>